<commit_message>
docs: change business rule for Coach
</commit_message>
<xml_diff>
--- a/docs/SWP391_Report_SRS.docx
+++ b/docs/SWP391_Report_SRS.docx
@@ -516,7 +516,7 @@
         </w:rPr>
       </w:pPr>
       <w:r>
-        <w:t>Version 1.4 — Approved amendment 26 September 2026</w:t>
+        <w:t>Version 1.5 — Approved amendment 28 September 2026</w:t>
       </w:r>
     </w:p>
     <w:p>
@@ -722,7 +722,7 @@
     </w:p>
     <w:p>
       <w:r>
-        <w:t>Approved amendment 26 September 2026</w:t>
+        <w:t>Approved amendments 26 and 28 September 2026</w:t>
       </w:r>
     </w:p>
     <w:p>
@@ -789,7 +789,7 @@
         </w:rPr>
       </w:pPr>
       <w:r>
-        <w:t>This Software Requirements Specification defines the functional and non-functional requirements for SportHub. Version 1.4 applies Business Rules v1.8, including Google onboarding, Register email OTP, paid Membership/PT checkout, VNPay-QR, Invoice, reconciliation, Refund and revenue decisions approved through 26 September 2026.</w:t>
+        <w:t>This Software Requirements Specification defines the functional and non-functional requirements for SportHub. Version 1.5 applies Business Rules v1.9, including the PersonalTrainer/ClassInstructor classification under the existing Coach role, Google onboarding, Register email OTP, paid Membership/PT checkout, VNPay-QR, Invoice, reconciliation, Refund and cash-basis revenue.</w:t>
       </w:r>
     </w:p>
     <w:p>
@@ -805,7 +805,7 @@
           <w:rFonts w:ascii="Times New Roman" w:cs="Times New Roman" w:eastAsia="Times New Roman" w:hAnsi="Times New Roman"/>
           <w:rtl w:val="0"/>
         </w:rPr>
-        <w:t xml:space="preserve">SportHub currently has five internal user roles: System Administrator, Center Manager, Coach, Member, and Receptionist. Additionally, the AI ​​System is modeled as a secondary/external actor because it is outside the SportHub boundary and only interacts with AI use cases. AI is not a user account and does not belong to the ROLES table.</w:t>
+        <w:t>SportHub has five internal user roles: System Administrator, Center Manager, Coach, Member and Receptionist. Coach remains one role, with CoachProfile.CoachCategory distinguishing PersonalTrainer from ClassInstructor. AI System remains a secondary external actor outside the SportHub boundary.</w:t>
       </w:r>
     </w:p>
     <w:p>
@@ -1004,7 +1004,7 @@
           <w:rFonts w:ascii="Times New Roman" w:cs="Times New Roman" w:eastAsia="Times New Roman" w:hAnsi="Times New Roman"/>
           <w:rtl w:val="0"/>
         </w:rPr>
-        <w:t xml:space="preserve">• Standard role names: System Administrator, Center Manager, Coach, Member, Receptionist. AI System is an external actor, not a UserRole.</w:t>
+        <w:t>• Standard role names: System Administrator, Center Manager, Coach, Member, Receptionist. PersonalTrainer and ClassInstructor are Coach categories, not UserRole values. AI System is an external actor.</w:t>
       </w:r>
     </w:p>
     <w:p>
@@ -1016,7 +1016,7 @@
         </w:rPr>
       </w:pPr>
       <w:r>
-        <w:t>The terms MembershipPackage and Membership record follow Business Rules v1.8. Yoga/Group X booking, paid PT, Invoice, PaymentAttempt, Payment and Refund are separate mechanisms with the lifecycle defined in BR-79–BR-95.</w:t>
+        <w:t>The terms MembershipPackage and Membership record follow Business Rules v1.9. Yoga/Group X booking, paid PT, Invoice, PaymentAttempt, Payment and Refund are separate mechanisms with the lifecycle defined in the Business Rules.</w:t>
       </w:r>
     </w:p>
     <w:p>
@@ -1044,7 +1044,7 @@
         </w:rPr>
       </w:pPr>
       <w:r>
-        <w:t>When this SRS conflicts with SSOT or Business Rules v1.8, SSOT and Business Rules win. Payment behavior must follow BR-79–BR-95; code behavior is not a substitute for the approved rules.</w:t>
+        <w:t>When this SRS conflicts with SSOT or Business Rules v1.9, SSOT and Business Rules win. Payment behavior must follow BR-79–BR-95; Coach specialization must follow BR-96–BR-101. Code behavior is not a substitute for approved rules.</w:t>
       </w:r>
     </w:p>
     <w:p>
@@ -1127,7 +1127,7 @@
         </w:rPr>
       </w:pPr>
       <w:r>
-        <w:t>Scope: SportHub is a web application for one sports center to manage users, Membership, Yoga/Group X classes, booking, Gym attendance, paid PT, VNPay payment, Invoice, Refund, training and reporting. The system uses an ASP.NET Core modular-monolith backend, Next.js/React frontend and PostgreSQL. Access is role-based across five human roles; AI System is an external actor.</w:t>
+        <w:t>Scope: SportHub is a web application for one sports center to manage users, Membership, Yoga/Group X classes, booking, Gym attendance, paid PT, VNPay payment, Invoice, Refund, training and reporting. The Coach role is divided operationally into PersonalTrainer and ClassInstructor. ClassInstructor only views assigned Yoga/Group X schedules and manages their own profile/password; PersonalTrainer performs authorized training and AI tasks. The system uses an ASP.NET Core modular-monolith backend and a Next.js frontend.</w:t>
       </w:r>
     </w:p>
     <w:p>
@@ -1451,43 +1451,43 @@
                 <w:szCs w:val="17"/>
                 <w:rtl w:val="0"/>
               </w:rPr>
-              <w:t xml:space="preserve">Coach</w:t>
-            </w:r>
-          </w:p>
-        </w:tc>
-        <w:tc>
-          <w:tcPr>
-            <w:tcBorders>
-              <w:top w:color="000000" w:space="0" w:sz="0" w:val="nil"/>
-              <w:left w:color="000000" w:space="0" w:sz="0" w:val="nil"/>
-              <w:bottom w:color="000000" w:space="0" w:sz="5" w:val="single"/>
-              <w:right w:color="000000" w:space="0" w:sz="5" w:val="single"/>
-            </w:tcBorders>
-            <w:tcMar>
-              <w:top w:w="0.0" w:type="dxa"/>
-              <w:left w:w="100.0" w:type="dxa"/>
-              <w:bottom w:w="0.0" w:type="dxa"/>
-              <w:right w:w="100.0" w:type="dxa"/>
-            </w:tcMar>
-            <w:vAlign w:val="top"/>
-          </w:tcPr>
-          <w:p>
-            <w:pPr>
-              <w:ind w:left="0" w:right="0" w:firstLine="0"/>
-              <w:rPr>
-                <w:rFonts w:ascii="Times New Roman" w:cs="Times New Roman" w:eastAsia="Times New Roman" w:hAnsi="Times New Roman"/>
-                <w:sz w:val="17"/>
-                <w:szCs w:val="17"/>
-              </w:rPr>
-            </w:pPr>
-            <w:r>
-              <w:rPr>
-                <w:rFonts w:ascii="Times New Roman" w:cs="Times New Roman" w:eastAsia="Times New Roman" w:hAnsi="Times New Roman"/>
-                <w:sz w:val="20"/>
-                <w:szCs w:val="17"/>
-                <w:rtl w:val="0"/>
-              </w:rPr>
-              <w:t xml:space="preserve">Xem lịch dạy/roster; điểm danh; cập nhật hồ sơ tập luyện trong phạm vi được phân công; tạo kế hoạch; ghi kết quả, đánh giá tiến độ; yêu cầu AI gợi ý bài tập.</w:t>
+              <w:t>Coach</w:t>
+            </w:r>
+          </w:p>
+        </w:tc>
+        <w:tc>
+          <w:tcPr>
+            <w:tcBorders>
+              <w:top w:color="000000" w:space="0" w:sz="0" w:val="nil"/>
+              <w:left w:color="000000" w:space="0" w:sz="0" w:val="nil"/>
+              <w:bottom w:color="000000" w:space="0" w:sz="5" w:val="single"/>
+              <w:right w:color="000000" w:space="0" w:sz="5" w:val="single"/>
+            </w:tcBorders>
+            <w:tcMar>
+              <w:top w:w="0.0" w:type="dxa"/>
+              <w:left w:w="100.0" w:type="dxa"/>
+              <w:bottom w:w="0.0" w:type="dxa"/>
+              <w:right w:w="100.0" w:type="dxa"/>
+            </w:tcMar>
+            <w:vAlign w:val="top"/>
+          </w:tcPr>
+          <w:p>
+            <w:pPr>
+              <w:ind w:left="0" w:right="0" w:firstLine="0"/>
+              <w:rPr>
+                <w:rFonts w:ascii="Times New Roman" w:cs="Times New Roman" w:eastAsia="Times New Roman" w:hAnsi="Times New Roman"/>
+                <w:sz w:val="17"/>
+                <w:szCs w:val="17"/>
+              </w:rPr>
+            </w:pPr>
+            <w:r>
+              <w:rPr>
+                <w:rFonts w:ascii="Times New Roman" w:cs="Times New Roman" w:eastAsia="Times New Roman" w:hAnsi="Times New Roman"/>
+                <w:sz w:val="20"/>
+                <w:szCs w:val="17"/>
+                <w:rtl w:val="0"/>
+              </w:rPr>
+              <w:t>Một role với hai category. PersonalTrainer xem lịch PT/học viên được phân công, quản lý plan/result/progress và yêu cầu AI trong quan hệ Active. ClassInstructor chỉ xem lịch Yoga/Group X do Manager phân công và tự quản lý hồ sơ/mật khẩu; không xem roster, không điểm danh, không dùng Training/AI.</w:t>
             </w:r>
           </w:p>
         </w:tc>
@@ -1600,7 +1600,7 @@
                 <w:szCs w:val="17"/>
                 <w:rtl w:val="0"/>
               </w:rPr>
-              <w:t xml:space="preserve">Receptionist</w:t>
+              <w:t>Receptionist</w:t>
             </w:r>
           </w:p>
         </w:tc>
@@ -1629,7 +1629,7 @@
                 <w:rFonts w:ascii="Times New Roman" w:hAnsi="Times New Roman"/>
                 <w:sz w:val="20"/>
               </w:rPr>
-              <w:t>Tạo Member tại quầy; checkout hộ Member; yêu cầu đối soát/fulfillment lại; tạo Refund hộ có lý do. Không tự đánh dấu Paid hoặc Refund Completed.</w:t>
+              <w:t>Tạo Member tại quầy; checkout hộ Member; ghi Present/Absent cho Yoga/Group X; yêu cầu đối soát/fulfillment lại; tạo Refund hộ có lý do. Không tự đánh dấu Paid hoặc Refund Completed.</w:t>
             </w:r>
           </w:p>
         </w:tc>
@@ -2298,79 +2298,79 @@
                 <w:szCs w:val="17"/>
                 <w:rtl w:val="0"/>
               </w:rPr>
-              <w:t xml:space="preserve">Flow 4 - Training &amp; Attendance Management</w:t>
-            </w:r>
-          </w:p>
-        </w:tc>
-        <w:tc>
-          <w:tcPr>
-            <w:tcBorders>
-              <w:top w:color="000000" w:space="0" w:sz="0" w:val="nil"/>
-              <w:left w:color="000000" w:space="0" w:sz="0" w:val="nil"/>
-              <w:bottom w:color="000000" w:space="0" w:sz="5" w:val="single"/>
-              <w:right w:color="000000" w:space="0" w:sz="5" w:val="single"/>
-            </w:tcBorders>
-            <w:tcMar>
-              <w:top w:w="0.0" w:type="dxa"/>
-              <w:left w:w="100.0" w:type="dxa"/>
-              <w:bottom w:w="0.0" w:type="dxa"/>
-              <w:right w:w="100.0" w:type="dxa"/>
-            </w:tcMar>
-            <w:vAlign w:val="top"/>
-          </w:tcPr>
-          <w:p>
-            <w:pPr>
-              <w:ind w:left="0" w:right="0" w:firstLine="0"/>
-              <w:rPr>
-                <w:rFonts w:ascii="Times New Roman" w:cs="Times New Roman" w:eastAsia="Times New Roman" w:hAnsi="Times New Roman"/>
-                <w:sz w:val="17"/>
-                <w:szCs w:val="17"/>
-              </w:rPr>
-            </w:pPr>
-            <w:r>
-              <w:rPr>
-                <w:rFonts w:ascii="Times New Roman" w:cs="Times New Roman" w:eastAsia="Times New Roman" w:hAnsi="Times New Roman"/>
-                <w:sz w:val="20"/>
-                <w:szCs w:val="17"/>
-                <w:rtl w:val="0"/>
-              </w:rPr>
-              <w:t xml:space="preserve">Optional</w:t>
-            </w:r>
-          </w:p>
-        </w:tc>
-        <w:tc>
-          <w:tcPr>
-            <w:tcBorders>
-              <w:top w:color="000000" w:space="0" w:sz="0" w:val="nil"/>
-              <w:left w:color="000000" w:space="0" w:sz="0" w:val="nil"/>
-              <w:bottom w:color="000000" w:space="0" w:sz="5" w:val="single"/>
-              <w:right w:color="000000" w:space="0" w:sz="5" w:val="single"/>
-            </w:tcBorders>
-            <w:tcMar>
-              <w:top w:w="0.0" w:type="dxa"/>
-              <w:left w:w="100.0" w:type="dxa"/>
-              <w:bottom w:w="0.0" w:type="dxa"/>
-              <w:right w:w="100.0" w:type="dxa"/>
-            </w:tcMar>
-            <w:vAlign w:val="top"/>
-          </w:tcPr>
-          <w:p>
-            <w:pPr>
-              <w:ind w:left="0" w:right="0" w:firstLine="0"/>
-              <w:rPr>
-                <w:rFonts w:ascii="Times New Roman" w:cs="Times New Roman" w:eastAsia="Times New Roman" w:hAnsi="Times New Roman"/>
-                <w:sz w:val="17"/>
-                <w:szCs w:val="17"/>
-              </w:rPr>
-            </w:pPr>
-            <w:r>
-              <w:rPr>
-                <w:rFonts w:ascii="Times New Roman" w:cs="Times New Roman" w:eastAsia="Times New Roman" w:hAnsi="Times New Roman"/>
-                <w:sz w:val="20"/>
-                <w:szCs w:val="17"/>
-                <w:rtl w:val="0"/>
-              </w:rPr>
-              <w:t xml:space="preserve">Attendance, training profile, workout plan, workout result và progress evaluation.</w:t>
+              <w:t>Flow 4 - Training &amp; Attendance Management</w:t>
+            </w:r>
+          </w:p>
+        </w:tc>
+        <w:tc>
+          <w:tcPr>
+            <w:tcBorders>
+              <w:top w:color="000000" w:space="0" w:sz="0" w:val="nil"/>
+              <w:left w:color="000000" w:space="0" w:sz="0" w:val="nil"/>
+              <w:bottom w:color="000000" w:space="0" w:sz="5" w:val="single"/>
+              <w:right w:color="000000" w:space="0" w:sz="5" w:val="single"/>
+            </w:tcBorders>
+            <w:tcMar>
+              <w:top w:w="0.0" w:type="dxa"/>
+              <w:left w:w="100.0" w:type="dxa"/>
+              <w:bottom w:w="0.0" w:type="dxa"/>
+              <w:right w:w="100.0" w:type="dxa"/>
+            </w:tcMar>
+            <w:vAlign w:val="top"/>
+          </w:tcPr>
+          <w:p>
+            <w:pPr>
+              <w:ind w:left="0" w:right="0" w:firstLine="0"/>
+              <w:rPr>
+                <w:rFonts w:ascii="Times New Roman" w:cs="Times New Roman" w:eastAsia="Times New Roman" w:hAnsi="Times New Roman"/>
+                <w:sz w:val="17"/>
+                <w:szCs w:val="17"/>
+              </w:rPr>
+            </w:pPr>
+            <w:r>
+              <w:rPr>
+                <w:rFonts w:ascii="Times New Roman" w:cs="Times New Roman" w:eastAsia="Times New Roman" w:hAnsi="Times New Roman"/>
+                <w:sz w:val="20"/>
+                <w:szCs w:val="17"/>
+                <w:rtl w:val="0"/>
+              </w:rPr>
+              <w:t>Optional</w:t>
+            </w:r>
+          </w:p>
+        </w:tc>
+        <w:tc>
+          <w:tcPr>
+            <w:tcBorders>
+              <w:top w:color="000000" w:space="0" w:sz="0" w:val="nil"/>
+              <w:left w:color="000000" w:space="0" w:sz="0" w:val="nil"/>
+              <w:bottom w:color="000000" w:space="0" w:sz="5" w:val="single"/>
+              <w:right w:color="000000" w:space="0" w:sz="5" w:val="single"/>
+            </w:tcBorders>
+            <w:tcMar>
+              <w:top w:w="0.0" w:type="dxa"/>
+              <w:left w:w="100.0" w:type="dxa"/>
+              <w:bottom w:w="0.0" w:type="dxa"/>
+              <w:right w:w="100.0" w:type="dxa"/>
+            </w:tcMar>
+            <w:vAlign w:val="top"/>
+          </w:tcPr>
+          <w:p>
+            <w:pPr>
+              <w:ind w:left="0" w:right="0" w:firstLine="0"/>
+              <w:rPr>
+                <w:rFonts w:ascii="Times New Roman" w:cs="Times New Roman" w:eastAsia="Times New Roman" w:hAnsi="Times New Roman"/>
+                <w:sz w:val="17"/>
+                <w:szCs w:val="17"/>
+              </w:rPr>
+            </w:pPr>
+            <w:r>
+              <w:rPr>
+                <w:rFonts w:ascii="Times New Roman" w:cs="Times New Roman" w:eastAsia="Times New Roman" w:hAnsi="Times New Roman"/>
+                <w:sz w:val="20"/>
+                <w:szCs w:val="17"/>
+                <w:rtl w:val="0"/>
+              </w:rPr>
+              <w:t>Receptionist điểm danh Yoga/Group X. PersonalTrainer quản lý training profile được phép, workout plan, PT result và progress. ClassInstructor không dùng các chức năng này.</w:t>
             </w:r>
           </w:p>
         </w:tc>
@@ -2412,79 +2412,79 @@
                 <w:szCs w:val="17"/>
                 <w:rtl w:val="0"/>
               </w:rPr>
-              <w:t xml:space="preserve">Flow 5 - AI Workout Recommendation</w:t>
-            </w:r>
-          </w:p>
-        </w:tc>
-        <w:tc>
-          <w:tcPr>
-            <w:tcBorders>
-              <w:top w:color="000000" w:space="0" w:sz="0" w:val="nil"/>
-              <w:left w:color="000000" w:space="0" w:sz="0" w:val="nil"/>
-              <w:bottom w:color="000000" w:space="0" w:sz="5" w:val="single"/>
-              <w:right w:color="000000" w:space="0" w:sz="5" w:val="single"/>
-            </w:tcBorders>
-            <w:tcMar>
-              <w:top w:w="0.0" w:type="dxa"/>
-              <w:left w:w="100.0" w:type="dxa"/>
-              <w:bottom w:w="0.0" w:type="dxa"/>
-              <w:right w:w="100.0" w:type="dxa"/>
-            </w:tcMar>
-            <w:vAlign w:val="top"/>
-          </w:tcPr>
-          <w:p>
-            <w:pPr>
-              <w:ind w:left="0" w:right="0" w:firstLine="0"/>
-              <w:rPr>
-                <w:rFonts w:ascii="Times New Roman" w:cs="Times New Roman" w:eastAsia="Times New Roman" w:hAnsi="Times New Roman"/>
-                <w:sz w:val="17"/>
-                <w:szCs w:val="17"/>
-              </w:rPr>
-            </w:pPr>
-            <w:r>
-              <w:rPr>
-                <w:rFonts w:ascii="Times New Roman" w:cs="Times New Roman" w:eastAsia="Times New Roman" w:hAnsi="Times New Roman"/>
-                <w:sz w:val="20"/>
-                <w:szCs w:val="17"/>
-                <w:rtl w:val="0"/>
-              </w:rPr>
-              <w:t xml:space="preserve">Optional</w:t>
-            </w:r>
-          </w:p>
-        </w:tc>
-        <w:tc>
-          <w:tcPr>
-            <w:tcBorders>
-              <w:top w:color="000000" w:space="0" w:sz="0" w:val="nil"/>
-              <w:left w:color="000000" w:space="0" w:sz="0" w:val="nil"/>
-              <w:bottom w:color="000000" w:space="0" w:sz="5" w:val="single"/>
-              <w:right w:color="000000" w:space="0" w:sz="5" w:val="single"/>
-            </w:tcBorders>
-            <w:tcMar>
-              <w:top w:w="0.0" w:type="dxa"/>
-              <w:left w:w="100.0" w:type="dxa"/>
-              <w:bottom w:w="0.0" w:type="dxa"/>
-              <w:right w:w="100.0" w:type="dxa"/>
-            </w:tcMar>
-            <w:vAlign w:val="top"/>
-          </w:tcPr>
-          <w:p>
-            <w:pPr>
-              <w:ind w:left="0" w:right="0" w:firstLine="0"/>
-              <w:rPr>
-                <w:rFonts w:ascii="Times New Roman" w:cs="Times New Roman" w:eastAsia="Times New Roman" w:hAnsi="Times New Roman"/>
-                <w:sz w:val="17"/>
-                <w:szCs w:val="17"/>
-              </w:rPr>
-            </w:pPr>
-            <w:r>
-              <w:rPr>
-                <w:rFonts w:ascii="Times New Roman" w:cs="Times New Roman" w:eastAsia="Times New Roman" w:hAnsi="Times New Roman"/>
-                <w:sz w:val="20"/>
-                <w:szCs w:val="17"/>
-                <w:rtl w:val="0"/>
-              </w:rPr>
-              <w:t xml:space="preserve">Coach yêu cầu AI suggestion; Coach review trước khi lưu official plan.</w:t>
+              <w:t>Flow 5 - AI Workout Recommendation</w:t>
+            </w:r>
+          </w:p>
+        </w:tc>
+        <w:tc>
+          <w:tcPr>
+            <w:tcBorders>
+              <w:top w:color="000000" w:space="0" w:sz="0" w:val="nil"/>
+              <w:left w:color="000000" w:space="0" w:sz="0" w:val="nil"/>
+              <w:bottom w:color="000000" w:space="0" w:sz="5" w:val="single"/>
+              <w:right w:color="000000" w:space="0" w:sz="5" w:val="single"/>
+            </w:tcBorders>
+            <w:tcMar>
+              <w:top w:w="0.0" w:type="dxa"/>
+              <w:left w:w="100.0" w:type="dxa"/>
+              <w:bottom w:w="0.0" w:type="dxa"/>
+              <w:right w:w="100.0" w:type="dxa"/>
+            </w:tcMar>
+            <w:vAlign w:val="top"/>
+          </w:tcPr>
+          <w:p>
+            <w:pPr>
+              <w:ind w:left="0" w:right="0" w:firstLine="0"/>
+              <w:rPr>
+                <w:rFonts w:ascii="Times New Roman" w:cs="Times New Roman" w:eastAsia="Times New Roman" w:hAnsi="Times New Roman"/>
+                <w:sz w:val="17"/>
+                <w:szCs w:val="17"/>
+              </w:rPr>
+            </w:pPr>
+            <w:r>
+              <w:rPr>
+                <w:rFonts w:ascii="Times New Roman" w:cs="Times New Roman" w:eastAsia="Times New Roman" w:hAnsi="Times New Roman"/>
+                <w:sz w:val="20"/>
+                <w:szCs w:val="17"/>
+                <w:rtl w:val="0"/>
+              </w:rPr>
+              <w:t>Optional</w:t>
+            </w:r>
+          </w:p>
+        </w:tc>
+        <w:tc>
+          <w:tcPr>
+            <w:tcBorders>
+              <w:top w:color="000000" w:space="0" w:sz="0" w:val="nil"/>
+              <w:left w:color="000000" w:space="0" w:sz="0" w:val="nil"/>
+              <w:bottom w:color="000000" w:space="0" w:sz="5" w:val="single"/>
+              <w:right w:color="000000" w:space="0" w:sz="5" w:val="single"/>
+            </w:tcBorders>
+            <w:tcMar>
+              <w:top w:w="0.0" w:type="dxa"/>
+              <w:left w:w="100.0" w:type="dxa"/>
+              <w:bottom w:w="0.0" w:type="dxa"/>
+              <w:right w:w="100.0" w:type="dxa"/>
+            </w:tcMar>
+            <w:vAlign w:val="top"/>
+          </w:tcPr>
+          <w:p>
+            <w:pPr>
+              <w:ind w:left="0" w:right="0" w:firstLine="0"/>
+              <w:rPr>
+                <w:rFonts w:ascii="Times New Roman" w:cs="Times New Roman" w:eastAsia="Times New Roman" w:hAnsi="Times New Roman"/>
+                <w:sz w:val="17"/>
+                <w:szCs w:val="17"/>
+              </w:rPr>
+            </w:pPr>
+            <w:r>
+              <w:rPr>
+                <w:rFonts w:ascii="Times New Roman" w:cs="Times New Roman" w:eastAsia="Times New Roman" w:hAnsi="Times New Roman"/>
+                <w:sz w:val="20"/>
+                <w:szCs w:val="17"/>
+                <w:rtl w:val="0"/>
+              </w:rPr>
+              <w:t>Chỉ PersonalTrainer có quan hệ Active được yêu cầu AI suggestion và review trước khi lưu official plan.</w:t>
             </w:r>
           </w:p>
         </w:tc>
@@ -2628,7 +2628,7 @@
         </w:rPr>
       </w:pPr>
       <w:r>
-        <w:t>Out of scope remains multi-center/multi-tenant support, a dedicated mobile application, Momo and production payment certification. VNPay Sandbox/VNPay-QR and transactional email for Invoice/Paid/Refund are in scope; provider credentials remain deployment configuration.</w:t>
+        <w:t>Out of scope includes multi-center/multi-tenant support, a dedicated mobile application, Momo, production payment certification, payroll, salary/commission, employment contracts, staff cost reports and profit reporting. VNPay Sandbox/VNPay-QR and transactional email for OTP/Invoice/Paid/Refund remain in scope; provider credentials are deployment configuration. Revenue reports show collected and refunded cash only and do not subtract payroll or other operating costs.</w:t>
       </w:r>
     </w:p>
     <w:p>
@@ -2658,7 +2658,7 @@
     </w:p>
     <w:p>
       <w:r>
-        <w:t>Authoritative references: docs/00-Source-of-Truth.md; SportManagement_BusinessRules.docx v1.8; Center-Management-System-Design-v2.md; entity-field-purpose.md. Dated implementation notes do not override these sources.</w:t>
+        <w:t>Authoritative references: docs/00-Source-of-Truth.md; SportManagement_BusinessRules.docx v1.9; Center-Management-System-Design-v2.md; entity-field-purpose.md. Dated implementation notes do not override these sources.</w:t>
       </w:r>
     </w:p>
     <w:p>
@@ -2776,7 +2776,7 @@
         </w:rPr>
       </w:pPr>
       <w:r>
-        <w:t>SportHub is a centralized system for one center. Five user roles use the web client. AI System is an optional external actor. Payment uses VNPay Sandbox/VNPay-QR; email is required for OTP and Invoice/Paid/Refund notifications through a background/outbox mechanism.</w:t>
+        <w:t>SportHub is a centralized system for one center. Five user roles use the web client. CoachProfile selects the PersonalTrainer or ClassInstructor capability set without adding a role. AI System is an optional external actor. Payment uses VNPay Sandbox/VNPay-QR; email supports OTP and Invoice/Paid/Refund notifications through a background/outbox flow.</w:t>
       </w:r>
     </w:p>
     <w:p>
@@ -3680,13 +3680,7 @@
           <w:rFonts w:ascii="Times New Roman" w:cs="Times New Roman" w:eastAsia="Times New Roman" w:hAnsi="Times New Roman"/>
           <w:rtl w:val="0"/>
         </w:rPr>
-        <w:t xml:space="preserve">The AI ​​System is an external actor. SportHub sends input that the backend retrieves from the MemberTrainingProfile, workout history, and Coach-Member relationship. The AI ​​only provides suggestions/responses. The AI ​​cannot modify Payment, MemberPackage, Enrollment, Attendance, or the official WorkoutPlan. If the external AI is unavailable, Flows 1-4 must continue to function normally.</w:t>
-      </w:r>
-      <w:r>
-        <w:rPr>
-          <w:rFonts w:ascii="Times New Roman" w:hAnsi="Times New Roman"/>
-          <w:rtl w:val="0"/>
-        </w:rPr>
+        <w:t>The AI System is an external actor. SportHub sends only the input that the backend retrieves from MemberTrainingProfile, workout history and an Active Coach-Member relationship. Only PersonalTrainer may request workout suggestions. AI provides suggestions and cannot modify Payment, Membership, Schedule or official Workout Plan data directly.</w:t>
       </w:r>
     </w:p>
     <w:p>
@@ -4272,7 +4266,7 @@
                 <w:szCs w:val="16"/>
                 <w:rtl w:val="0"/>
               </w:rPr>
-              <w:t xml:space="preserve">Coach</w:t>
+              <w:t>Coach</w:t>
             </w:r>
           </w:p>
         </w:tc>
@@ -4308,7 +4302,7 @@
                 <w:szCs w:val="16"/>
                 <w:rtl w:val="0"/>
               </w:rPr>
-              <w:t xml:space="preserve">Trung bình</w:t>
+              <w:t>Trung bình</w:t>
             </w:r>
           </w:p>
         </w:tc>
@@ -4344,7 +4338,7 @@
                 <w:szCs w:val="16"/>
                 <w:rtl w:val="0"/>
               </w:rPr>
-              <w:t xml:space="preserve">Thường xuyên theo session; tablet/laptop</w:t>
+              <w:t>Theo lịch/session; tablet/laptop</w:t>
             </w:r>
           </w:p>
         </w:tc>
@@ -4380,7 +4374,7 @@
                 <w:szCs w:val="16"/>
                 <w:rtl w:val="0"/>
               </w:rPr>
-              <w:t xml:space="preserve">Roster, attendance, plan/result nhanh và ít thao tác.</w:t>
+              <w:t>PersonalTrainer cần lịch PT, assigned members, plan/result và AI. ClassInstructor chỉ cần lịch Yoga/Group X được giao và self-service profile.</w:t>
             </w:r>
           </w:p>
         </w:tc>
@@ -4565,7 +4559,7 @@
                 <w:szCs w:val="16"/>
                 <w:rtl w:val="0"/>
               </w:rPr>
-              <w:t xml:space="preserve">Receptionist</w:t>
+              <w:t>Receptionist</w:t>
             </w:r>
           </w:p>
         </w:tc>
@@ -4601,7 +4595,7 @@
                 <w:szCs w:val="16"/>
                 <w:rtl w:val="0"/>
               </w:rPr>
-              <w:t xml:space="preserve">Trung bình</w:t>
+              <w:t>Trung bình</w:t>
             </w:r>
           </w:p>
         </w:tc>
@@ -4637,7 +4631,7 @@
                 <w:szCs w:val="16"/>
                 <w:rtl w:val="0"/>
               </w:rPr>
-              <w:t xml:space="preserve">Liên tục tại quầy</w:t>
+              <w:t>Liên tục tại quầy</w:t>
             </w:r>
           </w:p>
         </w:tc>
@@ -4666,7 +4660,7 @@
                 <w:rFonts w:ascii="Times New Roman" w:hAnsi="Times New Roman"/>
                 <w:sz w:val="20"/>
               </w:rPr>
-              <w:t>Walk-in, on-behalf checkout, reconciliation support and on-behalf Refund request.</w:t>
+              <w:t>Walk-in, điểm danh Yoga/Group X, on-behalf checkout, reconciliation support và on-behalf Refund request.</w:t>
             </w:r>
           </w:p>
         </w:tc>
@@ -6178,16 +6172,7 @@
                 <w:szCs w:val="17"/>
                 <w:rtl w:val="0"/>
               </w:rPr>
-              <w:t xml:space="preserve">AI boundary</w:t>
-            </w:r>
-            <w:r>
-              <w:rPr>
-                <w:rFonts w:ascii="Times New Roman" w:cs="Times New Roman" w:eastAsia="Times New Roman" w:hAnsi="Times New Roman"/>
-                <w:sz w:val="20"/>
-                <w:szCs w:val="19"/>
-                <w:rtl w:val="0"/>
-              </w:rPr>
-              <w:t xml:space="preserve"> </w:t>
+              <w:t>AI boundary</w:t>
             </w:r>
           </w:p>
         </w:tc>
@@ -6223,16 +6208,7 @@
                 <w:szCs w:val="17"/>
                 <w:rtl w:val="0"/>
               </w:rPr>
-              <w:t xml:space="preserve">AI output là suggestion; official plan chỉ do Coach lưu.</w:t>
-            </w:r>
-            <w:r>
-              <w:rPr>
-                <w:rFonts w:ascii="Times New Roman" w:cs="Times New Roman" w:eastAsia="Times New Roman" w:hAnsi="Times New Roman"/>
-                <w:sz w:val="20"/>
-                <w:szCs w:val="19"/>
-                <w:rtl w:val="0"/>
-              </w:rPr>
-              <w:t xml:space="preserve"> </w:t>
+              <w:t>AI output là suggestion; chỉ PersonalTrainer có quan hệ Active được gọi workout suggestion và lưu official plan sau khi review.</w:t>
             </w:r>
           </w:p>
         </w:tc>
@@ -6267,6 +6243,119 @@
                 <w:sz w:val="20"/>
                 <w:rtl w:val="0"/>
               </w:rPr>
+            </w:r>
+          </w:p>
+        </w:tc>
+      </w:tr>
+      <w:tr>
+        <w:trPr>
+          <w:cantSplit w:val="0"/>
+          <w:tblHeader w:val="0"/>
+        </w:trPr>
+        <w:tc>
+          <w:tcPr>
+            <w:tcBorders>
+              <w:top w:color="000000" w:space="0" w:sz="0" w:val="nil"/>
+              <w:left w:color="000000" w:space="0" w:sz="6" w:val="single"/>
+              <w:bottom w:color="000000" w:space="0" w:sz="6" w:val="single"/>
+              <w:right w:color="000000" w:space="0" w:sz="6" w:val="single"/>
+            </w:tcBorders>
+            <w:tcMar>
+              <w:top w:w="80.0" w:type="dxa"/>
+              <w:left w:w="100.0" w:type="dxa"/>
+              <w:bottom w:w="80.0" w:type="dxa"/>
+              <w:right w:w="100.0" w:type="dxa"/>
+            </w:tcMar>
+            <w:vAlign w:val="top"/>
+          </w:tcPr>
+          <w:p>
+            <w:pPr>
+              <w:ind w:left="0" w:right="0" w:firstLine="0"/>
+              <w:rPr>
+                <w:rFonts w:ascii="Times New Roman" w:cs="Times New Roman" w:eastAsia="Times New Roman" w:hAnsi="Times New Roman"/>
+                <w:sz w:val="19"/>
+                <w:szCs w:val="19"/>
+              </w:rPr>
+            </w:pPr>
+            <w:r>
+              <w:rPr>
+                <w:rFonts w:ascii="Times New Roman" w:hAnsi="Times New Roman"/>
+                <w:sz w:val="20"/>
+                <w:szCs w:val="17"/>
+                <w:rtl w:val="0"/>
+              </w:rPr>
+              <w:t>Coach specialization</w:t>
+            </w:r>
+          </w:p>
+        </w:tc>
+        <w:tc>
+          <w:tcPr>
+            <w:tcBorders>
+              <w:top w:color="000000" w:space="0" w:sz="0" w:val="nil"/>
+              <w:left w:color="000000" w:space="0" w:sz="0" w:val="nil"/>
+              <w:bottom w:color="000000" w:space="0" w:sz="6" w:val="single"/>
+              <w:right w:color="000000" w:space="0" w:sz="6" w:val="single"/>
+            </w:tcBorders>
+            <w:tcMar>
+              <w:top w:w="80.0" w:type="dxa"/>
+              <w:left w:w="100.0" w:type="dxa"/>
+              <w:bottom w:w="80.0" w:type="dxa"/>
+              <w:right w:w="100.0" w:type="dxa"/>
+            </w:tcMar>
+            <w:vAlign w:val="top"/>
+          </w:tcPr>
+          <w:p>
+            <w:pPr>
+              <w:ind w:left="0" w:right="0" w:firstLine="0"/>
+              <w:rPr>
+                <w:rFonts w:ascii="Times New Roman" w:cs="Times New Roman" w:eastAsia="Times New Roman" w:hAnsi="Times New Roman"/>
+                <w:sz w:val="19"/>
+                <w:szCs w:val="19"/>
+              </w:rPr>
+            </w:pPr>
+            <w:r>
+              <w:rPr>
+                <w:rFonts w:ascii="Times New Roman" w:hAnsi="Times New Roman"/>
+                <w:sz w:val="20"/>
+                <w:szCs w:val="17"/>
+                <w:rtl w:val="0"/>
+              </w:rPr>
+              <w:t>Giữ một UserRole Coach; CoachProfile.CoachCategory = PersonalTrainer hoặc ClassInstructor. Backend kiểm tra role, category và ownership; tách page/ẩn menu không thay thế authorization.</w:t>
+            </w:r>
+          </w:p>
+        </w:tc>
+        <w:tc>
+          <w:tcPr>
+            <w:tcBorders>
+              <w:top w:color="000000" w:space="0" w:sz="0" w:val="nil"/>
+              <w:left w:color="000000" w:space="0" w:sz="0" w:val="nil"/>
+              <w:bottom w:color="000000" w:space="0" w:sz="6" w:val="single"/>
+              <w:right w:color="000000" w:space="0" w:sz="6" w:val="single"/>
+            </w:tcBorders>
+            <w:tcMar>
+              <w:top w:w="80.0" w:type="dxa"/>
+              <w:left w:w="100.0" w:type="dxa"/>
+              <w:bottom w:w="80.0" w:type="dxa"/>
+              <w:right w:w="100.0" w:type="dxa"/>
+            </w:tcMar>
+            <w:vAlign w:val="top"/>
+          </w:tcPr>
+          <w:p>
+            <w:pPr>
+              <w:ind w:left="0" w:right="0" w:firstLine="0"/>
+              <w:rPr>
+                <w:rFonts w:ascii="Times New Roman" w:cs="Times New Roman" w:eastAsia="Times New Roman" w:hAnsi="Times New Roman"/>
+                <w:sz w:val="19"/>
+                <w:szCs w:val="19"/>
+              </w:rPr>
+            </w:pPr>
+            <w:r>
+              <w:rPr>
+                <w:rFonts w:ascii="Times New Roman" w:hAnsi="Times New Roman"/>
+                <w:sz w:val="20"/>
+                <w:rtl w:val="0"/>
+              </w:rPr>
+              <w:t>Cách vô hiệu hóa CoachProfile khi đổi role và entity PT session/result còn được theo dõi trong SSOT §7.</w:t>
             </w:r>
           </w:p>
         </w:tc>
@@ -6296,7 +6385,7 @@
         </w:rPr>
       </w:pPr>
       <w:r>
-        <w:t>Correctness-critical constraints include case-insensitive unique Email, OTP controls, atomic Capacity reservation, Membership/PT validity, unique gateway references, at most one successful Payment per Invoice, idempotent IPN/QueryDR, transactional fulfillment and Refund caps.</w:t>
+        <w:t>Correctness-critical constraints include case-insensitive unique Email, OTP controls, atomic Capacity reservation, Membership/PT validity, Coach category and ownership checks, unique gateway references, at most one successful Payment per Invoice, idempotent IPN/QueryDR, transactional fulfillment and cash-basis revenue.</w:t>
       </w:r>
     </w:p>
     <w:p>
@@ -7615,6 +7704,70 @@
           </w:p>
         </w:tc>
       </w:tr>
+      <w:tr>
+        <w:trPr>
+          <w:cantSplit w:val="0"/>
+          <w:tblHeader w:val="0"/>
+        </w:trPr>
+        <w:tc>
+          <w:tcPr>
+            <w:tcBorders>
+              <w:top w:color="000000" w:space="0" w:sz="0" w:val="nil"/>
+              <w:left w:color="000000" w:space="0" w:sz="5" w:val="single"/>
+              <w:bottom w:color="000000" w:space="0" w:sz="5" w:val="single"/>
+              <w:right w:color="000000" w:space="0" w:sz="5" w:val="single"/>
+            </w:tcBorders>
+            <w:tcMar>
+              <w:top w:w="0.0" w:type="dxa"/>
+              <w:left w:w="100.0" w:type="dxa"/>
+              <w:bottom w:w="0.0" w:type="dxa"/>
+              <w:right w:w="100.0" w:type="dxa"/>
+            </w:tcMar>
+            <w:vAlign w:val="top"/>
+          </w:tcPr>
+          <w:p>
+            <w:pPr>
+              <w:ind w:left="0" w:right="0" w:firstLine="0"/>
+            </w:pPr>
+            <w:r>
+              <w:rPr>
+                <w:rFonts w:ascii="Times New Roman" w:hAnsi="Times New Roman"/>
+                <w:sz w:val="20"/>
+              </w:rPr>
+              <w:t>BR-96–101</w:t>
+            </w:r>
+          </w:p>
+        </w:tc>
+        <w:tc>
+          <w:tcPr>
+            <w:tcBorders>
+              <w:top w:color="000000" w:space="0" w:sz="0" w:val="nil"/>
+              <w:left w:color="000000" w:space="0" w:sz="0" w:val="nil"/>
+              <w:bottom w:color="000000" w:space="0" w:sz="5" w:val="single"/>
+              <w:right w:color="000000" w:space="0" w:sz="5" w:val="single"/>
+            </w:tcBorders>
+            <w:tcMar>
+              <w:top w:w="0.0" w:type="dxa"/>
+              <w:left w:w="100.0" w:type="dxa"/>
+              <w:bottom w:w="0.0" w:type="dxa"/>
+              <w:right w:w="100.0" w:type="dxa"/>
+            </w:tcMar>
+            <w:vAlign w:val="top"/>
+          </w:tcPr>
+          <w:p>
+            <w:pPr>
+              <w:ind w:left="0" w:right="0" w:firstLine="0"/>
+            </w:pPr>
+            <w:r>
+              <w:rPr>
+                <w:rFonts w:ascii="Times New Roman" w:hAnsi="Times New Roman"/>
+                <w:sz w:val="20"/>
+              </w:rPr>
+              <w:t>Coach remains one role with PersonalTrainer/ClassInstructor categories; Manager assigns ClassInstructor schedules; ClassInstructor is schedule/profile-only; Receptionist records Yoga/Group X attendance; Training/AI belongs to PersonalTrainer; payroll and staff financial management are out of scope.</w:t>
+            </w:r>
+          </w:p>
+        </w:tc>
+      </w:tr>
     </w:tbl>
     <w:p>
       <w:pPr>
@@ -7626,7 +7779,7 @@
         </w:rPr>
       </w:pPr>
       <w:r>
-        <w:t>Chi tiết đầy đủ: Business Rules v1.8; các dòng trên chỉ là tóm tắt truy vết.</w:t>
+        <w:t>Chi tiết đầy đủ: Business Rules v1.9; các dòng trên chỉ là tóm tắt truy vết.</w:t>
       </w:r>
     </w:p>
     <w:p>
@@ -9109,7 +9262,7 @@
                 <w:szCs w:val="15"/>
                 <w:rtl w:val="0"/>
               </w:rPr>
-              <w:t xml:space="preserve">UC-09</w:t>
+              <w:t>UC-09</w:t>
             </w:r>
           </w:p>
         </w:tc>
@@ -9145,7 +9298,7 @@
                 <w:szCs w:val="15"/>
                 <w:rtl w:val="0"/>
               </w:rPr>
-              <w:t xml:space="preserve">Xem lịch dạy &amp; roster</w:t>
+              <w:t>Xem lịch dạy và phạm vi phụ trách</w:t>
             </w:r>
           </w:p>
         </w:tc>
@@ -9181,7 +9334,7 @@
                 <w:szCs w:val="15"/>
                 <w:rtl w:val="0"/>
               </w:rPr>
-              <w:t xml:space="preserve">Coach</w:t>
+              <w:t>PersonalTrainer; ClassInstructor</w:t>
             </w:r>
           </w:p>
         </w:tc>
@@ -9217,7 +9370,7 @@
                 <w:szCs w:val="15"/>
                 <w:rtl w:val="0"/>
               </w:rPr>
-              <w:t xml:space="preserve">Required supporting</w:t>
+              <w:t>Required supporting</w:t>
             </w:r>
           </w:p>
         </w:tc>
@@ -9259,7 +9412,7 @@
                 <w:szCs w:val="15"/>
                 <w:rtl w:val="0"/>
               </w:rPr>
-              <w:t xml:space="preserve">UC-10</w:t>
+              <w:t>UC-10</w:t>
             </w:r>
           </w:p>
         </w:tc>
@@ -9295,7 +9448,7 @@
                 <w:szCs w:val="15"/>
                 <w:rtl w:val="0"/>
               </w:rPr>
-              <w:t xml:space="preserve">Điểm danh buổi học</w:t>
+              <w:t>Điểm danh buổi học</w:t>
             </w:r>
           </w:p>
         </w:tc>
@@ -9331,7 +9484,7 @@
                 <w:szCs w:val="15"/>
                 <w:rtl w:val="0"/>
               </w:rPr>
-              <w:t xml:space="preserve">Coach; Receptionist</w:t>
+              <w:t>Receptionist; PersonalTrainer cho PT theo mô hình PT</w:t>
             </w:r>
           </w:p>
         </w:tc>
@@ -9367,7 +9520,7 @@
                 <w:szCs w:val="15"/>
                 <w:rtl w:val="0"/>
               </w:rPr>
-              <w:t xml:space="preserve">Optional / Flow 4</w:t>
+              <w:t>Optional / Flow 4</w:t>
             </w:r>
           </w:p>
         </w:tc>
@@ -9409,7 +9562,7 @@
                 <w:szCs w:val="15"/>
                 <w:rtl w:val="0"/>
               </w:rPr>
-              <w:t xml:space="preserve">UC-11</w:t>
+              <w:t>UC-11</w:t>
             </w:r>
           </w:p>
         </w:tc>
@@ -9445,7 +9598,7 @@
                 <w:szCs w:val="15"/>
                 <w:rtl w:val="0"/>
               </w:rPr>
-              <w:t xml:space="preserve">Quản lý hồ sơ tập luyện</w:t>
+              <w:t>Quản lý hồ sơ tập luyện</w:t>
             </w:r>
           </w:p>
         </w:tc>
@@ -9481,7 +9634,7 @@
                 <w:szCs w:val="15"/>
                 <w:rtl w:val="0"/>
               </w:rPr>
-              <w:t xml:space="preserve">Member self; Coach authorized</w:t>
+              <w:t>Member self; PersonalTrainer authorized</w:t>
             </w:r>
           </w:p>
         </w:tc>
@@ -9517,7 +9670,7 @@
                 <w:szCs w:val="15"/>
                 <w:rtl w:val="0"/>
               </w:rPr>
-              <w:t xml:space="preserve">Optional / Flow 4</w:t>
+              <w:t>Optional / Flow 4</w:t>
             </w:r>
           </w:p>
         </w:tc>
@@ -9559,7 +9712,7 @@
                 <w:szCs w:val="15"/>
                 <w:rtl w:val="0"/>
               </w:rPr>
-              <w:t xml:space="preserve">UC-12</w:t>
+              <w:t>UC-12</w:t>
             </w:r>
           </w:p>
         </w:tc>
@@ -9595,7 +9748,7 @@
                 <w:szCs w:val="15"/>
                 <w:rtl w:val="0"/>
               </w:rPr>
-              <w:t xml:space="preserve">Quản lý kế hoạch tập luyện</w:t>
+              <w:t>Quản lý kế hoạch tập luyện</w:t>
             </w:r>
           </w:p>
         </w:tc>
@@ -9631,7 +9784,7 @@
                 <w:szCs w:val="15"/>
                 <w:rtl w:val="0"/>
               </w:rPr>
-              <w:t xml:space="preserve">Coach</w:t>
+              <w:t>PersonalTrainer</w:t>
             </w:r>
           </w:p>
         </w:tc>
@@ -9667,7 +9820,7 @@
                 <w:szCs w:val="15"/>
                 <w:rtl w:val="0"/>
               </w:rPr>
-              <w:t xml:space="preserve">Optional / Flow 4</w:t>
+              <w:t>Optional / Flow 4</w:t>
             </w:r>
           </w:p>
         </w:tc>
@@ -9709,7 +9862,7 @@
                 <w:szCs w:val="15"/>
                 <w:rtl w:val="0"/>
               </w:rPr>
-              <w:t xml:space="preserve">UC-13</w:t>
+              <w:t>UC-13</w:t>
             </w:r>
           </w:p>
         </w:tc>
@@ -9745,7 +9898,7 @@
                 <w:szCs w:val="15"/>
                 <w:rtl w:val="0"/>
               </w:rPr>
-              <w:t xml:space="preserve">Ghi kết quả &amp; đánh giá tiến độ</w:t>
+              <w:t>Ghi kết quả và đánh giá tiến độ</w:t>
             </w:r>
           </w:p>
         </w:tc>
@@ -9781,7 +9934,7 @@
                 <w:szCs w:val="15"/>
                 <w:rtl w:val="0"/>
               </w:rPr>
-              <w:t xml:space="preserve">Coach</w:t>
+              <w:t>PersonalTrainer</w:t>
             </w:r>
           </w:p>
         </w:tc>
@@ -9817,7 +9970,7 @@
                 <w:szCs w:val="15"/>
                 <w:rtl w:val="0"/>
               </w:rPr>
-              <w:t xml:space="preserve">Optional / Flow 4</w:t>
+              <w:t>Optional / Flow 4</w:t>
             </w:r>
           </w:p>
         </w:tc>
@@ -10717,7 +10870,7 @@
                 <w:szCs w:val="15"/>
                 <w:rtl w:val="0"/>
               </w:rPr>
-              <w:t xml:space="preserve">UC-20</w:t>
+              <w:t>UC-20</w:t>
             </w:r>
           </w:p>
         </w:tc>
@@ -10753,7 +10906,7 @@
                 <w:szCs w:val="15"/>
                 <w:rtl w:val="0"/>
               </w:rPr>
-              <w:t xml:space="preserve">Yêu cầu AI gợi ý bài tập</w:t>
+              <w:t>Yêu cầu AI gợi ý bài tập</w:t>
             </w:r>
           </w:p>
         </w:tc>
@@ -10789,7 +10942,7 @@
                 <w:szCs w:val="15"/>
                 <w:rtl w:val="0"/>
               </w:rPr>
-              <w:t xml:space="preserve">Coach + AI System</w:t>
+              <w:t>PersonalTrainer + AI System</w:t>
             </w:r>
           </w:p>
         </w:tc>
@@ -10825,7 +10978,7 @@
                 <w:szCs w:val="15"/>
                 <w:rtl w:val="0"/>
               </w:rPr>
-              <w:t xml:space="preserve">Optional / Flow 5</w:t>
+              <w:t>Optional / Flow 5</w:t>
             </w:r>
           </w:p>
         </w:tc>
@@ -11004,7 +11157,7 @@
         </w:rPr>
       </w:pPr>
       <w:r>
-        <w:t>• UC-07 groups Yoga/Group X class creation, publishing/closing, schedule, Room and Coach assignment. Any recurrence/session implementation must follow Business Rules v1.8; PT is separate and paid.</w:t>
+        <w:t>• UC-07 groups Yoga/Group X class creation, publishing/closing, Room and ClassInstructor assignment. Any recurrence/session implementation must follow Business Rules v1.9; PT is separate and paid.</w:t>
       </w:r>
     </w:p>
     <w:p>
@@ -11021,6 +11174,7 @@
     <w:p>
       <w:pPr>
         <w:keepNext/>
+        <w:pageBreakBefore w:val="0"/>
         <w:spacing w:after="240" w:before="240" w:lineRule="auto"/>
         <w:ind w:left="0" w:firstLine="0"/>
         <w:rPr>
@@ -11054,7 +11208,7 @@
           <w:rFonts w:ascii="Times New Roman" w:cs="Times New Roman" w:eastAsia="Times New Roman" w:hAnsi="Times New Roman"/>
           <w:rtl w:val="0"/>
         </w:rPr>
-        <w:t xml:space="preserve">• Workout result + progress evaluation are grouped into UC-13 because they both occur after the training session.</w:t>
+        <w:t>• Workout result and progress evaluation are grouped into UC-13 because both occur after a PT session and are performed only by an authorized PersonalTrainer.</w:t>
       </w:r>
     </w:p>
     <w:p>
@@ -11101,6 +11255,7 @@
     <w:p>
       <w:pPr>
         <w:keepNext/>
+        <w:pageBreakBefore w:val="0"/>
         <w:spacing w:after="240" w:before="240" w:lineRule="auto"/>
         <w:rPr>
           <w:rFonts w:ascii="Times New Roman" w:cs="Times New Roman" w:eastAsia="Times New Roman" w:hAnsi="Times New Roman"/>
@@ -11742,25 +11897,10 @@
     </w:tbl>
     <w:p>
       <w:pPr>
-        <w:keepNext/>
-        <w:spacing w:after="200" w:lineRule="auto"/>
-        <w:rPr>
-          <w:rFonts w:ascii="Times New Roman" w:cs="Times New Roman" w:eastAsia="Times New Roman" w:hAnsi="Times New Roman"/>
-        </w:rPr>
-      </w:pPr>
-      <w:r>
-        <w:rPr>
-          <w:rFonts w:ascii="Times New Roman" w:cs="Times New Roman" w:eastAsia="Times New Roman" w:hAnsi="Times New Roman"/>
-          <w:rtl w:val="0"/>
-        </w:rPr>
-        <w:t xml:space="preserve"> </w:t>
-      </w:r>
-    </w:p>
-    <w:p>
-      <w:pPr>
         <w:pStyle w:val="Heading3"/>
         <w:keepNext/>
         <w:keepLines w:val="0"/>
+        <w:pageBreakBefore w:val="0"/>
         <w:spacing w:before="280" w:lineRule="auto"/>
         <w:ind w:left="0" w:firstLine="0"/>
         <w:rPr>
@@ -11785,15 +11925,6 @@
           <w:rtl w:val="0"/>
         </w:rPr>
         <w:t xml:space="preserve">UC-02 - Quản lý hồ sơ cá nhân</w:t>
-      </w:r>
-    </w:p>
-    <w:p>
-      <w:pPr>
-        <w:keepNext/>
-        <w:spacing w:line="80" w:lineRule="exact"/>
-      </w:pPr>
-      <w:r>
-        <w:t> </w:t>
       </w:r>
     </w:p>
     <w:tbl>
@@ -12405,25 +12536,10 @@
     </w:tbl>
     <w:p>
       <w:pPr>
-        <w:keepNext/>
-        <w:spacing w:after="200" w:lineRule="auto"/>
-        <w:rPr>
-          <w:rFonts w:ascii="Times New Roman" w:cs="Times New Roman" w:eastAsia="Times New Roman" w:hAnsi="Times New Roman"/>
-        </w:rPr>
-      </w:pPr>
-      <w:r>
-        <w:rPr>
-          <w:rFonts w:ascii="Times New Roman" w:cs="Times New Roman" w:eastAsia="Times New Roman" w:hAnsi="Times New Roman"/>
-          <w:rtl w:val="0"/>
-        </w:rPr>
-        <w:t xml:space="preserve"> </w:t>
-      </w:r>
-    </w:p>
-    <w:p>
-      <w:pPr>
         <w:pStyle w:val="Heading3"/>
         <w:keepNext/>
         <w:keepLines w:val="0"/>
+        <w:pageBreakBefore w:val="0"/>
         <w:spacing w:before="280" w:lineRule="auto"/>
         <w:ind w:left="0" w:firstLine="0"/>
         <w:rPr>
@@ -12448,15 +12564,6 @@
           <w:rtl w:val="0"/>
         </w:rPr>
         <w:t xml:space="preserve">UC-03 - Đăng ký tài khoản hội viên</w:t>
-      </w:r>
-    </w:p>
-    <w:p>
-      <w:pPr>
-        <w:keepNext/>
-        <w:spacing w:line="80" w:lineRule="exact"/>
-      </w:pPr>
-      <w:r>
-        <w:t> </w:t>
       </w:r>
     </w:p>
     <w:tbl>
@@ -13062,22 +13169,6 @@
     </w:tbl>
     <w:p>
       <w:pPr>
-        <w:keepNext/>
-        <w:spacing w:after="200" w:lineRule="auto"/>
-        <w:rPr>
-          <w:rFonts w:ascii="Times New Roman" w:cs="Times New Roman" w:eastAsia="Times New Roman" w:hAnsi="Times New Roman"/>
-        </w:rPr>
-      </w:pPr>
-      <w:r>
-        <w:rPr>
-          <w:rFonts w:ascii="Times New Roman" w:cs="Times New Roman" w:eastAsia="Times New Roman" w:hAnsi="Times New Roman"/>
-          <w:rtl w:val="0"/>
-        </w:rPr>
-        <w:t xml:space="preserve"> </w:t>
-      </w:r>
-    </w:p>
-    <w:p>
-      <w:pPr>
         <w:pStyle w:val="Heading3"/>
         <w:keepNext/>
         <w:keepLines w:val="0"/>
@@ -13106,15 +13197,6 @@
           <w:rtl w:val="0"/>
         </w:rPr>
         <w:t xml:space="preserve">UC-04 - Quản lý tài khoản nội bộ &amp; vai trò</w:t>
-      </w:r>
-    </w:p>
-    <w:p>
-      <w:pPr>
-        <w:keepNext/>
-        <w:spacing w:line="80" w:lineRule="exact"/>
-      </w:pPr>
-      <w:r>
-        <w:t> </w:t>
       </w:r>
     </w:p>
     <w:tbl>
@@ -13515,7 +13597,7 @@
                 <w:szCs w:val="17"/>
                 <w:rtl w:val="0"/>
               </w:rPr>
-              <w:t xml:space="preserve">Luồng chính</w:t>
+              <w:t>Luồng chính</w:t>
             </w:r>
           </w:p>
         </w:tc>
@@ -13552,15 +13634,7 @@
                 <w:szCs w:val="17"/>
                 <w:rtl w:val="0"/>
               </w:rPr>
-              <w:t xml:space="preserve">1. Admin mở danh sách tài khoản nội bộ.</w:t>
-              <w:br w:type="textWrapping"/>
-              <w:t xml:space="preserve"> 2. Tạo tài khoản Center Manager/Coach/Receptionist khi cần.</w:t>
-              <w:br w:type="textWrapping"/>
-              <w:t xml:space="preserve"> 3. Gán role hợp lệ.</w:t>
-              <w:br w:type="textWrapping"/>
-              <w:t xml:space="preserve"> 4. Thay đổi status ACTIVE/BANNED/DEACTIVATED.</w:t>
-              <w:br w:type="textWrapping"/>
-              <w:t xml:space="preserve"> 5. Hệ thống ghi Audit Log cho thay đổi nhạy cảm.</w:t>
+              <w:t>1. Admin mở danh sách tài khoản nội bộ. 2. Tạo tài khoản Center Manager/Coach/Receptionist khi cần. 3. Khi tạo Coach, chọn CoachCategory = PersonalTrainer hoặc ClassInstructor. 4. Gán role hợp lệ. 5. Thay đổi status ACTIVE/BANNED/DEACTIVATED. 6. Hệ thống ghi Audit Log cho thay đổi nhạy cảm.</w:t>
             </w:r>
           </w:p>
         </w:tc>
@@ -13603,7 +13677,7 @@
                 <w:szCs w:val="17"/>
                 <w:rtl w:val="0"/>
               </w:rPr>
-              <w:t xml:space="preserve">Luồng thay thế / ngoại lệ</w:t>
+              <w:t>Luồng thay thế / ngoại lệ</w:t>
             </w:r>
           </w:p>
         </w:tc>
@@ -13640,7 +13714,7 @@
                 <w:szCs w:val="17"/>
                 <w:rtl w:val="0"/>
               </w:rPr>
-              <w:t xml:space="preserve">Không cho Admin tự ý sửa dữ liệu nghiệp vụ của role. Không tạo AI System thành user account.</w:t>
+              <w:t>Không cho tạo Coach thiếu hoặc có CoachCategory không hợp lệ. Không cho Admin tự ý sửa dữ liệu nghiệp vụ của role. Không tạo AI System thành user account.</w:t>
             </w:r>
           </w:p>
         </w:tc>
@@ -13808,25 +13882,10 @@
     </w:tbl>
     <w:p>
       <w:pPr>
-        <w:keepNext/>
-        <w:spacing w:after="200" w:lineRule="auto"/>
-        <w:rPr>
-          <w:rFonts w:ascii="Times New Roman" w:cs="Times New Roman" w:eastAsia="Times New Roman" w:hAnsi="Times New Roman"/>
-        </w:rPr>
-      </w:pPr>
-      <w:r>
-        <w:rPr>
-          <w:rFonts w:ascii="Times New Roman" w:cs="Times New Roman" w:eastAsia="Times New Roman" w:hAnsi="Times New Roman"/>
-          <w:rtl w:val="0"/>
-        </w:rPr>
-        <w:t xml:space="preserve"> </w:t>
-      </w:r>
-    </w:p>
-    <w:p>
-      <w:pPr>
         <w:pStyle w:val="Heading3"/>
         <w:keepNext/>
         <w:keepLines w:val="0"/>
+        <w:pageBreakBefore w:val="0"/>
         <w:spacing w:before="280" w:lineRule="auto"/>
         <w:ind w:left="0" w:firstLine="0"/>
         <w:rPr>
@@ -13851,15 +13910,6 @@
           <w:rtl w:val="0"/>
         </w:rPr>
         <w:t xml:space="preserve">UC-05 - Quản lý gói thành viên</w:t>
-      </w:r>
-    </w:p>
-    <w:p>
-      <w:pPr>
-        <w:keepNext/>
-        <w:spacing w:line="80" w:lineRule="exact"/>
-      </w:pPr>
-      <w:r>
-        <w:t> </w:t>
       </w:r>
     </w:p>
     <w:tbl>
@@ -14449,25 +14499,10 @@
     </w:tbl>
     <w:p>
       <w:pPr>
-        <w:keepNext/>
-        <w:spacing w:after="200" w:lineRule="auto"/>
-        <w:rPr>
-          <w:rFonts w:ascii="Times New Roman" w:cs="Times New Roman" w:eastAsia="Times New Roman" w:hAnsi="Times New Roman"/>
-        </w:rPr>
-      </w:pPr>
-      <w:r>
-        <w:rPr>
-          <w:rFonts w:ascii="Times New Roman" w:cs="Times New Roman" w:eastAsia="Times New Roman" w:hAnsi="Times New Roman"/>
-          <w:rtl w:val="0"/>
-        </w:rPr>
-        <w:t xml:space="preserve"> </w:t>
-      </w:r>
-    </w:p>
-    <w:p>
-      <w:pPr>
         <w:pStyle w:val="Heading3"/>
         <w:keepNext/>
         <w:keepLines w:val="0"/>
+        <w:pageBreakBefore w:val="0"/>
         <w:spacing w:before="280" w:lineRule="auto"/>
         <w:ind w:left="0" w:firstLine="0"/>
         <w:rPr>
@@ -14492,15 +14527,6 @@
           <w:rtl w:val="0"/>
         </w:rPr>
         <w:t xml:space="preserve">UC-06 - Đăng ký / gia hạn gói thành viên</w:t>
-      </w:r>
-    </w:p>
-    <w:p>
-      <w:pPr>
-        <w:keepNext/>
-        <w:spacing w:line="80" w:lineRule="exact"/>
-      </w:pPr>
-      <w:r>
-        <w:t> </w:t>
       </w:r>
     </w:p>
     <w:tbl>
@@ -15082,22 +15108,6 @@
     </w:tbl>
     <w:p>
       <w:pPr>
-        <w:keepNext/>
-        <w:spacing w:after="200" w:lineRule="auto"/>
-        <w:rPr>
-          <w:rFonts w:ascii="Times New Roman" w:cs="Times New Roman" w:eastAsia="Times New Roman" w:hAnsi="Times New Roman"/>
-        </w:rPr>
-      </w:pPr>
-      <w:r>
-        <w:rPr>
-          <w:rFonts w:ascii="Times New Roman" w:cs="Times New Roman" w:eastAsia="Times New Roman" w:hAnsi="Times New Roman"/>
-          <w:rtl w:val="0"/>
-        </w:rPr>
-        <w:t xml:space="preserve"> </w:t>
-      </w:r>
-    </w:p>
-    <w:p>
-      <w:pPr>
         <w:pStyle w:val="Heading3"/>
         <w:keepNext/>
         <w:keepLines w:val="0"/>
@@ -15126,15 +15136,6 @@
           <w:rtl w:val="0"/>
         </w:rPr>
         <w:t xml:space="preserve">UC-07 - Quản lý lớp, phòng, lịch &amp; phân công HLV</w:t>
-      </w:r>
-    </w:p>
-    <w:p>
-      <w:pPr>
-        <w:keepNext/>
-        <w:spacing w:line="80" w:lineRule="exact"/>
-      </w:pPr>
-      <w:r>
-        <w:t> </w:t>
       </w:r>
     </w:p>
     <w:tbl>
@@ -15527,7 +15528,7 @@
                 <w:szCs w:val="17"/>
                 <w:rtl w:val="0"/>
               </w:rPr>
-              <w:t xml:space="preserve">Luồng chính</w:t>
+              <w:t>Luồng chính</w:t>
             </w:r>
           </w:p>
         </w:tc>
@@ -15556,7 +15557,7 @@
                 <w:rFonts w:ascii="Times New Roman" w:hAnsi="Times New Roman"/>
                 <w:sz w:val="20"/>
               </w:rPr>
-              <w:t>1. Tạo Yoga hoặc Group X class. 2. Chọn Date, StartTime, Coach, Capacity và Morning/Afternoon slot. 3. Hệ thống tính EndTime = StartTime + 60 minutes. 4. Chặn quá 1 slot/discipline, quá 2 class/discipline hoặc quá 4 class/ngày; Capacity phải 1–20. 5. Publish để mở booking; close để dừng booking. 6. Hủy/dời theo BR-54.</w:t>
+              <w:t>1. Tạo Yoga hoặc Group X class. 2. Chọn Date, StartTime, ClassInstructor, Capacity và Morning/Afternoon slot. 3. Hệ thống tính EndTime = StartTime + 60 minutes. 4. Chặn Coach sai category, quá 1 slot/discipline, quá 2 class/discipline hoặc quá 4 class/ngày; Capacity phải 1–20. 5. Publish để mở booking; close để dừng booking. 6. Hủy/dời theo BR-54.</w:t>
             </w:r>
           </w:p>
         </w:tc>
@@ -15708,25 +15709,10 @@
     </w:tbl>
     <w:p>
       <w:pPr>
-        <w:keepNext/>
-        <w:spacing w:after="200" w:lineRule="auto"/>
-        <w:rPr>
-          <w:rFonts w:ascii="Times New Roman" w:cs="Times New Roman" w:eastAsia="Times New Roman" w:hAnsi="Times New Roman"/>
-        </w:rPr>
-      </w:pPr>
-      <w:r>
-        <w:rPr>
-          <w:rFonts w:ascii="Times New Roman" w:cs="Times New Roman" w:eastAsia="Times New Roman" w:hAnsi="Times New Roman"/>
-          <w:rtl w:val="0"/>
-        </w:rPr>
-        <w:t xml:space="preserve"> </w:t>
-      </w:r>
-    </w:p>
-    <w:p>
-      <w:pPr>
         <w:pStyle w:val="Heading3"/>
         <w:keepNext/>
         <w:keepLines w:val="0"/>
+        <w:pageBreakBefore w:val="0"/>
         <w:spacing w:before="280" w:lineRule="auto"/>
         <w:ind w:left="0" w:firstLine="0"/>
         <w:rPr>
@@ -15751,15 +15737,6 @@
           <w:rtl w:val="0"/>
         </w:rPr>
         <w:t xml:space="preserve">UC-08 - Quản lý đăng ký buổi học</w:t>
-      </w:r>
-    </w:p>
-    <w:p>
-      <w:pPr>
-        <w:keepNext/>
-        <w:spacing w:line="80" w:lineRule="exact"/>
-      </w:pPr>
-      <w:r>
-        <w:t> </w:t>
       </w:r>
     </w:p>
     <w:tbl>
@@ -16333,25 +16310,10 @@
     </w:tbl>
     <w:p>
       <w:pPr>
-        <w:keepNext/>
-        <w:spacing w:after="200" w:lineRule="auto"/>
-        <w:rPr>
-          <w:rFonts w:ascii="Times New Roman" w:cs="Times New Roman" w:eastAsia="Times New Roman" w:hAnsi="Times New Roman"/>
-        </w:rPr>
-      </w:pPr>
-      <w:r>
-        <w:rPr>
-          <w:rFonts w:ascii="Times New Roman" w:cs="Times New Roman" w:eastAsia="Times New Roman" w:hAnsi="Times New Roman"/>
-          <w:rtl w:val="0"/>
-        </w:rPr>
-        <w:t xml:space="preserve"> </w:t>
-      </w:r>
-    </w:p>
-    <w:p>
-      <w:pPr>
         <w:pStyle w:val="Heading3"/>
         <w:keepNext/>
         <w:keepLines w:val="0"/>
+        <w:pageBreakBefore w:val="0"/>
         <w:spacing w:before="280" w:lineRule="auto"/>
         <w:ind w:left="0" w:firstLine="0"/>
         <w:rPr>
@@ -16375,16 +16337,7 @@
           <w:szCs w:val="26"/>
           <w:rtl w:val="0"/>
         </w:rPr>
-        <w:t xml:space="preserve">UC-09 - Xem lịch dạy &amp; roster</w:t>
-      </w:r>
-    </w:p>
-    <w:p>
-      <w:pPr>
-        <w:keepNext/>
-        <w:spacing w:line="80" w:lineRule="exact"/>
-      </w:pPr>
-      <w:r>
-        <w:t> </w:t>
+        <w:t>UC-09 - Xem lịch dạy và phạm vi phụ trách</w:t>
       </w:r>
     </w:p>
     <w:tbl>
@@ -16545,7 +16498,7 @@
                 <w:szCs w:val="17"/>
                 <w:rtl w:val="0"/>
               </w:rPr>
-              <w:t xml:space="preserve">Tác nhân</w:t>
+              <w:t>Tác nhân</w:t>
             </w:r>
           </w:p>
         </w:tc>
@@ -16582,7 +16535,7 @@
                 <w:szCs w:val="17"/>
                 <w:rtl w:val="0"/>
               </w:rPr>
-              <w:t xml:space="preserve">Coach</w:t>
+              <w:t>PersonalTrainer; ClassInstructor</w:t>
             </w:r>
           </w:p>
         </w:tc>
@@ -16705,7 +16658,7 @@
                 <w:szCs w:val="17"/>
                 <w:rtl w:val="0"/>
               </w:rPr>
-              <w:t xml:space="preserve">Tiền điều kiện</w:t>
+              <w:t>Tiền điều kiện</w:t>
             </w:r>
           </w:p>
         </w:tc>
@@ -16742,7 +16695,7 @@
                 <w:szCs w:val="17"/>
                 <w:rtl w:val="0"/>
               </w:rPr>
-              <w:t xml:space="preserve">Coach đã đăng nhập và được gán vào session/class.</w:t>
+              <w:t>Coach đã đăng nhập, có CoachProfile hợp lệ và được phân công lịch/phạm vi phục vụ.</w:t>
             </w:r>
           </w:p>
         </w:tc>
@@ -16785,7 +16738,7 @@
                 <w:szCs w:val="17"/>
                 <w:rtl w:val="0"/>
               </w:rPr>
-              <w:t xml:space="preserve">Luồng chính</w:t>
+              <w:t>Luồng chính</w:t>
             </w:r>
           </w:p>
         </w:tc>
@@ -16822,13 +16775,7 @@
                 <w:szCs w:val="17"/>
                 <w:rtl w:val="0"/>
               </w:rPr>
-              <w:t xml:space="preserve">1. Coach mở lịch dạy của mình.</w:t>
-              <w:br w:type="textWrapping"/>
-              <w:t xml:space="preserve"> 2. Hệ thống lấy CoachID từ token.</w:t>
-              <w:br w:type="textWrapping"/>
-              <w:t xml:space="preserve"> 3. Hiển thị session theo thời gian.</w:t>
-              <w:br w:type="textWrapping"/>
-              <w:t xml:space="preserve"> 4. Coach mở roster của session mình phụ trách.</w:t>
+              <w:t>1. Coach mở lịch của mình. 2. Backend lấy CoachId từ token và kiểm tra CoachCategory. 3. ClassInstructor chỉ thấy lịch Yoga/Group X được giao gồm bộ môn, ngày/giờ, phòng và trạng thái. 4. PersonalTrainer thấy lịch PT và học viên được phân công theo quan hệ hợp lệ.</w:t>
             </w:r>
           </w:p>
         </w:tc>
@@ -16871,7 +16818,7 @@
                 <w:szCs w:val="17"/>
                 <w:rtl w:val="0"/>
               </w:rPr>
-              <w:t xml:space="preserve">Luồng thay thế / ngoại lệ</w:t>
+              <w:t>Luồng thay thế / ngoại lệ</w:t>
             </w:r>
           </w:p>
         </w:tc>
@@ -16908,7 +16855,7 @@
                 <w:szCs w:val="17"/>
                 <w:rtl w:val="0"/>
               </w:rPr>
-              <w:t xml:space="preserve">Coach không được xem roster lớp không thuộc phạm vi.</w:t>
+              <w:t>ClassInstructor không được xem roster/hồ sơ Member hoặc lịch không thuộc mình. Category/ownership không hợp lệ -&gt; 403.</w:t>
             </w:r>
           </w:p>
         </w:tc>
@@ -16951,7 +16898,7 @@
                 <w:szCs w:val="17"/>
                 <w:rtl w:val="0"/>
               </w:rPr>
-              <w:t xml:space="preserve">Hậu điều kiện</w:t>
+              <w:t>Hậu điều kiện</w:t>
             </w:r>
           </w:p>
         </w:tc>
@@ -16988,28 +16935,12 @@
                 <w:szCs w:val="17"/>
                 <w:rtl w:val="0"/>
               </w:rPr>
-              <w:t xml:space="preserve">Coach có danh sách session và Member cần phục vụ.</w:t>
+              <w:t>Coach chỉ nhận dữ liệu lịch và phạm vi nghiệp vụ đúng với category của mình.</w:t>
             </w:r>
           </w:p>
         </w:tc>
       </w:tr>
     </w:tbl>
-    <w:p>
-      <w:pPr>
-        <w:keepNext/>
-        <w:spacing w:after="200" w:lineRule="auto"/>
-        <w:rPr>
-          <w:rFonts w:ascii="Times New Roman" w:cs="Times New Roman" w:eastAsia="Times New Roman" w:hAnsi="Times New Roman"/>
-        </w:rPr>
-      </w:pPr>
-      <w:r>
-        <w:rPr>
-          <w:rFonts w:ascii="Times New Roman" w:cs="Times New Roman" w:eastAsia="Times New Roman" w:hAnsi="Times New Roman"/>
-          <w:rtl w:val="0"/>
-        </w:rPr>
-        <w:t xml:space="preserve"> </w:t>
-      </w:r>
-    </w:p>
     <w:p>
       <w:pPr>
         <w:pStyle w:val="Heading3"/>
@@ -17040,15 +16971,6 @@
           <w:rtl w:val="0"/>
         </w:rPr>
         <w:t xml:space="preserve">UC-10 - Điểm danh buổi học</w:t>
-      </w:r>
-    </w:p>
-    <w:p>
-      <w:pPr>
-        <w:keepNext/>
-        <w:spacing w:line="80" w:lineRule="exact"/>
-      </w:pPr>
-      <w:r>
-        <w:t> </w:t>
       </w:r>
     </w:p>
     <w:tbl>
@@ -17209,7 +17131,7 @@
                 <w:szCs w:val="17"/>
                 <w:rtl w:val="0"/>
               </w:rPr>
-              <w:t xml:space="preserve">Tác nhân</w:t>
+              <w:t>Tác nhân</w:t>
             </w:r>
           </w:p>
         </w:tc>
@@ -17246,7 +17168,7 @@
                 <w:szCs w:val="17"/>
                 <w:rtl w:val="0"/>
               </w:rPr>
-              <w:t xml:space="preserve">Coach; Receptionist</w:t>
+              <w:t>Receptionist; PersonalTrainer cho PT theo mô hình PT</w:t>
             </w:r>
           </w:p>
         </w:tc>
@@ -17449,7 +17371,7 @@
                 <w:szCs w:val="17"/>
                 <w:rtl w:val="0"/>
               </w:rPr>
-              <w:t xml:space="preserve">Luồng chính</w:t>
+              <w:t>Luồng chính</w:t>
             </w:r>
           </w:p>
         </w:tc>
@@ -17486,13 +17408,7 @@
                 <w:szCs w:val="17"/>
                 <w:rtl w:val="0"/>
               </w:rPr>
-              <w:t xml:space="preserve">1. Mở roster/check-in screen.</w:t>
-              <w:br w:type="textWrapping"/>
-              <w:t xml:space="preserve"> 2. Chọn enrollment hợp lệ.</w:t>
-              <w:br w:type="textWrapping"/>
-              <w:t xml:space="preserve"> 3. Ghi PRESENT hoặc ABSENT theo nghiệp vụ.</w:t>
-              <w:br w:type="textWrapping"/>
-              <w:t xml:space="preserve"> 4. Lưu Attendance với CheckedInByUserID/CheckInTime khi phù hợp.</w:t>
+              <w:t>1. Receptionist mở roster/check-in của Yoga/Group X. 2. Chọn Enrollment hợp lệ. 3. Ghi PRESENT hoặc ABSENT. 4. Hệ thống lưu Attendance và actor/time. Với PT, PersonalTrainer ghi trạng thái buổi theo entity PT session được đặc tả; ClassInstructor không có action điểm danh.</w:t>
             </w:r>
           </w:p>
         </w:tc>
@@ -17535,7 +17451,7 @@
                 <w:szCs w:val="17"/>
                 <w:rtl w:val="0"/>
               </w:rPr>
-              <w:t xml:space="preserve">Luồng thay thế / ngoại lệ</w:t>
+              <w:t>Luồng thay thế / ngoại lệ</w:t>
             </w:r>
           </w:p>
         </w:tc>
@@ -17572,7 +17488,7 @@
                 <w:szCs w:val="17"/>
                 <w:rtl w:val="0"/>
               </w:rPr>
-              <w:t xml:space="preserve">Không có Attendance hợp lệ nếu Member không có Enrollment. NO_SHOW không phải thao tác tay; job tạo sau EndAtUtc theo rule.</w:t>
+              <w:t>Không có Attendance lớp nếu Member không có Enrollment. ClassInstructor hoặc Manager gọi action điểm danh -&gt; 403. NO_SHOW do job tạo sau EndAtUtc theo rule.</w:t>
             </w:r>
           </w:p>
         </w:tc>
@@ -17660,25 +17576,10 @@
     </w:tbl>
     <w:p>
       <w:pPr>
-        <w:keepNext/>
-        <w:spacing w:after="200" w:lineRule="auto"/>
-        <w:rPr>
-          <w:rFonts w:ascii="Times New Roman" w:cs="Times New Roman" w:eastAsia="Times New Roman" w:hAnsi="Times New Roman"/>
-        </w:rPr>
-      </w:pPr>
-      <w:r>
-        <w:rPr>
-          <w:rFonts w:ascii="Times New Roman" w:cs="Times New Roman" w:eastAsia="Times New Roman" w:hAnsi="Times New Roman"/>
-          <w:rtl w:val="0"/>
-        </w:rPr>
-        <w:t xml:space="preserve"> </w:t>
-      </w:r>
-    </w:p>
-    <w:p>
-      <w:pPr>
         <w:pStyle w:val="Heading3"/>
         <w:keepNext/>
         <w:keepLines w:val="0"/>
+        <w:pageBreakBefore w:val="0"/>
         <w:spacing w:before="280" w:lineRule="auto"/>
         <w:ind w:left="0" w:firstLine="0"/>
         <w:rPr>
@@ -17703,15 +17604,6 @@
           <w:rtl w:val="0"/>
         </w:rPr>
         <w:t xml:space="preserve">UC-11 - Quản lý hồ sơ tập luyện</w:t>
-      </w:r>
-    </w:p>
-    <w:p>
-      <w:pPr>
-        <w:keepNext/>
-        <w:spacing w:line="80" w:lineRule="exact"/>
-      </w:pPr>
-      <w:r>
-        <w:t> </w:t>
       </w:r>
     </w:p>
     <w:tbl>
@@ -17872,7 +17764,7 @@
                 <w:szCs w:val="17"/>
                 <w:rtl w:val="0"/>
               </w:rPr>
-              <w:t xml:space="preserve">Tác nhân</w:t>
+              <w:t>Tác nhân</w:t>
             </w:r>
           </w:p>
         </w:tc>
@@ -17909,7 +17801,7 @@
                 <w:szCs w:val="17"/>
                 <w:rtl w:val="0"/>
               </w:rPr>
-              <w:t xml:space="preserve">Member self; Coach authorized</w:t>
+              <w:t>Member self; PersonalTrainer authorized</w:t>
             </w:r>
           </w:p>
         </w:tc>
@@ -18032,7 +17924,7 @@
                 <w:szCs w:val="17"/>
                 <w:rtl w:val="0"/>
               </w:rPr>
-              <w:t xml:space="preserve">Tiền điều kiện</w:t>
+              <w:t>Tiền điều kiện</w:t>
             </w:r>
           </w:p>
         </w:tc>
@@ -18069,7 +17961,7 @@
                 <w:szCs w:val="17"/>
                 <w:rtl w:val="0"/>
               </w:rPr>
-              <w:t xml:space="preserve">Member tồn tại; Coach chỉ có quyền khi Coach-Member relationship ACTIVE.</w:t>
+              <w:t>Member tồn tại; PersonalTrainer chỉ có quyền khi Coach-Member relationship ACTIVE.</w:t>
             </w:r>
           </w:p>
         </w:tc>
@@ -18112,7 +18004,7 @@
                 <w:szCs w:val="17"/>
                 <w:rtl w:val="0"/>
               </w:rPr>
-              <w:t xml:space="preserve">Luồng chính</w:t>
+              <w:t>Luồng chính</w:t>
             </w:r>
           </w:p>
         </w:tc>
@@ -18149,11 +18041,7 @@
                 <w:szCs w:val="17"/>
                 <w:rtl w:val="0"/>
               </w:rPr>
-              <w:t xml:space="preserve">1. Member cập nhật Goal/ExperienceLevel/Notes của mình.</w:t>
-              <w:br w:type="textWrapping"/>
-              <w:t xml:space="preserve"> 2. Coach được phép cập nhật/điều chỉnh trong phạm vi được giao theo policy.</w:t>
-              <w:br w:type="textWrapping"/>
-              <w:t xml:space="preserve"> 3. Hệ thống ghi UpdatedAt.</w:t>
+              <w:t>1. Member cập nhật Goal/ExperienceLevel/Notes của mình. 2. PersonalTrainer được đọc/điều chỉnh trong phạm vi quan hệ Active theo policy. 3. Hệ thống ghi UpdatedAt.</w:t>
             </w:r>
           </w:p>
         </w:tc>
@@ -18196,7 +18084,7 @@
                 <w:szCs w:val="17"/>
                 <w:rtl w:val="0"/>
               </w:rPr>
-              <w:t xml:space="preserve">Luồng thay thế / ngoại lệ</w:t>
+              <w:t>Luồng thay thế / ngoại lệ</w:t>
             </w:r>
           </w:p>
         </w:tc>
@@ -18233,7 +18121,7 @@
                 <w:szCs w:val="17"/>
                 <w:rtl w:val="0"/>
               </w:rPr>
-              <w:t xml:space="preserve">Coach không có relationship -&gt; 403.</w:t>
+              <w:t>ClassInstructor hoặc PersonalTrainer không có relationship -&gt; 403.</w:t>
             </w:r>
           </w:p>
         </w:tc>
@@ -18321,25 +18209,10 @@
     </w:tbl>
     <w:p>
       <w:pPr>
-        <w:keepNext/>
-        <w:spacing w:after="200" w:lineRule="auto"/>
-        <w:rPr>
-          <w:rFonts w:ascii="Times New Roman" w:cs="Times New Roman" w:eastAsia="Times New Roman" w:hAnsi="Times New Roman"/>
-        </w:rPr>
-      </w:pPr>
-      <w:r>
-        <w:rPr>
-          <w:rFonts w:ascii="Times New Roman" w:cs="Times New Roman" w:eastAsia="Times New Roman" w:hAnsi="Times New Roman"/>
-          <w:rtl w:val="0"/>
-        </w:rPr>
-        <w:t xml:space="preserve"> </w:t>
-      </w:r>
-    </w:p>
-    <w:p>
-      <w:pPr>
         <w:pStyle w:val="Heading3"/>
         <w:keepNext/>
         <w:keepLines w:val="0"/>
+        <w:pageBreakBefore w:val="0"/>
         <w:spacing w:before="280" w:lineRule="auto"/>
         <w:ind w:left="0" w:firstLine="0"/>
         <w:rPr>
@@ -18364,15 +18237,6 @@
           <w:rtl w:val="0"/>
         </w:rPr>
         <w:t xml:space="preserve">UC-12 - Quản lý kế hoạch tập luyện</w:t>
-      </w:r>
-    </w:p>
-    <w:p>
-      <w:pPr>
-        <w:keepNext/>
-        <w:spacing w:line="80" w:lineRule="exact"/>
-      </w:pPr>
-      <w:r>
-        <w:t> </w:t>
       </w:r>
     </w:p>
     <w:tbl>
@@ -18533,7 +18397,7 @@
                 <w:szCs w:val="17"/>
                 <w:rtl w:val="0"/>
               </w:rPr>
-              <w:t xml:space="preserve">Tác nhân</w:t>
+              <w:t>Tác nhân</w:t>
             </w:r>
           </w:p>
         </w:tc>
@@ -18570,7 +18434,7 @@
                 <w:szCs w:val="17"/>
                 <w:rtl w:val="0"/>
               </w:rPr>
-              <w:t xml:space="preserve">Coach</w:t>
+              <w:t>PersonalTrainer</w:t>
             </w:r>
           </w:p>
         </w:tc>
@@ -18693,7 +18557,7 @@
                 <w:szCs w:val="17"/>
                 <w:rtl w:val="0"/>
               </w:rPr>
-              <w:t xml:space="preserve">Tiền điều kiện</w:t>
+              <w:t>Tiền điều kiện</w:t>
             </w:r>
           </w:p>
         </w:tc>
@@ -18730,7 +18594,7 @@
                 <w:szCs w:val="17"/>
                 <w:rtl w:val="0"/>
               </w:rPr>
-              <w:t xml:space="preserve">Coach-Member relationship ACTIVE.</w:t>
+              <w:t>PersonalTrainer có Coach-Member relationship ACTIVE.</w:t>
             </w:r>
           </w:p>
         </w:tc>
@@ -18773,7 +18637,7 @@
                 <w:szCs w:val="17"/>
                 <w:rtl w:val="0"/>
               </w:rPr>
-              <w:t xml:space="preserve">Luồng chính</w:t>
+              <w:t>Luồng chính</w:t>
             </w:r>
           </w:p>
         </w:tc>
@@ -18810,15 +18674,7 @@
                 <w:szCs w:val="17"/>
                 <w:rtl w:val="0"/>
               </w:rPr>
-              <w:t xml:space="preserve">1. Coach chọn Member được phụ trách.</w:t>
-              <w:br w:type="textWrapping"/>
-              <w:t xml:space="preserve"> 2. Xem profile và lịch sử cần thiết.</w:t>
-              <w:br w:type="textWrapping"/>
-              <w:t xml:space="preserve"> 3. Tạo WorkoutPlan và các WorkoutPlanItem.</w:t>
-              <w:br w:type="textWrapping"/>
-              <w:t xml:space="preserve"> 4. Chỉnh sets/reps/notes theo chuyên môn.</w:t>
-              <w:br w:type="textWrapping"/>
-              <w:t xml:space="preserve"> 5. Lưu official plan.</w:t>
+              <w:t>1. PersonalTrainer chọn Member được phụ trách. 2. Xem profile và lịch sử cần thiết. 3. Tạo WorkoutPlan và WorkoutPlanItem. 4. Chỉnh sets/reps/notes theo chuyên môn. 5. Lưu official plan.</w:t>
             </w:r>
           </w:p>
         </w:tc>
@@ -18861,7 +18717,7 @@
                 <w:szCs w:val="17"/>
                 <w:rtl w:val="0"/>
               </w:rPr>
-              <w:t xml:space="preserve">Luồng thay thế / ngoại lệ</w:t>
+              <w:t>Luồng thay thế / ngoại lệ</w:t>
             </w:r>
           </w:p>
         </w:tc>
@@ -18898,7 +18754,7 @@
                 <w:szCs w:val="17"/>
                 <w:rtl w:val="0"/>
               </w:rPr>
-              <w:t xml:space="preserve">Coach có thể dùng UC-20 như extension; không bắt buộc AI.</w:t>
+              <w:t>ClassInstructor hoặc Coach không có relationship -&gt; 403. PersonalTrainer có thể dùng UC-20; AI không bắt buộc.</w:t>
             </w:r>
           </w:p>
         </w:tc>
@@ -18941,7 +18797,7 @@
                 <w:szCs w:val="17"/>
                 <w:rtl w:val="0"/>
               </w:rPr>
-              <w:t xml:space="preserve">Hậu điều kiện</w:t>
+              <w:t>Hậu điều kiện</w:t>
             </w:r>
           </w:p>
         </w:tc>
@@ -18978,28 +18834,12 @@
                 <w:szCs w:val="17"/>
                 <w:rtl w:val="0"/>
               </w:rPr>
-              <w:t xml:space="preserve">Official WorkoutPlan được tạo bởi Coach.</w:t>
+              <w:t>Official WorkoutPlan được tạo bởi PersonalTrainer được phân công.</w:t>
             </w:r>
           </w:p>
         </w:tc>
       </w:tr>
     </w:tbl>
-    <w:p>
-      <w:pPr>
-        <w:keepNext/>
-        <w:spacing w:after="200" w:lineRule="auto"/>
-        <w:rPr>
-          <w:rFonts w:ascii="Times New Roman" w:cs="Times New Roman" w:eastAsia="Times New Roman" w:hAnsi="Times New Roman"/>
-        </w:rPr>
-      </w:pPr>
-      <w:r>
-        <w:rPr>
-          <w:rFonts w:ascii="Times New Roman" w:cs="Times New Roman" w:eastAsia="Times New Roman" w:hAnsi="Times New Roman"/>
-          <w:rtl w:val="0"/>
-        </w:rPr>
-        <w:t xml:space="preserve"> </w:t>
-      </w:r>
-    </w:p>
     <w:p>
       <w:pPr>
         <w:pStyle w:val="Heading3"/>
@@ -19030,15 +18870,6 @@
           <w:rtl w:val="0"/>
         </w:rPr>
         <w:t xml:space="preserve">UC-13 - Ghi kết quả &amp; đánh giá tiến độ</w:t>
-      </w:r>
-    </w:p>
-    <w:p>
-      <w:pPr>
-        <w:keepNext/>
-        <w:spacing w:line="80" w:lineRule="exact"/>
-      </w:pPr>
-      <w:r>
-        <w:t> </w:t>
       </w:r>
     </w:p>
     <w:tbl>
@@ -19199,7 +19030,7 @@
                 <w:szCs w:val="17"/>
                 <w:rtl w:val="0"/>
               </w:rPr>
-              <w:t xml:space="preserve">Tác nhân</w:t>
+              <w:t>Tác nhân</w:t>
             </w:r>
           </w:p>
         </w:tc>
@@ -19236,7 +19067,7 @@
                 <w:szCs w:val="17"/>
                 <w:rtl w:val="0"/>
               </w:rPr>
-              <w:t xml:space="preserve">Coach</w:t>
+              <w:t>PersonalTrainer</w:t>
             </w:r>
           </w:p>
         </w:tc>
@@ -19359,7 +19190,7 @@
                 <w:szCs w:val="17"/>
                 <w:rtl w:val="0"/>
               </w:rPr>
-              <w:t xml:space="preserve">Tiền điều kiện</w:t>
+              <w:t>Tiền điều kiện</w:t>
             </w:r>
           </w:p>
         </w:tc>
@@ -19394,7 +19225,7 @@
                 <w:rFonts w:ascii="Times New Roman" w:hAnsi="Times New Roman"/>
                 <w:sz w:val="20"/>
               </w:rPr>
-              <w:t>Coach thực dạy session, Enrollment của Member còn Confirmed; không thêm điều kiện Present (BR-24/61).</w:t>
+              <w:t>PersonalTrainer thực sự phụ trách buổi PT; điều kiện booking/session tuân theo mô hình PT được duyệt.</w:t>
             </w:r>
           </w:p>
         </w:tc>
@@ -19437,7 +19268,7 @@
                 <w:szCs w:val="17"/>
                 <w:rtl w:val="0"/>
               </w:rPr>
-              <w:t xml:space="preserve">Luồng chính</w:t>
+              <w:t>Luồng chính</w:t>
             </w:r>
           </w:p>
         </w:tc>
@@ -19474,13 +19305,7 @@
                 <w:szCs w:val="17"/>
                 <w:rtl w:val="0"/>
               </w:rPr>
-              <w:t xml:space="preserve">1. Chọn Member/session.</w:t>
-              <w:br w:type="textWrapping"/>
-              <w:t xml:space="preserve"> 2. Ghi WorkoutResult, ProgressNote, CoachComment.</w:t>
-              <w:br w:type="textWrapping"/>
-              <w:t xml:space="preserve"> 3. So sánh lịch sử theo thời gian.</w:t>
-              <w:br w:type="textWrapping"/>
-              <w:t xml:space="preserve"> 4. Đánh giá tiến độ và quyết định có cần chỉnh plan hay không.</w:t>
+              <w:t>1. Chọn Member và buổi PT thuộc phạm vi. 2. Ghi WorkoutResult, ProgressNote và CoachComment. 3. So sánh lịch sử. 4. Đánh giá tiến độ và quyết định điều chỉnh plan.</w:t>
             </w:r>
           </w:p>
         </w:tc>
@@ -19523,7 +19348,7 @@
                 <w:szCs w:val="17"/>
                 <w:rtl w:val="0"/>
               </w:rPr>
-              <w:t xml:space="preserve">Luồng thay thế / ngoại lệ</w:t>
+              <w:t>Luồng thay thế / ngoại lệ</w:t>
             </w:r>
           </w:p>
         </w:tc>
@@ -19560,7 +19385,7 @@
                 <w:szCs w:val="17"/>
                 <w:rtl w:val="0"/>
               </w:rPr>
-              <w:t xml:space="preserve">Không được ghi kết quả cho Member ngoài phạm vi.</w:t>
+              <w:t>ClassInstructor hoặc PersonalTrainer ngoài phạm vi -&gt; 403. Entity liên kết PT session/result phải được chốt theo SSOT §7 trước khi triển khai.</w:t>
             </w:r>
           </w:p>
         </w:tc>
@@ -19648,25 +19473,10 @@
     </w:tbl>
     <w:p>
       <w:pPr>
-        <w:keepNext/>
-        <w:spacing w:after="200" w:lineRule="auto"/>
-        <w:rPr>
-          <w:rFonts w:ascii="Times New Roman" w:cs="Times New Roman" w:eastAsia="Times New Roman" w:hAnsi="Times New Roman"/>
-        </w:rPr>
-      </w:pPr>
-      <w:r>
-        <w:rPr>
-          <w:rFonts w:ascii="Times New Roman" w:cs="Times New Roman" w:eastAsia="Times New Roman" w:hAnsi="Times New Roman"/>
-          <w:rtl w:val="0"/>
-        </w:rPr>
-        <w:t xml:space="preserve"> </w:t>
-      </w:r>
-    </w:p>
-    <w:p>
-      <w:pPr>
         <w:pStyle w:val="Heading3"/>
         <w:keepNext/>
         <w:keepLines w:val="0"/>
+        <w:pageBreakBefore w:val="0"/>
         <w:spacing w:before="280" w:lineRule="auto"/>
         <w:ind w:left="0" w:firstLine="0"/>
         <w:rPr>
@@ -19691,15 +19501,6 @@
           <w:rtl w:val="0"/>
         </w:rPr>
         <w:t xml:space="preserve">UC-14 - Xem kế hoạch, lịch sử &amp; tiến độ cá nhân</w:t>
-      </w:r>
-    </w:p>
-    <w:p>
-      <w:pPr>
-        <w:keepNext/>
-        <w:spacing w:line="80" w:lineRule="exact"/>
-      </w:pPr>
-      <w:r>
-        <w:t> </w:t>
       </w:r>
     </w:p>
     <w:tbl>
@@ -20311,25 +20112,10 @@
     </w:tbl>
     <w:p>
       <w:pPr>
-        <w:keepNext/>
-        <w:spacing w:after="200" w:lineRule="auto"/>
-        <w:rPr>
-          <w:rFonts w:ascii="Times New Roman" w:cs="Times New Roman" w:eastAsia="Times New Roman" w:hAnsi="Times New Roman"/>
-        </w:rPr>
-      </w:pPr>
-      <w:r>
-        <w:rPr>
-          <w:rFonts w:ascii="Times New Roman" w:cs="Times New Roman" w:eastAsia="Times New Roman" w:hAnsi="Times New Roman"/>
-          <w:rtl w:val="0"/>
-        </w:rPr>
-        <w:t xml:space="preserve"> </w:t>
-      </w:r>
-    </w:p>
-    <w:p>
-      <w:pPr>
         <w:pStyle w:val="Heading3"/>
         <w:keepNext/>
         <w:keepLines w:val="0"/>
+        <w:pageBreakBefore w:val="0"/>
         <w:spacing w:before="280" w:lineRule="auto"/>
         <w:ind w:left="0" w:firstLine="0"/>
         <w:rPr>
@@ -20354,15 +20140,6 @@
           <w:rtl w:val="0"/>
         </w:rPr>
         <w:t xml:space="preserve">UC-15 - Quản lý hóa đơn &amp; ghi nhận thanh toán</w:t>
-      </w:r>
-    </w:p>
-    <w:p>
-      <w:pPr>
-        <w:keepNext/>
-        <w:spacing w:line="80" w:lineRule="exact"/>
-      </w:pPr>
-      <w:r>
-        <w:t> </w:t>
       </w:r>
     </w:p>
     <w:tbl>
@@ -20920,22 +20697,6 @@
     </w:tbl>
     <w:p>
       <w:pPr>
-        <w:keepNext/>
-        <w:spacing w:after="200" w:lineRule="auto"/>
-        <w:rPr>
-          <w:rFonts w:ascii="Times New Roman" w:cs="Times New Roman" w:eastAsia="Times New Roman" w:hAnsi="Times New Roman"/>
-        </w:rPr>
-      </w:pPr>
-      <w:r>
-        <w:rPr>
-          <w:rFonts w:ascii="Times New Roman" w:cs="Times New Roman" w:eastAsia="Times New Roman" w:hAnsi="Times New Roman"/>
-          <w:rtl w:val="0"/>
-        </w:rPr>
-        <w:t xml:space="preserve"> </w:t>
-      </w:r>
-    </w:p>
-    <w:p>
-      <w:pPr>
         <w:pStyle w:val="Heading3"/>
         <w:keepNext/>
         <w:keepLines w:val="0"/>
@@ -20964,15 +20725,6 @@
           <w:rtl w:val="0"/>
         </w:rPr>
         <w:t xml:space="preserve">UC-16 - Xử lý điều chỉnh / hoàn tiền</w:t>
-      </w:r>
-    </w:p>
-    <w:p>
-      <w:pPr>
-        <w:keepNext/>
-        <w:spacing w:line="80" w:lineRule="exact"/>
-      </w:pPr>
-      <w:r>
-        <w:t> </w:t>
       </w:r>
     </w:p>
     <w:tbl>
@@ -21530,25 +21282,10 @@
     </w:tbl>
     <w:p>
       <w:pPr>
-        <w:keepNext/>
-        <w:spacing w:after="200" w:lineRule="auto"/>
-        <w:rPr>
-          <w:rFonts w:ascii="Times New Roman" w:cs="Times New Roman" w:eastAsia="Times New Roman" w:hAnsi="Times New Roman"/>
-        </w:rPr>
-      </w:pPr>
-      <w:r>
-        <w:rPr>
-          <w:rFonts w:ascii="Times New Roman" w:cs="Times New Roman" w:eastAsia="Times New Roman" w:hAnsi="Times New Roman"/>
-          <w:rtl w:val="0"/>
-        </w:rPr>
-        <w:t xml:space="preserve"> </w:t>
-      </w:r>
-    </w:p>
-    <w:p>
-      <w:pPr>
         <w:pStyle w:val="Heading3"/>
         <w:keepNext/>
         <w:keepLines w:val="0"/>
+        <w:pageBreakBefore/>
         <w:spacing w:before="280" w:lineRule="auto"/>
         <w:ind w:left="0" w:firstLine="0"/>
         <w:rPr>
@@ -21573,15 +21310,6 @@
           <w:rtl w:val="0"/>
         </w:rPr>
         <w:t xml:space="preserve">UC-17 - Xem &amp; xuất báo cáo quản trị</w:t>
-      </w:r>
-    </w:p>
-    <w:p>
-      <w:pPr>
-        <w:keepNext/>
-        <w:spacing w:line="80" w:lineRule="exact"/>
-      </w:pPr>
-      <w:r>
-        <w:t> </w:t>
       </w:r>
     </w:p>
     <w:tbl>
@@ -22171,25 +21899,10 @@
     </w:tbl>
     <w:p>
       <w:pPr>
-        <w:keepNext/>
-        <w:spacing w:after="200" w:lineRule="auto"/>
-        <w:rPr>
-          <w:rFonts w:ascii="Times New Roman" w:cs="Times New Roman" w:eastAsia="Times New Roman" w:hAnsi="Times New Roman"/>
-        </w:rPr>
-      </w:pPr>
-      <w:r>
-        <w:rPr>
-          <w:rFonts w:ascii="Times New Roman" w:cs="Times New Roman" w:eastAsia="Times New Roman" w:hAnsi="Times New Roman"/>
-          <w:rtl w:val="0"/>
-        </w:rPr>
-        <w:t xml:space="preserve"> </w:t>
-      </w:r>
-    </w:p>
-    <w:p>
-      <w:pPr>
         <w:pStyle w:val="Heading3"/>
         <w:keepNext/>
         <w:keepLines w:val="0"/>
+        <w:pageBreakBefore w:val="0"/>
         <w:spacing w:before="280" w:lineRule="auto"/>
         <w:ind w:left="0" w:firstLine="0"/>
         <w:rPr>
@@ -22214,15 +21927,6 @@
           <w:rtl w:val="0"/>
         </w:rPr>
         <w:t xml:space="preserve">UC-18 - Xem thông báo</w:t>
-      </w:r>
-    </w:p>
-    <w:p>
-      <w:pPr>
-        <w:keepNext/>
-        <w:spacing w:line="80" w:lineRule="exact"/>
-      </w:pPr>
-      <w:r>
-        <w:t> </w:t>
       </w:r>
     </w:p>
     <w:tbl>
@@ -22832,26 +22536,10 @@
     </w:tbl>
     <w:p>
       <w:pPr>
-        <w:keepNext/>
-        <w:spacing w:after="200" w:lineRule="auto"/>
-        <w:rPr>
-          <w:rFonts w:ascii="Times New Roman" w:cs="Times New Roman" w:eastAsia="Times New Roman" w:hAnsi="Times New Roman"/>
-        </w:rPr>
-      </w:pPr>
-      <w:r>
-        <w:rPr>
-          <w:rFonts w:ascii="Times New Roman" w:cs="Times New Roman" w:eastAsia="Times New Roman" w:hAnsi="Times New Roman"/>
-          <w:rtl w:val="0"/>
-        </w:rPr>
-        <w:t xml:space="preserve"> </w:t>
-      </w:r>
-    </w:p>
-    <w:p>
-      <w:pPr>
         <w:pStyle w:val="Heading3"/>
         <w:keepNext/>
         <w:keepLines w:val="0"/>
-        <w:pageBreakBefore/>
+        <w:pageBreakBefore w:val="0"/>
         <w:spacing w:before="280" w:lineRule="auto"/>
         <w:ind w:left="0" w:firstLine="0"/>
         <w:rPr>
@@ -22876,15 +22564,6 @@
           <w:rtl w:val="0"/>
         </w:rPr>
         <w:t xml:space="preserve">UC-19 - Giám sát hệ thống &amp; Audit Log</w:t>
-      </w:r>
-    </w:p>
-    <w:p>
-      <w:pPr>
-        <w:keepNext/>
-        <w:spacing w:line="80" w:lineRule="exact"/>
-      </w:pPr>
-      <w:r>
-        <w:t> </w:t>
       </w:r>
     </w:p>
     <w:tbl>
@@ -23480,25 +23159,10 @@
     </w:tbl>
     <w:p>
       <w:pPr>
-        <w:keepNext/>
-        <w:spacing w:after="200" w:lineRule="auto"/>
-        <w:rPr>
-          <w:rFonts w:ascii="Times New Roman" w:cs="Times New Roman" w:eastAsia="Times New Roman" w:hAnsi="Times New Roman"/>
-        </w:rPr>
-      </w:pPr>
-      <w:r>
-        <w:rPr>
-          <w:rFonts w:ascii="Times New Roman" w:cs="Times New Roman" w:eastAsia="Times New Roman" w:hAnsi="Times New Roman"/>
-          <w:rtl w:val="0"/>
-        </w:rPr>
-        <w:t xml:space="preserve"> </w:t>
-      </w:r>
-    </w:p>
-    <w:p>
-      <w:pPr>
         <w:pStyle w:val="Heading3"/>
         <w:keepNext/>
         <w:keepLines w:val="0"/>
+        <w:pageBreakBefore/>
         <w:spacing w:before="280" w:lineRule="auto"/>
         <w:ind w:left="0" w:firstLine="0"/>
         <w:rPr>
@@ -23523,15 +23187,6 @@
           <w:rtl w:val="0"/>
         </w:rPr>
         <w:t xml:space="preserve">UC-20 - Yêu cầu AI gợi ý bài tập</w:t>
-      </w:r>
-    </w:p>
-    <w:p>
-      <w:pPr>
-        <w:keepNext/>
-        <w:spacing w:line="80" w:lineRule="exact"/>
-      </w:pPr>
-      <w:r>
-        <w:t> </w:t>
       </w:r>
     </w:p>
     <w:tbl>
@@ -23692,7 +23347,7 @@
                 <w:szCs w:val="17"/>
                 <w:rtl w:val="0"/>
               </w:rPr>
-              <w:t xml:space="preserve">Tác nhân</w:t>
+              <w:t>Tác nhân</w:t>
             </w:r>
           </w:p>
         </w:tc>
@@ -23729,7 +23384,7 @@
                 <w:szCs w:val="17"/>
                 <w:rtl w:val="0"/>
               </w:rPr>
-              <w:t xml:space="preserve">Coach; AI System</w:t>
+              <w:t>PersonalTrainer; AI System</w:t>
             </w:r>
           </w:p>
         </w:tc>
@@ -23852,7 +23507,7 @@
                 <w:szCs w:val="17"/>
                 <w:rtl w:val="0"/>
               </w:rPr>
-              <w:t xml:space="preserve">Tiền điều kiện</w:t>
+              <w:t>Tiền điều kiện</w:t>
             </w:r>
           </w:p>
         </w:tc>
@@ -23889,7 +23544,7 @@
                 <w:szCs w:val="17"/>
                 <w:rtl w:val="0"/>
               </w:rPr>
-              <w:t xml:space="preserve">Coach-Member relationship ACTIVE; có profile dữ liệu cần thiết theo BR-26.</w:t>
+              <w:t>CoachCategory = PersonalTrainer; Coach-Member relationship ACTIVE; có dữ liệu theo BR-26.</w:t>
             </w:r>
           </w:p>
         </w:tc>
@@ -23932,7 +23587,7 @@
                 <w:szCs w:val="17"/>
                 <w:rtl w:val="0"/>
               </w:rPr>
-              <w:t xml:space="preserve">Luồng chính</w:t>
+              <w:t>Luồng chính</w:t>
             </w:r>
           </w:p>
         </w:tc>
@@ -23969,15 +23624,7 @@
                 <w:szCs w:val="17"/>
                 <w:rtl w:val="0"/>
               </w:rPr>
-              <w:t xml:space="preserve">1. Coach chọn Member và yêu cầu suggestion.</w:t>
-              <w:br w:type="textWrapping"/>
-              <w:t xml:space="preserve"> 2. Backend lấy Goal/Level/history từ dữ liệu server-side.</w:t>
-              <w:br w:type="textWrapping"/>
-              <w:t xml:space="preserve"> 3. IAiRecommendationService gửi context tối thiểu đến AI System.</w:t>
-              <w:br w:type="textWrapping"/>
-              <w:t xml:space="preserve"> 4. AI trả workout suggestion.</w:t>
-              <w:br w:type="textWrapping"/>
-              <w:t xml:space="preserve"> 5. Coach xem, chỉnh sửa và nếu phù hợp lưu qua UC-12.</w:t>
+              <w:t>1. PersonalTrainer chọn Member và yêu cầu suggestion. 2. Backend kiểm tra category/relationship và lấy Goal/Level/history từ server. 3. IAiRecommendationService gửi context tối thiểu. 4. AI trả suggestion. 5. PersonalTrainer review/edit và có thể lưu qua UC-12.</w:t>
             </w:r>
           </w:p>
         </w:tc>
@@ -24020,7 +23667,7 @@
                 <w:szCs w:val="17"/>
                 <w:rtl w:val="0"/>
               </w:rPr>
-              <w:t xml:space="preserve">Luồng thay thế / ngoại lệ</w:t>
+              <w:t>Luồng thay thế / ngoại lệ</w:t>
             </w:r>
           </w:p>
         </w:tc>
@@ -24057,7 +23704,7 @@
                 <w:szCs w:val="17"/>
                 <w:rtl w:val="0"/>
               </w:rPr>
-              <w:t xml:space="preserve">AI timeout/error -&gt; không tạo official plan; Coach vẫn có thể tự lập plan.</w:t>
+              <w:t>ClassInstructor hoặc Coach không có relationship -&gt; 403. AI timeout/error -&gt; không tạo official plan; PersonalTrainer vẫn có thể tự lập plan.</w:t>
             </w:r>
           </w:p>
         </w:tc>
@@ -24145,25 +23792,10 @@
     </w:tbl>
     <w:p>
       <w:pPr>
-        <w:keepNext/>
-        <w:spacing w:after="200" w:lineRule="auto"/>
-        <w:rPr>
-          <w:rFonts w:ascii="Times New Roman" w:cs="Times New Roman" w:eastAsia="Times New Roman" w:hAnsi="Times New Roman"/>
-        </w:rPr>
-      </w:pPr>
-      <w:r>
-        <w:rPr>
-          <w:rFonts w:ascii="Times New Roman" w:cs="Times New Roman" w:eastAsia="Times New Roman" w:hAnsi="Times New Roman"/>
-          <w:rtl w:val="0"/>
-        </w:rPr>
-        <w:t xml:space="preserve"> </w:t>
-      </w:r>
-    </w:p>
-    <w:p>
-      <w:pPr>
         <w:pStyle w:val="Heading3"/>
         <w:keepNext/>
         <w:keepLines w:val="0"/>
+        <w:pageBreakBefore w:val="0"/>
         <w:spacing w:before="280" w:lineRule="auto"/>
         <w:ind w:left="0" w:firstLine="0"/>
         <w:rPr>
@@ -24188,15 +23820,6 @@
           <w:rtl w:val="0"/>
         </w:rPr>
         <w:t xml:space="preserve">UC-21 - Hỏi đáp AI</w:t>
-      </w:r>
-    </w:p>
-    <w:p>
-      <w:pPr>
-        <w:keepNext/>
-        <w:spacing w:line="80" w:lineRule="exact"/>
-      </w:pPr>
-      <w:r>
-        <w:t> </w:t>
       </w:r>
     </w:p>
     <w:tbl>
@@ -24809,37 +24432,6 @@
     <w:p>
       <w:pPr>
         <w:keepNext/>
-        <w:spacing w:after="200" w:lineRule="auto"/>
-        <w:rPr>
-          <w:rFonts w:ascii="Times New Roman" w:cs="Times New Roman" w:eastAsia="Times New Roman" w:hAnsi="Times New Roman"/>
-        </w:rPr>
-      </w:pPr>
-      <w:r>
-        <w:rPr>
-          <w:rFonts w:ascii="Times New Roman" w:cs="Times New Roman" w:eastAsia="Times New Roman" w:hAnsi="Times New Roman"/>
-          <w:rtl w:val="0"/>
-        </w:rPr>
-        <w:t xml:space="preserve"> </w:t>
-      </w:r>
-    </w:p>
-    <w:p>
-      <w:pPr>
-        <w:keepNext/>
-        <w:spacing w:after="240" w:before="240" w:lineRule="auto"/>
-        <w:rPr>
-          <w:rFonts w:ascii="Times New Roman" w:cs="Times New Roman" w:eastAsia="Times New Roman" w:hAnsi="Times New Roman"/>
-        </w:rPr>
-      </w:pPr>
-      <w:r>
-        <w:rPr>
-          <w:rFonts w:ascii="Times New Roman" w:hAnsi="Times New Roman"/>
-          <w:rtl w:val="0"/>
-        </w:rPr>
-      </w:r>
-    </w:p>
-    <w:p>
-      <w:pPr>
-        <w:keepNext/>
         <w:pageBreakBefore/>
         <w:spacing w:after="240" w:before="240" w:lineRule="auto"/>
         <w:rPr>
@@ -25044,7 +24636,7 @@
           <w:szCs w:val="18"/>
           <w:rtl w:val="0"/>
         </w:rPr>
-        <w:t xml:space="preserve">Coach/Receptionist điểm danh -&gt; Coach tạo plan -&gt; buổi tập -&gt; ghi WorkoutResult -&gt; đánh giá tiến độ -&gt; điều chỉnh plan.</w:t>
+        <w:t>Receptionist ghi Present/Absent cho Yoga/Group X. PersonalTrainer quản lý profile được phép, tạo plan, ghi trạng thái/kết quả buổi PT và đánh giá tiến độ. ClassInstructor chỉ xem lịch được phân công và không tham gia Training/Attendance actions.</w:t>
       </w:r>
     </w:p>
     <w:p>
@@ -25097,7 +24689,7 @@
           <w:szCs w:val="18"/>
           <w:rtl w:val="0"/>
         </w:rPr>
-        <w:t xml:space="preserve">Coach chọn Member -&gt; backend lấy profile/history -&gt; AI System trả suggestion -&gt; Coach review/edit -&gt; lưu official plan.</w:t>
+        <w:t>PersonalTrainer chọn Member có quan hệ Active -&gt; backend kiểm tra category/ownership và lấy profile/history -&gt; AI System trả suggestion -&gt; PersonalTrainer review/edit -&gt; lưu official plan nếu phù hợp.</w:t>
       </w:r>
     </w:p>
     <w:p>
@@ -25168,6 +24760,7 @@
         <w:keepNext/>
         <w:pageBreakBefore/>
         <w:spacing w:after="240" w:before="240" w:lineRule="auto"/>
+        <w:ind w:left="0" w:firstLine="0"/>
         <w:rPr>
           <w:rFonts w:ascii="Times New Roman" w:cs="Times New Roman" w:eastAsia="Times New Roman" w:hAnsi="Times New Roman"/>
         </w:rPr>
@@ -25369,7 +24962,7 @@
         </w:rPr>
       </w:pPr>
       <w:r>
-        <w:t>ERD và từ điển field phải được đối chiếu với Business Rules v1.8. Payment cần Invoice, InvoiceItem, PaymentAttempt, Payment và Refund cùng các unique/idempotency constraints đã duyệt.</w:t>
+        <w:t>ERD và từ điển field phải được đối chiếu với Business Rules v1.9. Identity bổ sung CoachProfile (UserId PK/FK 1–1 UserAccount, CoachCategory bắt buộc cho role Coach). Payment tiếp tục cần Invoice, InvoiceItem, PaymentAttempt, Payment và Refund cùng các unique/idempotency constraints đã duyệt.</w:t>
       </w:r>
     </w:p>
     <w:p>
@@ -25380,7 +24973,7 @@
         </w:rPr>
       </w:pPr>
       <w:r>
-        <w:t>4.1.2 Entity Descriptions See docs/entity-field-purpose.md for current field status. SSOT Sections 2–3 define ownership, keys, Payment entities and enums.</w:t>
+        <w:t>See docs/entity-field-purpose.md for current field status. SSOT Sections 2–3 define ownership, keys, CoachProfile/CoachCategory, Payment entities and enums. CoachProfile does not store salary, commission or contract data.</w:t>
       </w:r>
     </w:p>
     <w:p>
@@ -25519,6 +25112,79 @@
     <w:p>
       <w:r>
         <w:t>Remaining infrastructure choices are recorded in SSOT Section 7. Business behavior for Payment, Refund, revenue and Membership StartDate is approved in Business Rules v1.8.</w:t>
+      </w:r>
+    </w:p>
+    <w:p>
+      <w:pPr>
+        <w:pageBreakBefore/>
+      </w:pPr>
+    </w:p>
+    <w:p>
+      <w:pPr>
+        <w:pStyle w:val="Heading1"/>
+        <w:keepNext/>
+        <w:pageBreakBefore w:val="0"/>
+        <w:spacing w:before="120"/>
+        <w:ind w:left="0" w:firstLine="0"/>
+      </w:pPr>
+      <w:r>
+        <w:t>Approved amendment 28 September 2026</w:t>
+      </w:r>
+    </w:p>
+    <w:p>
+      <w:pPr>
+        <w:pStyle w:val="Heading2"/>
+        <w:keepNext/>
+      </w:pPr>
+      <w:r>
+        <w:t>Coach categories</w:t>
+      </w:r>
+    </w:p>
+    <w:p>
+      <w:r>
+        <w:t>Coach remains one UserRole. Each Coach account has one CoachProfile with CoachCategory = PersonalTrainer or ClassInstructor. System Administrator selects the category when creating a Coach account; the backend enforces role, category and ownership for every protected action.</w:t>
+      </w:r>
+    </w:p>
+    <w:p>
+      <w:pPr>
+        <w:pStyle w:val="Heading2"/>
+        <w:keepNext/>
+      </w:pPr>
+      <w:r>
+        <w:t>Permissions and attendance</w:t>
+      </w:r>
+    </w:p>
+    <w:p>
+      <w:r>
+        <w:t>PersonalTrainer performs authorized PT planning, results, progress feedback and AI suggestions. ClassInstructor only views Yoga/Group X schedules assigned by Center Manager and updates the common self-service profile/password. Receptionist records Present/Absent for Yoga/Group X; ClassInstructor and Center Manager do not inherit this action.</w:t>
+      </w:r>
+    </w:p>
+    <w:p>
+      <w:pPr>
+        <w:pStyle w:val="Heading2"/>
+        <w:keepNext/>
+      </w:pPr>
+      <w:r>
+        <w:t>Data and scope</w:t>
+      </w:r>
+    </w:p>
+    <w:p>
+      <w:r>
+        <w:t>CoachProfile stores only UserId and CoachCategory. Payroll, salary, PT commission, employment contracts, staff-cost reports and profit reporting are outside scope. GrossCollected, Refunded and NetCollected remain cash-basis revenue measures and do not subtract staff costs.</w:t>
+      </w:r>
+    </w:p>
+    <w:p>
+      <w:pPr>
+        <w:pStyle w:val="Heading2"/>
+        <w:keepNext/>
+      </w:pPr>
+      <w:r>
+        <w:t>Outstanding details</w:t>
+      </w:r>
+    </w:p>
+    <w:p>
+      <w:r>
+        <w:t>SSOT Section 7 retains two implementation questions: the entity representing a PT session/result, and how CoachProfile is retained or disabled after a role change. Implementation must not reuse Yoga/Group X Enrollment as a PT result link or cascade-delete Coach history without an approved rule.</w:t>
       </w:r>
     </w:p>
     <w:sectPr>

</xml_diff>

<commit_message>
Finish English backend messages and calendar seed
</commit_message>
<xml_diff>
--- a/docs/SWP391_Report_SRS.docx
+++ b/docs/SWP391_Report_SRS.docx
@@ -785,7 +785,7 @@
           <w:rFonts w:ascii="Times New Roman" w:cs="Times New Roman" w:eastAsia="Times New Roman" w:hAnsi="Times New Roman"/>
           <w:rtl w:val="0"/>
         </w:rPr>
-        <w:t>Six account roles: System Administrator, Center Manager, Coach, Member, Receptionist and ExternalCoach. Guest is not an account role. Coach specialties are configurable and may cover multiple sports; PT is a Gym service.</w:t>
+        <w:t xml:space="preserve">Five account roles: System Administrator, Center Manager, Coach, Member and Receptionist. Guest is not an account role. A Coach holds at least one CoachSpecialty (several are allowed), each linked to a Sport; a Coach with the Personal Training specialty, written Coach (PT), runs PT. PT is a Gym service.</w:t>
       </w:r>
     </w:p>
     <w:p>
@@ -984,7 +984,7 @@
           <w:rFonts w:ascii="Times New Roman" w:cs="Times New Roman" w:eastAsia="Times New Roman" w:hAnsi="Times New Roman"/>
           <w:rtl w:val="0"/>
         </w:rPr>
-        <w:t>Six account roles: System Administrator, Center Manager, Coach, Member, Receptionist and ExternalCoach. Guest is not an account role. Coach specialties are configurable and may cover multiple sports; PT is a Gym service.</w:t>
+        <w:t xml:space="preserve">Five account roles: System Administrator, Center Manager, Coach, Member and Receptionist. Guest is not an account role. A Coach holds at least one CoachSpecialty (several are allowed), each linked to a Sport; a Coach with the Personal Training specialty, written Coach (PT), runs PT. PT is a Gym service.</w:t>
       </w:r>
     </w:p>
     <w:p>
@@ -1318,7 +1318,7 @@
                 <w:rFonts w:ascii="Times New Roman" w:hAnsi="Times New Roman"/>
                 <w:sz w:val="20"/>
               </w:rPr>
-              <w:t>Quản trị phần mềm: quản lý tài khoản nội bộ và vai trò, trạng thái tài khoản, quyền Audit ngoài identity chưa được cấp mặc định. Không quản lý lớp, gói tập hay quyết định kinh doanh.</w:t>
+              <w:t xml:space="preserve">Quản trị phần mềm: tạo tài khoản System Administrator/Center Manager/Receptionist, gán và đổi vai trò, quản lý trạng thái tài khoản (BR-18); quyền Audit ngoài identity chưa được cấp mặc định. Không quản lý lớp, gói tập hay quyết định kinh doanh.</w:t>
             </w:r>
           </w:p>
         </w:tc>
@@ -1389,7 +1389,7 @@
                 <w:rFonts w:ascii="Times New Roman" w:hAnsi="Times New Roman"/>
                 <w:sz w:val="20"/>
               </w:rPr>
-              <w:t>Quản lý vận hành Membership, lớp/PT; xem revenue; approve/reject Refund và xử lý ngoại lệ Payment. Không được vượt số tiền Refund hệ thống tính.</w:t>
+              <w:t xml:space="preserve">Quản lý vận hành Membership, môn/phòng/giá, lớp nhiều buổi và lịch, phân công Coach theo chuyên môn, ngưỡng lớp và sự cố; tạo và quản lý tài khoản Coach kèm CoachSpecialty (BR-18, BR-96); xem báo cáo và Audit Log; approve/reject Refund và xử lý ngoại lệ Payment. Không được vượt số điểm Refund hệ thống tính.</w:t>
             </w:r>
           </w:p>
         </w:tc>
@@ -1467,7 +1467,7 @@
                 <w:szCs w:val="17"/>
                 <w:rtl w:val="0"/>
               </w:rPr>
-              <w:t>Một role với hai category. PersonalTrainer xem lịch PT/học viên được phân công, quản lý plan/result/progress và yêu cầu AI trong quan hệ Active. ClassInstructor chỉ xem lịch cầu lông/bóng rổ do Manager phân công và tự quản lý hồ sơ/mật khẩu; không xem roster, không điểm danh, không dùng Training/AI.</w:t>
+              <w:t xml:space="preserve">Một role; mỗi Coach có ít nhất một CoachSpecialty và có thể có nhiều chuyên môn (BR-96). Coach xem lớp/buổi được phân công kèm danh sách học viên của lớp (họ tên, tình trạng điểm danh) theo BR-97; không tự tạo, sửa, hủy hay publish lớp. Coach (PT) — Coach có Specialty Personal Training — xem lịch PT và học viên được phân công, quản lý plan/result/progress và yêu cầu AI trong quan hệ huấn luyện Active (BR-99). Coach không xem thanh toán, Invoice, ví điểm hay hồ sơ chi tiết Member ngoài quan hệ Active.</w:t>
             </w:r>
           </w:p>
         </w:tc>
@@ -1538,7 +1538,7 @@
                 <w:rFonts w:ascii="Times New Roman" w:hAnsi="Times New Roman"/>
                 <w:sz w:val="20"/>
               </w:rPr>
-              <w:t>Tự đăng ký có OTP; Google onboarding tự đặt mật khẩu; checkout Membership/PT, thanh toán VNPay-QR, xem Invoice và tạo Refund Request cho giao dịch của mình.</w:t>
+              <w:t xml:space="preserve">Tự đăng ký bằng email OTP hoặc đăng nhập Google (không có bước onboarding; đặt mật khẩu sau bằng OTP trong Cài đặt tài khoản hoặc Quên mật khẩu, BR-60/BR-103); mua Membership, PT, khóa lớp và thuê sân; thanh toán bằng điểm và/hoặc VNPay-QR; xem Invoice, ví điểm; tạo Refund Request (hoàn bằng điểm) cho giao dịch của mình.</w:t>
             </w:r>
           </w:p>
         </w:tc>
@@ -1609,7 +1609,7 @@
                 <w:rFonts w:ascii="Times New Roman" w:hAnsi="Times New Roman"/>
                 <w:sz w:val="20"/>
               </w:rPr>
-              <w:t>Tạo Member tại quầy; checkout hộ Member; ghi Present/Absent cho cầu lông/bóng rổ; yêu cầu đối soát/fulfillment lại; tạo Refund hộ có lý do. Không tự đánh dấu Paid hoặc Refund Completed.</w:t>
+              <w:t xml:space="preserve">Tạo Member tại quầy; Gym check-in/out (BR-64); checkout hộ Member (dùng điểm hộ cần OTP của Member); ghi Present/Absent cho lớp cầu lông/bóng rổ; yêu cầu đối soát/fulfillment lại; tạo Refund hộ có lý do. Không tự đánh dấu Paid, không tự cộng điểm hoặc Refund Completed.</w:t>
             </w:r>
           </w:p>
         </w:tc>
@@ -1721,7 +1721,7 @@
           <w:rFonts w:ascii="Times New Roman" w:cs="Times New Roman" w:eastAsia="Times New Roman" w:hAnsi="Times New Roman"/>
           <w:rtl w:val="0"/>
         </w:rPr>
-        <w:t xml:space="preserve">Product features are organized into five functional flows. The first three are required for the minimum viable product; the remaining two are optional extensions the team has chosen to build in addition to the required scope:</w:t>
+        <w:t xml:space="preserve">Product features are organized into six functional flows. The first three are required for the minimum viable product; Flows 4 and 5 are optional extensions the team has chosen to build in addition to the required scope; Flow 6 is a stretch goal:</w:t>
       </w:r>
     </w:p>
     <w:p>
@@ -2015,7 +2015,7 @@
                 <w:szCs w:val="17"/>
                 <w:rtl w:val="0"/>
               </w:rPr>
-              <w:t xml:space="preserve">Tài khoản/hồ sơ; gói thành viên; đăng ký/gia hạn gói. Admin là chức năng quản trị xuyên suốt của flow Identity/RBAC.</w:t>
+              <w:t xml:space="preserve">Tài khoản/hồ sơ; email OTP và Google; quên/đổi mật khẩu; gói thành viên; đăng ký/gia hạn gói; Gym check-in/out. Admin là chức năng quản trị xuyên suốt của flow Identity/RBAC.</w:t>
             </w:r>
           </w:p>
         </w:tc>
@@ -2129,7 +2129,7 @@
                 <w:szCs w:val="17"/>
                 <w:rtl w:val="0"/>
               </w:rPr>
-              <w:t xml:space="preserve">Lớp, phòng, lịch lặp, session, phân công Coach; Member/Receptionist đăng ký-hủy; kiểm soát capacity và conflict.</w:t>
+              <w:t xml:space="preserve">Môn/phòng/giá; lớp nhiều buổi (lịch lặp, session) và phân công Coach theo chuyên môn; SeatHold và ghi danh cả khóa; ngưỡng hoàn vốn (chuyển lớp hoặc hoàn điểm); occupancy chống trùng lịch phòng/sân/Coach; thuê sân theo giờ; Incident Notice. Member/Receptionist ghi danh và thuê sân.</w:t>
             </w:r>
           </w:p>
         </w:tc>
@@ -2236,7 +2236,7 @@
                 <w:rFonts w:ascii="Times New Roman" w:hAnsi="Times New Roman"/>
                 <w:sz w:val="20"/>
               </w:rPr>
-              <w:t>VNPay-QR checkout, Invoice/InvoiceItem snapshot, PaymentAttempt, IPN/QueryDR, reconciliation, Refund theo InvoiceItem và revenue reporting.</w:t>
+              <w:t xml:space="preserve">Invoice/InvoiceItem snapshot; checkout chia điểm + VNPay-QR (hoặc toàn điểm); PaymentAttempt, IPN/QueryDR, reconciliation; ví điểm; hoàn trả theo InvoiceItem bằng điểm; báo cáo hội viên, đăng ký lớp, doanh thu (cash basis) và Audit Log.</w:t>
             </w:r>
           </w:p>
         </w:tc>
@@ -2350,7 +2350,7 @@
                 <w:szCs w:val="17"/>
                 <w:rtl w:val="0"/>
               </w:rPr>
-              <w:t>Receptionist điểm danh cầu lông/bóng rổ. PersonalTrainer quản lý training profile được phép, workout plan, PT result và progress. ClassInstructor không dùng các chức năng này.</w:t>
+              <w:t xml:space="preserve">Receptionist điểm danh lớp cầu lông/bóng rổ. Coach (PT) quản lý PT entitlement/session, training profile được phép, workout plan, result, homework và progress.</w:t>
             </w:r>
           </w:p>
         </w:tc>
@@ -2464,7 +2464,7 @@
                 <w:szCs w:val="17"/>
                 <w:rtl w:val="0"/>
               </w:rPr>
-              <w:t>Chỉ PersonalTrainer có quan hệ Active được yêu cầu AI suggestion và review trước khi lưu official plan.</w:t>
+              <w:t xml:space="preserve">Chỉ Coach (PT) có quan hệ huấn luyện Active được yêu cầu AI suggestion và review trước khi lưu official plan.</w:t>
             </w:r>
           </w:p>
         </w:tc>
@@ -2578,7 +2578,7 @@
                 <w:szCs w:val="17"/>
                 <w:rtl w:val="0"/>
               </w:rPr>
-              <w:t xml:space="preserve">Member hỏi đáp AI; chỉ làm nếu Flow 1-5 đã ổn định.</w:t>
+              <w:t xml:space="preserve">Member hỏi đáp AI theo ngữ cảnh; chỉ làm nếu Flow 1-5 đã ổn định. Manager gợi ý xếp lịch/tạo nháp là phần chưa triển khai.</w:t>
             </w:r>
           </w:p>
         </w:tc>
@@ -2608,7 +2608,7 @@
         </w:rPr>
       </w:pPr>
       <w:r>
-        <w:t>Out of scope includes multi-center/multi-tenant support, a dedicated mobile application, Momo, production payment certification, payroll, salary/commission, employment contracts, staff cost reports and profit reporting. VNPay Sandbox/VNPay-QR and transactional email for OTP/Invoice/Paid/Refund remain in scope; provider credentials are deployment configuration. Revenue reports show collected and refunded cash only and do not subtract payroll or other operating costs.</w:t>
+        <w:t xml:space="preserve">Out of scope includes multi-center/multi-tenant support, a dedicated mobile application, Momo, production payment certification, payroll, salary/commission, employment contracts, staff cost reports and profit reporting. VNPay Sandbox/VNPay-QR and transactional email for OTP/Invoice/Paid/Refund remain in scope; provider credentials are deployment configuration. Revenue reports follow cash basis on VNPay cash collected; points redeemed and points issued are reported separately, refunds are returned as points (not cash), and reports do not subtract payroll or other operating costs.</w:t>
       </w:r>
     </w:p>
     <w:p>
@@ -2756,7 +2756,7 @@
         </w:rPr>
       </w:pPr>
       <w:r>
-        <w:t>SportHub is a centralized system for one center. Five user roles use the web client. CoachProfile selects the PersonalTrainer or ClassInstructor capability set without adding a role. AI System is an optional external actor. Payment uses VNPay Sandbox/VNPay-QR; email supports OTP and Invoice/Paid/Refund notifications through a background/outbox flow.</w:t>
+        <w:t xml:space="preserve">SportHub is a centralized system for one center. Five user roles use the web client. A Coach's CoachSpecialty set decides which Sports they may teach and whether they run PT, without adding a role. AI System is an optional external actor. Payment uses VNPay Sandbox/VNPay-QR; email supports OTP and Invoice/Paid/Refund notifications through a background/outbox flow.</w:t>
       </w:r>
     </w:p>
     <w:p>
@@ -3660,7 +3660,7 @@
           <w:rFonts w:ascii="Times New Roman" w:cs="Times New Roman" w:eastAsia="Times New Roman" w:hAnsi="Times New Roman"/>
           <w:rtl w:val="0"/>
         </w:rPr>
-        <w:t>The AI System is an external actor. SportHub sends only the input that the backend retrieves from MemberTrainingProfile, workout history and an Active Coach-Member relationship. Only PersonalTrainer may request workout suggestions. AI provides suggestions and cannot modify Payment, Membership, Schedule or official Workout Plan data directly.</w:t>
+        <w:t xml:space="preserve">The AI System is an external actor. SportHub sends only the input that the backend retrieves from MemberTrainingProfile, workout history and an Active Coach-Member relationship. Only a Coach (PT) with an Active relationship may request workout suggestions. AI provides suggestions and cannot modify Payment, Membership, Schedule or official Workout Plan data directly.</w:t>
       </w:r>
     </w:p>
     <w:p>
@@ -4354,7 +4354,7 @@
                 <w:szCs w:val="16"/>
                 <w:rtl w:val="0"/>
               </w:rPr>
-              <w:t>PersonalTrainer cần lịch PT, assigned members, plan/result và AI. ClassInstructor chỉ cần lịch cầu lông/bóng rổ được giao và self-service profile.</w:t>
+              <w:t xml:space="preserve">Coach cần lịch lớp/buổi được giao và danh sách học viên của lớp; Coach (PT) cần thêm lịch PT, assigned members, plan/result và AI.</w:t>
             </w:r>
           </w:p>
         </w:tc>
@@ -4640,7 +4640,7 @@
                 <w:rFonts w:ascii="Times New Roman" w:hAnsi="Times New Roman"/>
                 <w:sz w:val="20"/>
               </w:rPr>
-              <w:t>Walk-in, điểm danh cầu lông/bóng rổ, on-behalf checkout, reconciliation support và on-behalf Refund request.</w:t>
+              <w:t xml:space="preserve">Walk-in, Gym check-in/out, điểm danh lớp cầu lông/bóng rổ, on-behalf checkout, reconciliation support và on-behalf Refund request.</w:t>
             </w:r>
           </w:p>
         </w:tc>
@@ -6188,7 +6188,7 @@
                 <w:szCs w:val="17"/>
                 <w:rtl w:val="0"/>
               </w:rPr>
-              <w:t>AI output là suggestion; chỉ PersonalTrainer có quan hệ Active được gọi workout suggestion và lưu official plan sau khi review.</w:t>
+              <w:t xml:space="preserve">AI output là suggestion; chỉ Coach (PT) có quan hệ huấn luyện Active được gọi workout suggestion và lưu official plan sau khi review.</w:t>
             </w:r>
           </w:p>
         </w:tc>
@@ -6300,7 +6300,7 @@
                 <w:szCs w:val="17"/>
                 <w:rtl w:val="0"/>
               </w:rPr>
-              <w:t>Giữ một UserRole Coach; CoachProfile.CoachCategory = PersonalTrainer hoặc ClassInstructor. Backend kiểm tra role, category và ownership; tách page/ẩn menu không thay thế authorization.</w:t>
+              <w:t xml:space="preserve">Giữ một UserRole Coach; mỗi Coach có ít nhất một CoachSpecialty liên kết Sport (BR-96), thay cho CoachCategory cũ. Backend kiểm tra role, specialty khớp Sport và ownership/quan hệ Active; tách page/ẩn menu không thay thế authorization.</w:t>
             </w:r>
           </w:p>
         </w:tc>
@@ -8564,7 +8564,7 @@
                 <w:szCs w:val="15"/>
                 <w:rtl w:val="0"/>
               </w:rPr>
-              <w:t xml:space="preserve">System Administrator</w:t>
+              <w:t xml:space="preserve">System Administrator; Center Manager (chỉ tài khoản Coach)</w:t>
             </w:r>
           </w:p>
         </w:tc>
@@ -9128,7 +9128,7 @@
                 <w:szCs w:val="15"/>
                 <w:rtl w:val="0"/>
               </w:rPr>
-              <w:t xml:space="preserve">Quản lý đăng ký buổi học</w:t>
+              <w:t xml:space="preserve">Quản lý ghi danh lớp &amp; thuê sân</w:t>
             </w:r>
           </w:p>
         </w:tc>
@@ -9314,7 +9314,7 @@
                 <w:szCs w:val="15"/>
                 <w:rtl w:val="0"/>
               </w:rPr>
-              <w:t>PersonalTrainer; ClassInstructor</w:t>
+              <w:t xml:space="preserve">Coach</w:t>
             </w:r>
           </w:p>
         </w:tc>
@@ -9464,7 +9464,7 @@
                 <w:szCs w:val="15"/>
                 <w:rtl w:val="0"/>
               </w:rPr>
-              <w:t>Receptionist; PersonalTrainer cho PT theo mô hình PT</w:t>
+              <w:t xml:space="preserve">Receptionist; Coach (PT) cho buổi PT</w:t>
             </w:r>
           </w:p>
         </w:tc>
@@ -9614,7 +9614,7 @@
                 <w:szCs w:val="15"/>
                 <w:rtl w:val="0"/>
               </w:rPr>
-              <w:t>Member self; PersonalTrainer authorized</w:t>
+              <w:t xml:space="preserve">Member self; Coach (PT) authorized</w:t>
             </w:r>
           </w:p>
         </w:tc>
@@ -9764,7 +9764,7 @@
                 <w:szCs w:val="15"/>
                 <w:rtl w:val="0"/>
               </w:rPr>
-              <w:t>PersonalTrainer</w:t>
+              <w:t xml:space="preserve">Coach (PT)</w:t>
             </w:r>
           </w:p>
         </w:tc>
@@ -9914,7 +9914,7 @@
                 <w:szCs w:val="15"/>
                 <w:rtl w:val="0"/>
               </w:rPr>
-              <w:t>PersonalTrainer</w:t>
+              <w:t xml:space="preserve">Coach (PT)</w:t>
             </w:r>
           </w:p>
         </w:tc>
@@ -10314,7 +10314,7 @@
                 <w:szCs w:val="15"/>
                 <w:rtl w:val="0"/>
               </w:rPr>
-              <w:t>Yêu cầu và xử lý hoàn tiền</w:t>
+              <w:t xml:space="preserve">Yêu cầu và xử lý hoàn trả bằng điểm</w:t>
             </w:r>
           </w:p>
         </w:tc>
@@ -10343,7 +10343,7 @@
                 <w:rFonts w:ascii="Times New Roman" w:hAnsi="Times New Roman"/>
                 <w:sz w:val="20"/>
               </w:rPr>
-              <w:t>Member; Receptionist on-behalf; Center Manager; VNPay</w:t>
+              <w:t xml:space="preserve">Member; Receptionist on-behalf; Center Manager</w:t>
             </w:r>
           </w:p>
         </w:tc>
@@ -10922,7 +10922,7 @@
                 <w:szCs w:val="15"/>
                 <w:rtl w:val="0"/>
               </w:rPr>
-              <w:t>PersonalTrainer + AI System</w:t>
+              <w:t xml:space="preserve">Coach (PT) + AI System</w:t>
             </w:r>
           </w:p>
         </w:tc>
@@ -11137,7 +11137,7 @@
         </w:rPr>
       </w:pPr>
       <w:r>
-        <w:t>UC-07 groups course creation, publishing, session scheduling, room assignment and Coach assignment by specialty. Courses use whole-course enrollment; PT is a separate paid Gym service.</w:t>
+        <w:t xml:space="preserve">UC-07 groups course creation, publishing, session scheduling, room assignment and Coach assignment by specialty, plus threshold monitoring, session reschedule/cancel (BR-54) and Incident Notices. Courses use whole-course enrollment; PT is a separate paid Gym service.</w:t>
       </w:r>
     </w:p>
     <w:p>
@@ -11148,7 +11148,7 @@
         </w:rPr>
       </w:pPr>
       <w:r>
-        <w:t>• UC-08 groups booking and cancellation. Internal validation covers Membership Active/validity, Published state, Capacity, daily rule, No-show restriction and the 30-minute cutoff; class booking does not use Membership credit.</w:t>
+        <w:t xml:space="preserve">• UC-08 groups whole-course enrollment (SeatHold → checkout → Enrollment CONFIRMED), class transfer or point refund when the threshold is not met, and hourly court rental. Class enrollment does not require Membership and uses no session credit; group classes have no daily limit, 30-minute cancellation cutoff or No-show restriction.</w:t>
       </w:r>
     </w:p>
     <w:p>
@@ -11188,7 +11188,7 @@
           <w:rFonts w:ascii="Times New Roman" w:cs="Times New Roman" w:eastAsia="Times New Roman" w:hAnsi="Times New Roman"/>
           <w:rtl w:val="0"/>
         </w:rPr>
-        <w:t>• Workout result and progress evaluation are grouped into UC-13 because both occur after a PT session and are performed only by an authorized PersonalTrainer.</w:t>
+        <w:t xml:space="preserve">• Workout result and progress evaluation are grouped into UC-13 because both occur after a PT session and are performed only by an authorized Coach (PT).</w:t>
       </w:r>
     </w:p>
     <w:p>
@@ -11789,7 +11789,7 @@
                 <w:szCs w:val="17"/>
                 <w:rtl w:val="0"/>
               </w:rPr>
-              <w:t xml:space="preserve">Sai thông tin -&gt; từ chối; BANNED/DEACTIVATED -&gt; không cho đăng nhập.</w:t>
+              <w:t xml:space="preserve">Sai thông tin -&gt; từ chối; BANNED/DEACTIVATED -&gt; không cho đăng nhập. Quên mật khẩu: người dùng nhập email, hệ thống luôn phản hồi trung tính và gửi link đặt lại (token hiệu lực 10 phút, dùng một lần) nếu email tồn tại (BR-103). Đăng nhập Google theo BR-59/BR-60 (xem UC-03).</w:t>
             </w:r>
           </w:p>
         </w:tc>
@@ -12901,7 +12901,7 @@
                 <w:szCs w:val="17"/>
                 <w:rtl w:val="0"/>
               </w:rPr>
-              <w:t>Email chưa tồn tại; Member có quyền truy cập email. Google email mới cần hoàn tất bước tự đặt mật khẩu.</w:t>
+              <w:t xml:space="preserve">Đăng ký email: email chưa tồn tại và Member truy cập được email. Đăng nhập Google lần đầu: email chưa tồn tại.</w:t>
             </w:r>
           </w:p>
         </w:tc>
@@ -12981,7 +12981,7 @@
                 <w:szCs w:val="17"/>
                 <w:rtl w:val="0"/>
               </w:rPr>
-              <w:t>1. Register email/password yêu cầu gửi OTP. 2. User nhập OTP 6 số còn hạn và mật khẩu mạnh. 3. Backend consume OTP one-time, kiểm tra unique email và tạo account Member. 4. Google login với email mới tạo account chờ user nhập/confirm password trước khi hoàn tất onboarding.</w:t>
+              <w:t xml:space="preserve">1. Member nhập email và yêu cầu gửi OTP đăng ký (BR-78). 2. Member nhập OTP 6 số còn hạn (10 phút, dùng một lần) và mật khẩu đáp ứng BR-102. 3. Backend consume OTP, kiểm tra email duy nhất không phân biệt hoa/thường và tạo account Member Active. 4. Google: đăng nhập lần đầu với email chưa tồn tại tạo ngay account Member Active với password_hash = NULL, không có bước onboarding; Member đặt mật khẩu sau bằng OTP trong Cài đặt tài khoản hoặc luồng Quên mật khẩu (BR-60, BR-103). 5. Receptionist tạo Member tại quầy theo quyền được cấp.</w:t>
             </w:r>
           </w:p>
         </w:tc>
@@ -13141,7 +13141,7 @@
                 <w:szCs w:val="17"/>
                 <w:rtl w:val="0"/>
               </w:rPr>
-              <w:t>Tạo account MEMBER có email được xác minh và credential nội bộ; không sinh/gửi SuggestedPassword.</w:t>
+              <w:t xml:space="preserve">Tạo account MEMBER Active, có email đã xác minh (đăng ký OTP) hoặc xác thực qua Google; account Google chưa có mật khẩu cho đến khi Member tự đặt; hệ thống không tự sinh hoặc gửi mật khẩu.</w:t>
             </w:r>
           </w:p>
         </w:tc>
@@ -13374,7 +13374,7 @@
                 <w:szCs w:val="17"/>
                 <w:rtl w:val="0"/>
               </w:rPr>
-              <w:t xml:space="preserve">System Administrator</w:t>
+              <w:t xml:space="preserve">System Administrator; Center Manager (chỉ tài khoản Coach)</w:t>
             </w:r>
           </w:p>
         </w:tc>
@@ -13614,7 +13614,7 @@
                 <w:szCs w:val="17"/>
                 <w:rtl w:val="0"/>
               </w:rPr>
-              <w:t>1. Admin mở danh sách tài khoản nội bộ. 2. Tạo tài khoản Center Manager/Coach/Receptionist khi cần. 3. Khi tạo Coach, chọn CoachCategory = PersonalTrainer hoặc ClassInstructor. 4. Gán role hợp lệ. 5. Thay đổi status ACTIVE/BANNED/DEACTIVATED. 6. Hệ thống ghi Audit Log cho thay đổi nhạy cảm.</w:t>
+              <w:t xml:space="preserve">1. Admin mở danh sách tài khoản nội bộ. 2. Admin tạo tài khoản System Administrator, Center Manager hoặc Receptionist, gán/đổi vai trò hợp lệ (BR-18); mỗi tài khoản đúng một vai trò. 3. Center Manager tạo và quản lý tài khoản Coach kèm ít nhất một CoachSpecialty (BR-96), không gán hoặc đổi vai trò. 4. Admin thay đổi status ACTIVE/BANNED/DEACTIVATED. 5. Hệ thống ghi Audit Log cho thay đổi nhạy cảm.</w:t>
             </w:r>
           </w:p>
         </w:tc>
@@ -13694,7 +13694,7 @@
                 <w:szCs w:val="17"/>
                 <w:rtl w:val="0"/>
               </w:rPr>
-              <w:t>Không cho tạo Coach thiếu hoặc có CoachCategory không hợp lệ. Không cho Admin tự ý sửa dữ liệu nghiệp vụ của role. Không tạo AI System thành user account.</w:t>
+              <w:t xml:space="preserve">Không cho tạo Coach không có CoachSpecialty hợp lệ. Không cho Admin tự ý sửa dữ liệu nghiệp vụ của role. Không tạo AI System thành user account.</w:t>
             </w:r>
           </w:p>
         </w:tc>
@@ -14936,7 +14936,7 @@
                 <w:rFonts w:ascii="Times New Roman" w:hAnsi="Times New Roman"/>
                 <w:sz w:val="20"/>
               </w:rPr>
-              <w:t>1. Chọn MembershipPackage hoặc PT. 2. Xác định beneficiary và checkout actor. 3. Tạo Invoice/InvoiceItem snapshot. 4. Tạo PaymentAttempt VNPay-QR. 5. Khi IPN/QueryDR hợp lệ, trong cùng transaction ghi Payment Success, Invoice Paid và tạo/kích hoạt Membership hoặc PT. 6. Lần mua Membership mới lấy ngày Việt Nam của vnp_PayDate; renewal bắt đầu sau EndDate hiện tại.</w:t>
+              <w:t xml:space="preserve">1. Chọn MembershipPackage hoặc PT. 2. Xác định beneficiary và checkout actor. 3. Tạo Invoice/InvoiceItem snapshot. 4. Tạo PaymentAttempt VNPay-QR cho phần tiền còn lại sau khi áp điểm (xem UC-15). 5. Khi IPN/QueryDR hợp lệ, trong cùng transaction ghi Payment Success, Invoice Paid và tạo/kích hoạt Membership hoặc PT. 6. Lần mua Membership mới lấy ngày Việt Nam của vnp_PayDate; renewal bắt đầu sau EndDate hiện tại.</w:t>
             </w:r>
           </w:p>
         </w:tc>
@@ -15465,7 +15465,7 @@
                 <w:rFonts w:ascii="Times New Roman" w:hAnsi="Times New Roman"/>
                 <w:sz w:val="20"/>
               </w:rPr>
-              <w:t>Manager đã đăng nhập; Coach/Room hợp lệ khi được chọn.</w:t>
+              <w:t xml:space="preserve">Manager đã đăng nhập; Sport và Room hợp lệ; Coach được chọn đang hoạt động và có CoachSpecialty khớp Sport của lớp.</w:t>
             </w:r>
           </w:p>
         </w:tc>
@@ -15537,7 +15537,7 @@
                 <w:rFonts w:ascii="Times New Roman" w:hAnsi="Times New Roman"/>
                 <w:sz w:val="20"/>
               </w:rPr>
-              <w:t>1. Tạo Yoga hoặc Group X class. 2. Chọn Date, StartTime, ClassInstructor, Capacity và Morning/Afternoon slot. 3. Hệ thống tính EndTime = StartTime + 60 minutes. 4. Chặn Coach sai category, quá 1 slot/discipline, quá 2 class/discipline hoặc quá 4 class/ngày; Capacity phải 1–20. 5. Publish để mở booking; close để dừng booking. 6. Hủy/dời theo BR-54.</w:t>
+              <w:t xml:space="preserve">1. Manager tạo lớp (khóa nhiều buổi) cầu lông hoặc bóng rổ: Code, Sport, Coach phụ trách, Room, ngày bắt đầu, số buổi, lịch lặp theo tuần, Capacity và Price. 2. Thời lượng buổi lấy từ cấu hình của Sport: EndTime = StartTime + thời lượng (BR-13); Capacity &gt; 0 và không vượt mức tối đa của Sport (BR-51). 3. Hệ thống kiểm tra từng buổi qua occupancy: Coach và Room không giao với buổi lớp, buổi PT hoặc lượt thuê khác và nằm trong giờ hoạt động (BR-112). 4. Manager publish để mở ghi danh (DRAFT → PUBLISHED); lớp sang IN_PROGRESS rồi COMPLETED theo lịch, hoặc CANCELLED (BR-67). 5. Manager dời/hủy từng buổi theo BR-54: ghi danh giữ nguyên hiệu lực, buổi bị hủy được bù, hệ thống email Coach và học viên. 6. Đến thời điểm chốt, job so sánh ghi danh CONFIRMED với BreakEvenThreshold: đạt thì ThresholdStatus = Met; chưa đạt thì AtRisk, học viên được email để chọn chuyển lớp hoặc hoàn điểm (BR-119, BR-120). 7. Khi có sự cố, Manager tạo Incident Notice (phạm vi, lý do): khung giờ bị khóa, các bên bị ảnh hưởng được email, lượt thuê bị ảnh hưởng tự hủy và hoàn 100% bằng điểm.</w:t>
             </w:r>
           </w:p>
         </w:tc>
@@ -15609,7 +15609,7 @@
                 <w:rFonts w:ascii="Times New Roman" w:hAnsi="Times New Roman"/>
                 <w:sz w:val="20"/>
               </w:rPr>
-              <w:t>Không có Beginner/Advanced hoặc Waitlist. PT không được tạo qua Class. Conflict/limit violation bị từ chối.</w:t>
+              <w:t xml:space="preserve">Coach không khớp CoachSpecialty, hoặc Coach/Room trùng lịch hay ngoài giờ hoạt động → từ chối và nêu rõ xung đột (Coach/Room, khung giờ). Coach không tự tạo, sửa, hủy hay publish lớp (BR-14). PT không được tạo qua Class. Không có Waitlist; "chờ đợt sau" là hoàn 100% điểm kèm đăng ký nhận thông báo, không giữ chỗ.</w:t>
             </w:r>
           </w:p>
         </w:tc>
@@ -15681,7 +15681,7 @@
                 <w:rFonts w:ascii="Times New Roman" w:hAnsi="Times New Roman"/>
                 <w:sz w:val="20"/>
               </w:rPr>
-              <w:t>Class tuân thủ Draft → Published → Closed và các giới hạn lịch/ngày.</w:t>
+              <w:t xml:space="preserve">Class tuân thủ vòng đời DRAFT → PUBLISHED → IN_PROGRESS → COMPLETED (hoặc CANCELLED); không xếp trùng Coach/Room.</w:t>
             </w:r>
           </w:p>
         </w:tc>
@@ -15704,8 +15704,6 @@
           <w:szCs w:val="26"/>
         </w:rPr>
       </w:pPr>
-      <w:bookmarkStart w:colFirst="0" w:colLast="0" w:name="_r52bixhjw6we" w:id="23"/>
-      <w:bookmarkEnd w:id="23"/>
       <w:r>
         <w:rPr>
           <w:rFonts w:ascii="Times New Roman" w:cs="Times New Roman" w:eastAsia="Times New Roman" w:hAnsi="Times New Roman"/>
@@ -15716,7 +15714,7 @@
           <w:szCs w:val="26"/>
           <w:rtl w:val="0"/>
         </w:rPr>
-        <w:t xml:space="preserve">UC-08 - Quản lý đăng ký buổi học</w:t>
+        <w:t xml:space="preserve">UC-08 - Quản lý ghi danh lớp &amp; thuê sân</w:t>
       </w:r>
     </w:p>
     <w:tbl>
@@ -16066,7 +16064,7 @@
                 <w:rFonts w:ascii="Times New Roman" w:hAnsi="Times New Roman"/>
                 <w:sz w:val="20"/>
               </w:rPr>
-              <w:t>Class PUBLISHED; Member có Membership Active, class date trong validity và không bị No-show restriction.</w:t>
+              <w:t xml:space="preserve">Class PUBLISHED và buổi đầu tiên chưa bắt đầu; Member (hoặc Receptionist thay mặt một Member được chọn rõ) đã đăng nhập. Membership Gym không phải điều kiện ghi danh hoặc thuê sân.</w:t>
             </w:r>
           </w:p>
         </w:tc>
@@ -16138,7 +16136,7 @@
                 <w:rFonts w:ascii="Times New Roman" w:hAnsi="Times New Roman"/>
                 <w:sz w:val="20"/>
               </w:rPr>
-              <w:t>1. Xem class Published. 2. Khi booking, kiểm Capacity, tối đa 1 Yoga và 1 Group X trong ngày, validity và restriction. 3. Tạo booking và giữ slot. 4. Khi hủy tại hoặc trước 30 phút, chuyển Cancelled và giải phóng slot.</w:t>
+              <w:t xml:space="preserve">1. Member xem lớp PUBLISHED và chọn lớp. 2. Hệ thống kiểm tra còn chỗ sau khi tính cả SeatHold (BR-116) và Member không có ghi danh hoặc chỗ giữ khác giao lịch (BR-114). 3. Khi bắt đầu checkout, hệ thống tạo SeatHold 15 phút (cấu hình được, BR-115). 4. Thanh toán theo UC-15; khi thành công, SeatHold chuyển thành Enrollment CONFIRMED cho cả khóa. 5. Trước buổi đầu tiên, Member có thể hủy ghi danh và được hoàn 100% giá trị thực trả bằng điểm (BR-122). 6. Thuê sân: Member chọn khối 60 phút còn trống (Room tương thích Sport, trong giờ hoạt động, không bị khóa, không giao buổi lớp/PT/lượt thuê khác, BR-126), checkout và thanh toán theo UC-15.</w:t>
             </w:r>
           </w:p>
         </w:tc>
@@ -16210,7 +16208,7 @@
                 <w:rFonts w:ascii="Times New Roman" w:hAnsi="Times New Roman"/>
                 <w:sz w:val="20"/>
               </w:rPr>
-              <w:t>Class full, ngoài Membership validity, trùng daily rule, đang restriction hoặc hủy sau deadline → từ chối. Không có Waitlist.</w:t>
+              <w:t xml:space="preserve">Lớp đầy, không PUBLISHED, đã qua buổi đầu tiên, trùng lịch ghi danh khác hoặc SeatHold hết hạn → từ chối hoặc phải checkout lại; không có Waitlist. Lớp chưa đạt ngưỡng: Member được email để chọn chuyển lớp hoặc hoàn điểm. Membership hết hạn không hủy ghi danh đã CONFIRMED.</w:t>
             </w:r>
           </w:p>
         </w:tc>
@@ -16282,7 +16280,7 @@
                 <w:rFonts w:ascii="Times New Roman" w:hAnsi="Times New Roman"/>
                 <w:sz w:val="20"/>
               </w:rPr>
-              <w:t>Booking và slot nhất quán; không trừ hoặc hoàn Membership session credit.</w:t>
+              <w:t xml:space="preserve">Enrollment, SeatHold và ReservedCount nhất quán (ConfirmedCount ≤ ReservedCount ≤ Capacity); không trừ hoặc hoàn Membership session credit.</w:t>
             </w:r>
           </w:p>
         </w:tc>
@@ -16515,7 +16513,7 @@
                 <w:szCs w:val="17"/>
                 <w:rtl w:val="0"/>
               </w:rPr>
-              <w:t>PersonalTrainer; ClassInstructor</w:t>
+              <w:t xml:space="preserve">Coach</w:t>
             </w:r>
           </w:p>
         </w:tc>
@@ -16675,7 +16673,7 @@
                 <w:szCs w:val="17"/>
                 <w:rtl w:val="0"/>
               </w:rPr>
-              <w:t>Coach đã đăng nhập, có CoachProfile hợp lệ và được phân công lịch/phạm vi phục vụ.</w:t>
+              <w:t xml:space="preserve">Coach đã đăng nhập, tài khoản Active, có ít nhất một CoachSpecialty và được phân công lớp hoặc quan hệ huấn luyện.</w:t>
             </w:r>
           </w:p>
         </w:tc>
@@ -16755,7 +16753,7 @@
                 <w:szCs w:val="17"/>
                 <w:rtl w:val="0"/>
               </w:rPr>
-              <w:t>1. Coach mở lịch của mình. 2. Backend lấy CoachId từ token và kiểm tra CoachCategory. 3. ClassInstructor chỉ thấy lịch cầu lông/bóng rổ được giao gồm bộ môn, ngày/giờ, phòng và trạng thái. 4. PersonalTrainer thấy lịch PT và học viên được phân công theo quan hệ hợp lệ.</w:t>
+              <w:t xml:space="preserve">1. Coach mở lịch của mình. 2. Backend lấy CoachId từ token và chỉ trả lớp/buổi có CoachId bằng UserId của chính Coach (BR-97): bộ môn, ngày/giờ, Room, trạng thái và danh sách học viên của lớp (họ tên, tình trạng điểm danh). 3. Coach (PT) còn thấy lịch PT và học viên được phân công theo quan hệ huấn luyện Active (BR-99).</w:t>
             </w:r>
           </w:p>
         </w:tc>
@@ -16835,7 +16833,7 @@
                 <w:szCs w:val="17"/>
                 <w:rtl w:val="0"/>
               </w:rPr>
-              <w:t>ClassInstructor không được xem roster/hồ sơ Member hoặc lịch không thuộc mình. Category/ownership không hợp lệ -&gt; 403.</w:t>
+              <w:t xml:space="preserve">Coach không xem lớp không thuộc mình, không xem thanh toán, Invoice, ví điểm hoặc hồ sơ chi tiết Member ngoài quan hệ huấn luyện Active; vi phạm ownership/quan hệ -&gt; 403.</w:t>
             </w:r>
           </w:p>
         </w:tc>
@@ -16915,7 +16913,7 @@
                 <w:szCs w:val="17"/>
                 <w:rtl w:val="0"/>
               </w:rPr>
-              <w:t>Coach chỉ nhận dữ liệu lịch và phạm vi nghiệp vụ đúng với category của mình.</w:t>
+              <w:t xml:space="preserve">Coach chỉ nhận dữ liệu lịch và phạm vi nghiệp vụ đúng với phân công và quan hệ của mình.</w:t>
             </w:r>
           </w:p>
         </w:tc>
@@ -17148,7 +17146,7 @@
                 <w:szCs w:val="17"/>
                 <w:rtl w:val="0"/>
               </w:rPr>
-              <w:t>Receptionist; PersonalTrainer cho PT theo mô hình PT</w:t>
+              <w:t xml:space="preserve">Receptionist; Coach (PT) cho buổi PT</w:t>
             </w:r>
           </w:p>
         </w:tc>
@@ -17388,7 +17386,7 @@
                 <w:szCs w:val="17"/>
                 <w:rtl w:val="0"/>
               </w:rPr>
-              <w:t>1. Receptionist mở roster/check-in của cầu lông/bóng rổ. 2. Chọn Enrollment hợp lệ. 3. Ghi PRESENT hoặc ABSENT. 4. Hệ thống lưu Attendance và actor/time. Với PT, PersonalTrainer ghi trạng thái buổi theo entity PT session được đặc tả; ClassInstructor không có action điểm danh.</w:t>
+              <w:t xml:space="preserve">1. Receptionist mở roster/check-in của lớp cầu lông/bóng rổ. 2. Chọn Enrollment hợp lệ. 3. Ghi PRESENT hoặc ABSENT. 4. Hệ thống lưu Attendance và actor/time. Với PT, Coach (PT) ghi trạng thái buổi theo entity PT session được đặc tả; Coach không có action điểm danh lớp nhóm.</w:t>
             </w:r>
           </w:p>
         </w:tc>
@@ -17468,7 +17466,7 @@
                 <w:szCs w:val="17"/>
                 <w:rtl w:val="0"/>
               </w:rPr>
-              <w:t>Không có Attendance lớp nếu Member không có Enrollment. ClassInstructor hoặc Manager gọi action điểm danh -&gt; 403. NO_SHOW do job tạo sau EndAtUtc theo rule.</w:t>
+              <w:t xml:space="preserve">Không có Attendance lớp nếu Member không có Enrollment. Coach hoặc Manager gọi action điểm danh lớp nhóm -&gt; 403. NO_SHOW do job tạo sau EndAtUtc theo rule.</w:t>
             </w:r>
           </w:p>
         </w:tc>
@@ -17781,7 +17779,7 @@
                 <w:szCs w:val="17"/>
                 <w:rtl w:val="0"/>
               </w:rPr>
-              <w:t>Member self; PersonalTrainer authorized</w:t>
+              <w:t xml:space="preserve">Member self; Coach (PT) authorized</w:t>
             </w:r>
           </w:p>
         </w:tc>
@@ -17941,7 +17939,7 @@
                 <w:szCs w:val="17"/>
                 <w:rtl w:val="0"/>
               </w:rPr>
-              <w:t>Member tồn tại; PersonalTrainer chỉ có quyền khi Coach-Member relationship ACTIVE.</w:t>
+              <w:t xml:space="preserve">Member tồn tại; Coach (PT) chỉ có quyền khi Coach-Member relationship ACTIVE.</w:t>
             </w:r>
           </w:p>
         </w:tc>
@@ -18021,7 +18019,7 @@
                 <w:szCs w:val="17"/>
                 <w:rtl w:val="0"/>
               </w:rPr>
-              <w:t>1. Member cập nhật Goal/ExperienceLevel/Notes của mình. 2. PersonalTrainer được đọc/điều chỉnh trong phạm vi quan hệ Active theo policy. 3. Hệ thống ghi UpdatedAt.</w:t>
+              <w:t xml:space="preserve">1. Member cập nhật Goal/ExperienceLevel/Notes của mình. 2. Coach (PT) được đọc/điều chỉnh trong phạm vi quan hệ Active theo policy. 3. Hệ thống ghi UpdatedAt.</w:t>
             </w:r>
           </w:p>
         </w:tc>
@@ -18101,7 +18099,7 @@
                 <w:szCs w:val="17"/>
                 <w:rtl w:val="0"/>
               </w:rPr>
-              <w:t>ClassInstructor hoặc PersonalTrainer không có relationship -&gt; 403.</w:t>
+              <w:t xml:space="preserve">Coach không có Specialty Personal Training hoặc không có relationship -&gt; 403.</w:t>
             </w:r>
           </w:p>
         </w:tc>
@@ -18414,7 +18412,7 @@
                 <w:szCs w:val="17"/>
                 <w:rtl w:val="0"/>
               </w:rPr>
-              <w:t>PersonalTrainer</w:t>
+              <w:t xml:space="preserve">Coach (PT)</w:t>
             </w:r>
           </w:p>
         </w:tc>
@@ -18574,7 +18572,7 @@
                 <w:szCs w:val="17"/>
                 <w:rtl w:val="0"/>
               </w:rPr>
-              <w:t>PersonalTrainer có Coach-Member relationship ACTIVE.</w:t>
+              <w:t xml:space="preserve">Coach (PT) có Coach-Member relationship ACTIVE.</w:t>
             </w:r>
           </w:p>
         </w:tc>
@@ -18654,7 +18652,7 @@
                 <w:szCs w:val="17"/>
                 <w:rtl w:val="0"/>
               </w:rPr>
-              <w:t>1. PersonalTrainer chọn Member được phụ trách. 2. Xem profile và lịch sử cần thiết. 3. Tạo WorkoutPlan và WorkoutPlanItem. 4. Chỉnh sets/reps/notes theo chuyên môn. 5. Lưu official plan.</w:t>
+              <w:t xml:space="preserve">1. Coach (PT) chọn Member được phụ trách. 2. Xem profile và lịch sử cần thiết. 3. Tạo WorkoutPlan và WorkoutPlanItem. 4. Chỉnh sets/reps/notes theo chuyên môn. 5. Lưu official plan.</w:t>
             </w:r>
           </w:p>
         </w:tc>
@@ -18734,7 +18732,7 @@
                 <w:szCs w:val="17"/>
                 <w:rtl w:val="0"/>
               </w:rPr>
-              <w:t>ClassInstructor hoặc Coach không có relationship -&gt; 403. PersonalTrainer có thể dùng UC-20; AI không bắt buộc.</w:t>
+              <w:t xml:space="preserve">Coach không có Specialty Personal Training hoặc không có relationship -&gt; 403. Coach (PT) có thể dùng UC-20; AI không bắt buộc.</w:t>
             </w:r>
           </w:p>
         </w:tc>
@@ -18814,7 +18812,7 @@
                 <w:szCs w:val="17"/>
                 <w:rtl w:val="0"/>
               </w:rPr>
-              <w:t>Official WorkoutPlan được tạo bởi PersonalTrainer được phân công.</w:t>
+              <w:t xml:space="preserve">Official WorkoutPlan được tạo bởi Coach (PT) được phân công.</w:t>
             </w:r>
           </w:p>
         </w:tc>
@@ -19047,7 +19045,7 @@
                 <w:szCs w:val="17"/>
                 <w:rtl w:val="0"/>
               </w:rPr>
-              <w:t>PersonalTrainer</w:t>
+              <w:t xml:space="preserve">Coach (PT)</w:t>
             </w:r>
           </w:p>
         </w:tc>
@@ -19205,7 +19203,7 @@
                 <w:rFonts w:ascii="Times New Roman" w:hAnsi="Times New Roman"/>
                 <w:sz w:val="20"/>
               </w:rPr>
-              <w:t>PersonalTrainer thực sự phụ trách buổi PT; điều kiện booking/session tuân theo mô hình PT được duyệt.</w:t>
+              <w:t xml:space="preserve">Coach (PT) thực sự phụ trách buổi PT; điều kiện booking/session tuân theo mô hình PT được duyệt.</w:t>
             </w:r>
           </w:p>
         </w:tc>
@@ -19365,7 +19363,7 @@
                 <w:szCs w:val="17"/>
                 <w:rtl w:val="0"/>
               </w:rPr>
-              <w:t>ClassInstructor hoặc PersonalTrainer ngoài phạm vi -&gt; 403. Entity liên kết PT session/result phải được chốt theo SSOT §7 trước khi triển khai.</w:t>
+              <w:t xml:space="preserve">Coach không có Specialty Personal Training hoặc ngoài phạm vi -&gt; 403. Entity liên kết PT session/result phải được chốt theo SSOT §7 trước khi triển khai.</w:t>
             </w:r>
           </w:p>
         </w:tc>
@@ -20309,7 +20307,7 @@
                 <w:rFonts w:ascii="Times New Roman" w:hAnsi="Times New Roman"/>
                 <w:sz w:val="20"/>
               </w:rPr>
-              <w:t>Member; Receptionist on-behalf; VNPay; Center Manager xử lý ngoại lệ</w:t>
+              <w:t xml:space="preserve">Member; Receptionist on-behalf; VNPay; Center Manager xử lý ngoại lệ</w:t>
             </w:r>
           </w:p>
         </w:tc>
@@ -20453,7 +20451,7 @@
                 <w:rFonts w:ascii="Times New Roman" w:hAnsi="Times New Roman"/>
                 <w:sz w:val="20"/>
               </w:rPr>
-              <w:t>Invoice PendingPayment; amount VND khớp snapshot; actor được phép; PT yêu cầu Membership Active.</w:t>
+              <w:t xml:space="preserve">Invoice Issued còn trong hạn checkout; amount VND khớp snapshot; actor được phép; PT yêu cầu Membership Active; lớp yêu cầu SeatHold còn hạn.</w:t>
             </w:r>
           </w:p>
         </w:tc>
@@ -20525,7 +20523,7 @@
                 <w:rFonts w:ascii="Times New Roman" w:hAnsi="Times New Roman"/>
                 <w:sz w:val="20"/>
               </w:rPr>
-              <w:t>1. Tạo PaymentAttempt/vnp_TxnRef unique và signed VNPay QR. 2. User trả đủ đúng amount trước vnp_ExpireDate. 3. Backend xác minh IPN hoặc QueryDR. 4. Trong một DB transaction tạo Payment Success, chuyển Invoice Paid và fulfillment Membership/PT. 5. Gửi biên nhận qua outbox.</w:t>
+              <w:t xml:space="preserve">1. Member chọn số điểm muốn dùng (tùy chọn); TotalAmount = PointsApplied × 1.000 + CashAmount; dùng điểm hộ cần OTP của Member. 2. Nếu CashAmount &gt; 0, hệ thống tạo PaymentAttempt/vnp_TxnRef unique và signed VNPay QR; thanh toán toàn điểm không tạo attempt. 3. Member trả đủ đúng amount trước vnp_ExpireDate. 4. Backend xác minh IPN hoặc QueryDR. 5. Trong một DB transaction: ghi Payment Success, trừ điểm, chuyển Invoice Paid và cấp quyền lợi (Membership, PT, ghi danh lớp hoặc lượt thuê sân). 6. Gửi biên nhận qua outbox.</w:t>
             </w:r>
           </w:p>
         </w:tc>
@@ -20597,7 +20595,7 @@
                 <w:rFonts w:ascii="Times New Roman" w:hAnsi="Times New Roman"/>
                 <w:sz w:val="20"/>
               </w:rPr>
-              <w:t>ReturnUrl không xác nhận tiền. Callback lặp phải idempotent. Attempt Expired được retry. IPN muộn/QueryDR hợp lệ → PaidAfterReconciliation. Fulfillment lỗi sau khi gateway nhận tiền → ReconciliationRequired.</w:t>
+              <w:t xml:space="preserve">ReturnUrl không xác nhận tiền. Callback lặp phải idempotent. Attempt Expired được retry. SeatHold/điểm hết hạn được nhả đúng một lần. IPN muộn/QueryDR hợp lệ → PaidAfterReconciliation. Fulfillment lỗi sau khi gateway nhận tiền → ReconciliationRequired.</w:t>
             </w:r>
           </w:p>
         </w:tc>
@@ -20692,8 +20690,6 @@
           <w:szCs w:val="26"/>
         </w:rPr>
       </w:pPr>
-      <w:bookmarkStart w:colFirst="0" w:colLast="0" w:name="_bbeu1a8e5jqo" w:id="31"/>
-      <w:bookmarkEnd w:id="31"/>
       <w:r>
         <w:rPr>
           <w:rFonts w:ascii="Times New Roman" w:cs="Times New Roman" w:eastAsia="Times New Roman" w:hAnsi="Times New Roman"/>
@@ -20704,7 +20700,7 @@
           <w:szCs w:val="26"/>
           <w:rtl w:val="0"/>
         </w:rPr>
-        <w:t xml:space="preserve">UC-16 - Xử lý điều chỉnh / hoàn tiền</w:t>
+        <w:t xml:space="preserve">UC-16 - Yêu cầu và xử lý hoàn trả bằng điểm</w:t>
       </w:r>
     </w:p>
     <w:tbl>
@@ -20894,7 +20890,7 @@
                 <w:rFonts w:ascii="Times New Roman" w:hAnsi="Times New Roman"/>
                 <w:sz w:val="20"/>
               </w:rPr>
-              <w:t>Member; Receptionist on-behalf; Center Manager; VNPay backend integration</w:t>
+              <w:t xml:space="preserve">Member; Receptionist on-behalf; Center Manager</w:t>
             </w:r>
           </w:p>
         </w:tc>
@@ -21110,7 +21106,7 @@
                 <w:rFonts w:ascii="Times New Roman" w:hAnsi="Times New Roman"/>
                 <w:sz w:val="20"/>
               </w:rPr>
-              <w:t>1. Member request giao dịch của mình hoặc Receptionist request hộ có lý do. 2. Backend tính eligibility và amount theo InvoiceItem. 3. Center Manager approve/reject, không được tăng amount. 4. Khi approve, backend gọi VNPay Refund API. 5. Chỉ gateway/backend chuyển Completed; lúc đó hủy quyền lợi/booking tương lai và ghi Refunded.</w:t>
+              <w:t xml:space="preserve">1. Member request cho InvoiceItem của mình hoặc Receptionist request hộ có lý do. 2. Backend tính eligibility và số điểm theo InvoiceItem (BR-91, BR-92, BR-122). 3. Center Manager approve/reject, không được nhập số điểm vượt số hệ thống tính. 4. Khi approve, trong một transaction: cộng điểm vào ví và ghi PointLedger, chuyển RefundRequest sang Completed, hủy quyền lợi liên quan cùng ghi danh/buổi PT/lượt thuê tương lai phụ thuộc (BR-93).</w:t>
             </w:r>
           </w:p>
         </w:tc>
@@ -21182,7 +21178,7 @@
                 <w:rFonts w:ascii="Times New Roman" w:hAnsi="Times New Roman"/>
                 <w:sz w:val="20"/>
               </w:rPr>
-              <w:t>Membership còn &gt;=2/3 thời hạn, kể cả chưa StartDate, hoàn 50%; dưới ngưỡng/Expired không hoàn trừ lỗi trung tâm. PT zero consumed hoàn 50%; đã consume không hoàn chuẩn. API failed → Failed/ReconciliationRequired, không cho Receptionist complete thủ công.</w:t>
+              <w:t xml:space="preserve">Membership còn &gt;= 2/3 thời hạn, kể cả chưa StartDate, hoàn 50% giá trị thực trả; dưới ngưỡng/Expired không hoàn trừ lỗi trung tâm. PT chưa consume session nào hoàn 50%; đã consume không hoàn chuẩn. Khóa lớp: trước buổi đầu tiên hoàn 100%; từ buổi đầu tiên không hoàn chuẩn. Hoàn luôn bằng điểm, không gọi VNPay Refund API nên không có trạng thái Processing/Failed do cổng thanh toán; Receptionist không tự cộng điểm. Retry không cộng điểm trùng (ReferenceId duy nhất).</w:t>
             </w:r>
           </w:p>
         </w:tc>
@@ -21254,7 +21250,7 @@
                 <w:rFonts w:ascii="Times New Roman" w:hAnsi="Times New Roman"/>
                 <w:sz w:val="20"/>
               </w:rPr>
-              <w:t>Refund có Audit Log, không vượt số tiền đã thu còn khả dụng; revenue giảm vào ngày Refund Completed.</w:t>
+              <w:t xml:space="preserve">Refund có Audit Log; số điểm hoàn không vượt phần thực trả còn khả dụng của InvoiceItem; điểm không đổi ra tiền mặt.</w:t>
             </w:r>
           </w:p>
         </w:tc>
@@ -21719,7 +21715,7 @@
                 <w:rFonts w:ascii="Times New Roman" w:hAnsi="Times New Roman"/>
                 <w:sz w:val="20"/>
               </w:rPr>
-              <w:t>1. Center Manager chọn membership/class/revenue report. 2. Revenue tổng hợp GrossCollected theo Payment.PaidAt, Refunded theo Refund.CompletedAt và NetCollected = GrossCollected - Refunded. 3. Export theo Reporting rules.</w:t>
+              <w:t xml:space="preserve">1. Center Manager chọn báo cáo theo khoảng thời gian: số hội viên (mới, Active), tình trạng đăng ký từng lớp (Capacity, ghi danh CONFIRMED, SeatHold, ThresholdStatus, tỷ lệ lấp), doanh thu, thuê sân và điểm. 2. Doanh thu theo cash basis (BR-95): CashCollected theo vnp_PayDate của Payment thành công, tách theo môn và theo nguồn (Membership, PT, ClassPackage, CourtRental); PointsRedeemed, PointsIssued và OutstandingPoints báo riêng, không tính là tiền thu mới. 3. Export theo Reporting rules.</w:t>
             </w:r>
           </w:p>
         </w:tc>
@@ -21791,7 +21787,7 @@
                 <w:rFonts w:ascii="Times New Roman" w:hAnsi="Times New Roman"/>
                 <w:sz w:val="20"/>
               </w:rPr>
-              <w:t>Không có dữ liệu → report rỗng hợp lệ. Refund Requested/Approved/Processing chưa làm giảm revenue. System Administrator không tự có quyền xem.</w:t>
+              <w:t xml:space="preserve">Không có dữ liệu → report rỗng hợp lệ. Hoàn trả bằng điểm nên không có khoản Refunded bằng tiền. Invoice chưa thanh toán không tính vào doanh thu. System Administrator không tự có quyền xem.</w:t>
             </w:r>
           </w:p>
         </w:tc>
@@ -23364,7 +23360,7 @@
                 <w:szCs w:val="17"/>
                 <w:rtl w:val="0"/>
               </w:rPr>
-              <w:t>PersonalTrainer; AI System</w:t>
+              <w:t xml:space="preserve">Coach (PT); AI System</w:t>
             </w:r>
           </w:p>
         </w:tc>
@@ -23524,7 +23520,7 @@
                 <w:szCs w:val="17"/>
                 <w:rtl w:val="0"/>
               </w:rPr>
-              <w:t>CoachCategory = PersonalTrainer; Coach-Member relationship ACTIVE; có dữ liệu theo BR-26.</w:t>
+              <w:t xml:space="preserve">Coach có Specialty Personal Training; Coach-Member relationship ACTIVE; có dữ liệu theo BR-26.</w:t>
             </w:r>
           </w:p>
         </w:tc>
@@ -23604,7 +23600,7 @@
                 <w:szCs w:val="17"/>
                 <w:rtl w:val="0"/>
               </w:rPr>
-              <w:t>1. PersonalTrainer chọn Member và yêu cầu suggestion. 2. Backend kiểm tra category/relationship và lấy Goal/Level/history từ server. 3. IAiRecommendationService gửi context tối thiểu. 4. AI trả suggestion. 5. PersonalTrainer review/edit và có thể lưu qua UC-12.</w:t>
+              <w:t xml:space="preserve">1. Coach (PT) chọn Member và yêu cầu suggestion. 2. Backend kiểm tra specialty/relationship và lấy Goal/Level/history từ server. 3. IAiRecommendationService gửi context tối thiểu. 4. AI trả suggestion. 5. Coach (PT) review/edit và có thể lưu qua UC-12.</w:t>
             </w:r>
           </w:p>
         </w:tc>
@@ -23684,7 +23680,7 @@
                 <w:szCs w:val="17"/>
                 <w:rtl w:val="0"/>
               </w:rPr>
-              <w:t>ClassInstructor hoặc Coach không có relationship -&gt; 403. AI timeout/error -&gt; không tạo official plan; PersonalTrainer vẫn có thể tự lập plan.</w:t>
+              <w:t xml:space="preserve">Coach không có Specialty Personal Training hoặc không có relationship -&gt; 403. AI timeout/error -&gt; không tạo official plan; Coach (PT) vẫn có thể tự lập plan.</w:t>
             </w:r>
           </w:p>
         </w:tc>
@@ -24563,7 +24559,7 @@
         </w:rPr>
       </w:pPr>
       <w:r>
-        <w:t>Checkout tạo Invoice/InvoiceItem snapshot → PaymentAttempt VNPay-QR → IPN/QueryDR → transactional fulfillment → email receipt. Refund request theo InvoiceItem → Manager approve/reject → backend gọi VNPay Refund API. Revenue theo ngày thu/hoàn tiền.</w:t>
+        <w:t xml:space="preserve">Checkout tạo Invoice/InvoiceItem snapshot → chọn điểm (tùy chọn) → PaymentAttempt VNPay-QR cho phần tiền còn lại → IPN/QueryDR → transactional fulfillment → email receipt. Refund request theo InvoiceItem → Manager approve/reject → backend cộng điểm vào ví trong cùng transaction (không gọi VNPay Refund API). Doanh thu cash basis theo ngày thu tiền (vnp_PayDate).</w:t>
       </w:r>
     </w:p>
     <w:p>
@@ -24616,7 +24612,7 @@
           <w:szCs w:val="18"/>
           <w:rtl w:val="0"/>
         </w:rPr>
-        <w:t>Receptionist ghi Present/Absent cho cầu lông/bóng rổ. PersonalTrainer quản lý profile được phép, tạo plan, ghi trạng thái/kết quả buổi PT và đánh giá tiến độ. ClassInstructor chỉ xem lịch được phân công và không tham gia Training/Attendance actions.</w:t>
+        <w:t xml:space="preserve">Receptionist ghi Present/Absent cho lớp cầu lông/bóng rổ. Coach (PT) quản lý profile được phép, tạo plan, ghi trạng thái/kết quả buổi PT và đánh giá tiến độ. Coach không phụ trách PT chỉ xem lớp/lịch được phân công và không tham gia Training/Attendance actions.</w:t>
       </w:r>
     </w:p>
     <w:p>
@@ -24669,7 +24665,7 @@
           <w:szCs w:val="18"/>
           <w:rtl w:val="0"/>
         </w:rPr>
-        <w:t>PersonalTrainer chọn Member có quan hệ Active -&gt; backend kiểm tra category/ownership và lấy profile/history -&gt; AI System trả suggestion -&gt; PersonalTrainer review/edit -&gt; lưu official plan nếu phù hợp.</w:t>
+        <w:t xml:space="preserve">Coach (PT) chọn Member có quan hệ Active -&gt; backend kiểm tra specialty/ownership và lấy profile/history -&gt; AI System trả suggestion -&gt; Coach (PT) review/edit -&gt; lưu official plan nếu phù hợp.</w:t>
       </w:r>
     </w:p>
     <w:p>

</xml_diff>

<commit_message>
docs: manager noti issue
</commit_message>
<xml_diff>
--- a/docs/SWP391_Report_SRS.docx
+++ b/docs/SWP391_Report_SRS.docx
@@ -15537,7 +15537,7 @@
                 <w:rFonts w:ascii="Times New Roman" w:hAnsi="Times New Roman"/>
                 <w:sz w:val="20"/>
               </w:rPr>
-              <w:t xml:space="preserve">1. Manager tạo lớp (khóa nhiều buổi) cầu lông hoặc bóng rổ: Code, Sport, Coach phụ trách, Room, ngày bắt đầu, số buổi, lịch lặp theo tuần, Capacity và Price. 2. Thời lượng buổi lấy từ cấu hình của Sport: EndTime = StartTime + thời lượng (BR-13); Capacity &gt; 0 và không vượt mức tối đa của Sport (BR-51). 3. Hệ thống kiểm tra từng buổi qua occupancy: Coach và Room không giao với buổi lớp, buổi PT hoặc lượt thuê khác và nằm trong giờ hoạt động (BR-112). 4. Manager publish để mở ghi danh (DRAFT → PUBLISHED); lớp sang IN_PROGRESS rồi COMPLETED theo lịch, hoặc CANCELLED (BR-67). 5. Manager dời/hủy từng buổi theo BR-54: ghi danh giữ nguyên hiệu lực, buổi bị hủy được bù, hệ thống email Coach và học viên. 6. Đến thời điểm chốt, job so sánh ghi danh CONFIRMED với BreakEvenThreshold: đạt thì ThresholdStatus = Met; chưa đạt thì AtRisk, học viên được email để chọn chuyển lớp hoặc hoàn điểm (BR-119, BR-120). 7. Khi có sự cố, Manager tạo Incident Notice (phạm vi, lý do): khung giờ bị khóa, các bên bị ảnh hưởng được email, lượt thuê bị ảnh hưởng tự hủy và hoàn 100% bằng điểm.</w:t>
+              <w:t xml:space="preserve">1. Manager tạo lớp (khóa nhiều buổi) cầu lông hoặc bóng rổ: Code, Sport, Coach phụ trách, Room, ngày bắt đầu, số buổi, lịch lặp theo tuần, Capacity và Price. 2. Thời lượng buổi lấy từ cấu hình của Sport: EndTime = StartTime + thời lượng (BR-13); Capacity &gt; 0 và không vượt mức tối đa của Sport (BR-51). 3. Hệ thống kiểm tra từng buổi qua occupancy: Coach và Room không giao với buổi lớp, buổi PT hoặc lượt thuê khác và nằm trong giờ hoạt động (BR-112). 4. Manager publish để mở ghi danh (DRAFT → PUBLISHED); lớp sang IN_PROGRESS rồi COMPLETED theo lịch, hoặc CANCELLED (BR-67). 5. Manager dời/hủy từng buổi theo BR-54: ghi danh giữ nguyên hiệu lực, buổi bị hủy được bù, hệ thống email Coach và học viên. 6. Đến thời điểm chốt, job so sánh ghi danh CONFIRMED với BreakEvenThreshold: đạt thì ThresholdStatus = Met; chưa đạt thì AtRisk, học viên được email để chọn chuyển lớp hoặc hoàn điểm (BR-119, BR-120). 7. Khi có sự cố (kể cả hỏng/sửa chữa phòng Gym), Manager tạo Incident Notice (phạm vi, lý do): khung giờ bị khóa; Coach, người thuê sân, học viên lớp bị ảnh hưởng và Member có Membership Gym Active được email; lượt thuê bị ảnh hưởng tự hủy và hoàn 100% bằng điểm; buổi lớp bị ảnh hưởng được bù vào lịch tiếp theo (BR-54); Membership Gym Active được gia hạn EndDate thêm số ngày Gym đóng cửa sửa chữa (BR-130).</w:t>
             </w:r>
           </w:p>
         </w:tc>
@@ -21178,7 +21178,7 @@
                 <w:rFonts w:ascii="Times New Roman" w:hAnsi="Times New Roman"/>
                 <w:sz w:val="20"/>
               </w:rPr>
-              <w:t xml:space="preserve">Membership còn &gt;= 2/3 thời hạn, kể cả chưa StartDate, hoàn 50% giá trị thực trả; dưới ngưỡng/Expired không hoàn trừ lỗi trung tâm. PT chưa consume session nào hoàn 50%; đã consume không hoàn chuẩn. Khóa lớp: trước buổi đầu tiên hoàn 100%; từ buổi đầu tiên không hoàn chuẩn. Hoàn luôn bằng điểm, không gọi VNPay Refund API nên không có trạng thái Processing/Failed do cổng thanh toán; Receptionist không tự cộng điểm. Retry không cộng điểm trùng (ReferenceId duy nhất).</w:t>
+              <w:t xml:space="preserve">Membership còn &gt;= 2/3 thời hạn, kể cả chưa StartDate (gói gia hạn sớm), hoàn chuẩn tối đa 50% giá trị thực trả; dưới ngưỡng/Expired không hoàn. Sự cố tạm thời của trung tâm không phải căn cứ hoàn: Gym được bù bằng gia hạn Membership, lớp được bù buổi (UC-07, BR-130); chỉ vấn đề khác khiến trung tâm không thể cung cấp dịch vụ mới xét ngoại lệ do Manager phê duyệt, tính theo phần chưa dùng. PT chưa consume session nào hoàn 50%; đã consume không hoàn chuẩn. Khóa lớp: trước buổi đầu tiên hoàn 100%; từ buổi đầu tiên không hoàn chuẩn. Hoàn luôn bằng điểm, không gọi VNPay Refund API nên không có trạng thái Processing/Failed do cổng thanh toán; Receptionist không tự cộng điểm. Retry không cộng điểm trùng (ReferenceId duy nhất).</w:t>
             </w:r>
           </w:p>
         </w:tc>

</xml_diff>

<commit_message>
docs: new business rule for coach
</commit_message>
<xml_diff>
--- a/docs/SWP391_Report_SRS.docx
+++ b/docs/SWP391_Report_SRS.docx
@@ -1318,7 +1318,7 @@
                 <w:rFonts w:ascii="Times New Roman" w:hAnsi="Times New Roman"/>
                 <w:sz w:val="20"/>
               </w:rPr>
-              <w:t xml:space="preserve">Quản trị phần mềm: tạo tài khoản System Administrator/Center Manager/Receptionist, gán và đổi vai trò, quản lý trạng thái tài khoản (BR-18); quyền Audit ngoài identity chưa được cấp mặc định. Không quản lý lớp, gói tập hay quyết định kinh doanh.</w:t>
+              <w:t xml:space="preserve">Quản trị phần mềm: tạo tài khoản nhân sự (System Administrator/Center Manager/Receptionist/Coach kèm CoachSpecialty, có email kích hoạt), gán và đổi vai trò giữa các vai trò nhân sự, quản lý trạng thái tài khoản (BR-18); quyền Audit ngoài identity chưa được cấp mặc định. Không quản lý lớp, gói tập hay quyết định kinh doanh.</w:t>
             </w:r>
           </w:p>
         </w:tc>
@@ -1389,7 +1389,7 @@
                 <w:rFonts w:ascii="Times New Roman" w:hAnsi="Times New Roman"/>
                 <w:sz w:val="20"/>
               </w:rPr>
-              <w:t xml:space="preserve">Quản lý vận hành Membership, môn/phòng/giá, lớp nhiều buổi và lịch, phân công Coach theo chuyên môn, ngưỡng lớp và sự cố; tạo và quản lý tài khoản Coach kèm CoachSpecialty (BR-18, BR-96); xem báo cáo và Audit Log; approve/reject Refund và xử lý ngoại lệ Payment. Không được vượt số điểm Refund hệ thống tính.</w:t>
+              <w:t xml:space="preserve">Quản lý vận hành Membership, môn/phòng/giá, lớp nhiều buổi và lịch, phân công Coach theo chuyên môn, ngưỡng lớp và sự cố; sửa hồ sơ, chuyên môn của Coach và cấp quyền dịch vụ PT (BR-18, BR-96), không tạo tài khoản Coach; xem báo cáo và Audit Log; approve/reject Refund và xử lý ngoại lệ Payment. Không được vượt số điểm Refund hệ thống tính.</w:t>
             </w:r>
           </w:p>
         </w:tc>
@@ -8564,7 +8564,7 @@
                 <w:szCs w:val="15"/>
                 <w:rtl w:val="0"/>
               </w:rPr>
-              <w:t xml:space="preserve">System Administrator; Center Manager (chỉ tài khoản Coach)</w:t>
+              <w:t xml:space="preserve">System Administrator; Center Manager (chỉ sửa hồ sơ/chuyên môn Coach, cấp quyền dịch vụ PT)</w:t>
             </w:r>
           </w:p>
         </w:tc>
@@ -13374,7 +13374,7 @@
                 <w:szCs w:val="17"/>
                 <w:rtl w:val="0"/>
               </w:rPr>
-              <w:t xml:space="preserve">System Administrator; Center Manager (chỉ tài khoản Coach)</w:t>
+              <w:t xml:space="preserve">System Administrator; Center Manager (chỉ sửa hồ sơ/chuyên môn Coach, cấp quyền dịch vụ PT)</w:t>
             </w:r>
           </w:p>
         </w:tc>
@@ -13614,7 +13614,7 @@
                 <w:szCs w:val="17"/>
                 <w:rtl w:val="0"/>
               </w:rPr>
-              <w:t xml:space="preserve">1. Admin mở danh sách tài khoản nội bộ. 2. Admin tạo tài khoản System Administrator, Center Manager hoặc Receptionist, gán/đổi vai trò hợp lệ (BR-18); mỗi tài khoản đúng một vai trò. 3. Center Manager tạo và quản lý tài khoản Coach kèm ít nhất một CoachSpecialty (BR-96), không gán hoặc đổi vai trò. 4. Admin thay đổi status ACTIVE/BANNED/DEACTIVATED. 5. Hệ thống ghi Audit Log cho thay đổi nhạy cảm.</w:t>
+              <w:t xml:space="preserve">1. Admin mở danh sách tài khoản nội bộ. 2. Admin tạo tài khoản nhân sự (System Administrator, Center Manager, Receptionist hoặc Coach kèm ít nhất một CoachSpecialty, BR-96); tài khoản không có mật khẩu và nhận email kích hoạt (link dùng một lần, 24 giờ) để tự đặt mật khẩu. 3. Admin đổi vai trò chỉ giữa các vai trò nhân sự (BR-18, BR-142); mỗi tài khoản đúng một vai trò. 4. Center Manager chỉ sửa hồ sơ, chuyên môn của Coach và cấp quyền dịch vụ PT; không tạo Coach, không gán hoặc đổi vai trò. 5. Admin thay đổi status ACTIVE/BANNED/DEACTIVATED. 6. Hệ thống ghi Audit Log cho thay đổi nhạy cảm.</w:t>
             </w:r>
           </w:p>
         </w:tc>
@@ -13694,7 +13694,7 @@
                 <w:szCs w:val="17"/>
                 <w:rtl w:val="0"/>
               </w:rPr>
-              <w:t xml:space="preserve">Không cho tạo Coach không có CoachSpecialty hợp lệ. Không cho Admin tự ý sửa dữ liệu nghiệp vụ của role. Không tạo AI System thành user account.</w:t>
+              <w:t xml:space="preserve">Không cho tạo Coach không có CoachSpecialty hợp lệ. Không đổi Member thành nhân sự hoặc ngược lại (409 member_staff_role_change_not_allowed); người muốn làm nhân sự dùng email khác. Chặn Coach rời vai trò khi còn lớp, lịch tương lai hoặc quan hệ huấn luyện Active; khi đổi vai trò hợp lệ, xóa chuyên môn và quyền dịch vụ PT. Không cho Admin tự ý sửa dữ liệu nghiệp vụ của role. Không tạo AI System thành user account.</w:t>
             </w:r>
           </w:p>
         </w:tc>
@@ -13854,7 +13854,7 @@
                 <w:szCs w:val="17"/>
                 <w:rtl w:val="0"/>
               </w:rPr>
-              <w:t>Đây là revision so với thiết kế hệ thống cũ, nơi một số endpoint/rule còn gán cho Manager.</w:t>
+              <w:t>Cập nhật 12/10/2026 (BR-2, BR-96, BR-142): Admin là người duy nhất tạo tài khoản nhân sự kể cả Coach; Manager không tạo Coach.</w:t>
             </w:r>
           </w:p>
         </w:tc>
@@ -15537,7 +15537,7 @@
                 <w:rFonts w:ascii="Times New Roman" w:hAnsi="Times New Roman"/>
                 <w:sz w:val="20"/>
               </w:rPr>
-              <w:t xml:space="preserve">1. Manager tạo lớp (khóa nhiều buổi) cầu lông hoặc bóng rổ: Code, Sport, Coach phụ trách, Room, ngày bắt đầu, số buổi, lịch lặp theo tuần, Capacity và Price. 2. Thời lượng buổi lấy từ cấu hình của Sport: EndTime = StartTime + thời lượng (BR-13); Capacity &gt; 0 và không vượt mức tối đa của Sport (BR-51). 3. Hệ thống kiểm tra từng buổi qua occupancy: Coach và Room không giao với buổi lớp, buổi PT hoặc lượt thuê khác và nằm trong giờ hoạt động (BR-112). 4. Manager publish để mở ghi danh (DRAFT → PUBLISHED); lớp sang IN_PROGRESS rồi COMPLETED theo lịch, hoặc CANCELLED (BR-67). 5. Manager dời/hủy từng buổi theo BR-54: ghi danh giữ nguyên hiệu lực, buổi bị hủy được bù, hệ thống email Coach và học viên. 6. Đến thời điểm chốt, job so sánh ghi danh CONFIRMED với BreakEvenThreshold: đạt thì ThresholdStatus = Met; chưa đạt thì AtRisk, học viên được email để chọn chuyển lớp hoặc hoàn điểm (BR-119, BR-120). 7. Khi có sự cố (kể cả hỏng/sửa chữa phòng Gym), Manager tạo Incident Notice (phạm vi, lý do): khung giờ bị khóa; Coach, người thuê sân, học viên lớp bị ảnh hưởng và Member có Membership Gym Active được email; lượt thuê bị ảnh hưởng tự hủy và hoàn 100% bằng điểm; buổi lớp bị ảnh hưởng được bù vào lịch tiếp theo (BR-54); Membership Gym Active được gia hạn EndDate thêm số ngày Gym đóng cửa sửa chữa (BR-130).</w:t>
+              <w:t xml:space="preserve">1. Manager tạo lớp (khóa nhiều buổi) cầu lông hoặc bóng rổ: Code, Sport, Coach phụ trách (chọn từ Coach do Admin tạo, đúng chuyên môn, BR-96), Room, ngày bắt đầu, số buổi, lịch lặp theo tuần, Capacity và Price. 2. Thời lượng buổi lấy từ cấu hình của Sport: EndTime = StartTime + thời lượng (BR-13); Capacity &gt; 0 và không vượt mức tối đa của Sport (BR-51). 3. Hệ thống kiểm tra từng buổi qua occupancy: Coach và Room không giao với buổi lớp, buổi PT hoặc lượt thuê khác và nằm trong giờ hoạt động (BR-112). 4. Manager publish để mở ghi danh (DRAFT → PUBLISHED); lớp sang IN_PROGRESS rồi COMPLETED theo lịch, hoặc CANCELLED (BR-67). 5. Manager dời/hủy từng buổi theo BR-54: ghi danh giữ nguyên hiệu lực, buổi bị hủy được bù, hệ thống email Coach và học viên. 6. Đến thời điểm chốt, job so sánh ghi danh CONFIRMED với BreakEvenThreshold: đạt thì ThresholdStatus = Met; chưa đạt thì AtRisk, học viên được email để chọn chuyển lớp hoặc hoàn điểm (BR-119, BR-120). 7. Khi có sự cố (kể cả hỏng/sửa chữa phòng Gym), Manager tạo Incident Notice (phạm vi, lý do): khung giờ bị khóa; Coach, người thuê sân, học viên lớp bị ảnh hưởng và Member có Membership Gym Active được email; lượt thuê bị ảnh hưởng tự hủy và hoàn 100% bằng điểm; buổi lớp bị ảnh hưởng được bù vào lịch tiếp theo (BR-54); Membership Gym Active được gia hạn EndDate thêm số ngày Gym đóng cửa sửa chữa (BR-130).</w:t>
             </w:r>
           </w:p>
         </w:tc>
@@ -21178,7 +21178,7 @@
                 <w:rFonts w:ascii="Times New Roman" w:hAnsi="Times New Roman"/>
                 <w:sz w:val="20"/>
               </w:rPr>
-              <w:t xml:space="preserve">Membership còn &gt;= 2/3 thời hạn, kể cả chưa StartDate (gói gia hạn sớm), hoàn chuẩn tối đa 50% giá trị thực trả; dưới ngưỡng/Expired không hoàn. Sự cố tạm thời của trung tâm không phải căn cứ hoàn: Gym được bù bằng gia hạn Membership, lớp được bù buổi (UC-07, BR-130); chỉ vấn đề khác khiến trung tâm không thể cung cấp dịch vụ mới xét ngoại lệ do Manager phê duyệt, tính theo phần chưa dùng. PT chưa consume session nào hoàn 50%; đã consume không hoàn chuẩn. Khóa lớp: trước buổi đầu tiên hoàn 100%; từ buổi đầu tiên không hoàn chuẩn. Hoàn luôn bằng điểm, không gọi VNPay Refund API nên không có trạng thái Processing/Failed do cổng thanh toán; Receptionist không tự cộng điểm. Retry không cộng điểm trùng (ReferenceId duy nhất).</w:t>
+              <w:t xml:space="preserve">Membership còn &gt;= 2/3 thời hạn, kể cả chưa StartDate (gói gia hạn sớm), hoàn chuẩn tối đa 50% giá trị thực trả; dưới ngưỡng/Expired không hoàn. Sự cố tạm thời của trung tâm không phải căn cứ hoàn: Gym được bù bằng gia hạn Membership, lớp được bù buổi (UC-07, BR-130); chỉ vấn đề khác khiến trung tâm không thể cung cấp dịch vụ mới xét ngoại lệ (Center Fault) do Manager phê duyệt: Membership hoàn theo ngày còn lại / tổng ngày, PT theo buổi chưa dùng / TotalQuota, không hoàn 100% (BR-91). PT chưa consume session nào hoàn 50%; đã consume không hoàn chuẩn. Khóa lớp: trước buổi đầu tiên hoàn 100%; từ buổi đầu tiên không hoàn chuẩn. Hoàn luôn bằng điểm, không gọi VNPay Refund API nên không có trạng thái Processing/Failed do cổng thanh toán; Receptionist không tự cộng điểm. Retry không cộng điểm trùng (ReferenceId duy nhất).</w:t>
             </w:r>
           </w:p>
         </w:tc>

</xml_diff>

<commit_message>
feat(training): retain completed class history and align Flow 4 rules
Keep member access to completed class content and sessions while enrollment is active. Document Coach homework, attendance, class training, absence workflow, and PT removal across current requirements and Word sources. Include the existing business-rule review and remove the outdated completion note.
</commit_message>
<xml_diff>
--- a/docs/SWP391_Report_SRS.docx
+++ b/docs/SWP391_Report_SRS.docx
@@ -1107,7 +1107,7 @@
         </w:rPr>
       </w:pPr>
       <w:r>
-        <w:t>SportHub là hệ thống quản lý trung tâm thể thao với ba môn Gym (bao gồm dịch vụ huấn luyện cá nhân PT), cầu lông và bóng rổ; có thể mở rộng thêm môn trong tương lai. PT là dịch vụ thuộc Gym, không phải môn thứ tư. Phạm vi gồm tài khoản, Membership Gym, PT, khóa học cầu lông/bóng rổ, lịch và điểm danh, thuê sân, VNPay/điểm, invoice/refund điểm, tập luyện, thông báo và báo cáo.</w:t>
+        <w:t>SportHub quản lý ba môn Gym, cầu lông và bóng rổ, có thể mở rộng thêm môn. Phạm vi hiện hành không quản lý PT 1:1; những đoạn đặc tả gói, quota và booking PT trong bản SRS cũ chỉ được giữ làm lịch sử. Flow 4 áp dụng cho lớp cầu lông/bóng rổ: Coach được phân công ghi workout plan/result, nhận xét, homework và điểm danh đúng buổi; AI gợi ý thuộc Flow 5. JWT xác định Coach, còn classId/sessionId xác định lớp hoặc buổi để backend kiểm tra phân công.</w:t>
       </w:r>
     </w:p>
     <w:p>
@@ -1389,7 +1389,7 @@
                 <w:rFonts w:ascii="Times New Roman" w:hAnsi="Times New Roman"/>
                 <w:sz w:val="20"/>
               </w:rPr>
-              <w:t xml:space="preserve">Quản lý vận hành Membership, môn/phòng/giá, lớp nhiều buổi và lịch, phân công Coach theo chuyên môn, ngưỡng lớp và sự cố; sửa hồ sơ, chuyên môn của Coach và cấp quyền dịch vụ PT (BR-18, BR-96), không tạo tài khoản Coach; xem báo cáo và Audit Log; approve/reject Refund và xử lý ngoại lệ Payment. Không được vượt số điểm Refund hệ thống tính.</w:t>
+              <w:t xml:space="preserve">Quản lý vận hành Membership, môn/phòng/giá, lớp nhiều buổi và lịch; phân công Coach theo chuyên môn, xử lý báo vắng, dạy thay hoặc dời buổi; quản lý ngưỡng lớp, sự cố, hoàn điểm, báo cáo và Audit Log. Không tạo tài khoản Coach hoặc quản lý dịch vụ PT 1:1.</w:t>
             </w:r>
           </w:p>
         </w:tc>
@@ -1467,7 +1467,7 @@
                 <w:szCs w:val="17"/>
                 <w:rtl w:val="0"/>
               </w:rPr>
-              <w:t xml:space="preserve">Một role; mỗi Coach có ít nhất một CoachSpecialty và có thể có nhiều chuyên môn (BR-96). Coach xem lớp/buổi được phân công kèm danh sách học viên của lớp (họ tên, tình trạng điểm danh) theo BR-97; không tự tạo, sửa, hủy hay publish lớp. Coach (PT) — Coach có Specialty Personal Training — xem lịch PT và học viên được phân công, quản lý plan/result/progress và yêu cầu AI trong quan hệ huấn luyện Active (BR-99). Coach không xem thanh toán, Invoice, ví điểm hay hồ sơ chi tiết Member ngoài quan hệ Active.</w:t>
+              <w:t xml:space="preserve">Mỗi Coach có ít nhất một chuyên môn và có thể dạy nhiều môn. Coach xem lớp/buổi được phân công, tạo workout plan cho lớp hoặc học viên, ghi workout result/nhận xét, giao homework và điểm danh đúng buổi. Coach có thể dùng AI gợi ý trong Flow 5 và kiểm tra trước khi lưu. Coach dạy thay chỉ có quyền theo buổi được giao; không xem thanh toán, ví điểm hay hồ sơ học viên ngoài phạm vi.</w:t>
             </w:r>
           </w:p>
         </w:tc>
@@ -1538,7 +1538,7 @@
                 <w:rFonts w:ascii="Times New Roman" w:hAnsi="Times New Roman"/>
                 <w:sz w:val="20"/>
               </w:rPr>
-              <w:t xml:space="preserve">Tự đăng ký bằng email OTP hoặc đăng nhập Google (không có bước onboarding; đặt mật khẩu sau bằng OTP trong Cài đặt tài khoản hoặc Quên mật khẩu, BR-60/BR-103); mua Membership, PT, khóa lớp và thuê sân; thanh toán bằng điểm và/hoặc VNPay-QR; xem Invoice, ví điểm; tạo Refund Request (hoàn bằng điểm) cho giao dịch của mình.</w:t>
+              <w:t xml:space="preserve">Tự đăng ký hoặc đăng nhập Google; mua Membership, khóa lớp và thuê sân; thanh toán bằng điểm và/hoặc VNPay-QR; xem hóa đơn, ví điểm, lịch lớp, kế hoạch, kết quả và bài tập Coach gửi; tạo yêu cầu hoàn điểm theo quyền. Không có gói PT 1:1 trong phạm vi hiện hành.</w:t>
             </w:r>
           </w:p>
         </w:tc>
@@ -1609,7 +1609,7 @@
                 <w:rFonts w:ascii="Times New Roman" w:hAnsi="Times New Roman"/>
                 <w:sz w:val="20"/>
               </w:rPr>
-              <w:t xml:space="preserve">Tạo Member tại quầy; Gym check-in/out (BR-64); checkout hộ Member (dùng điểm hộ cần OTP của Member); ghi Present/Absent cho lớp cầu lông/bóng rổ; yêu cầu đối soát/fulfillment lại; tạo Refund hộ có lý do. Không tự đánh dấu Paid, không tự cộng điểm hoặc Refund Completed.</w:t>
+              <w:t xml:space="preserve">Tạo Member tại quầy; Gym check-in/out; checkout hộ Member (dùng điểm hộ cần OTP); ghi Present/Absent cho lớp cầu lông/bóng rổ cùng với Coach được phân công đúng buổi; hỗ trợ đối soát/fulfillment lại và tạo yêu cầu hoàn hộ. Không tự đánh dấu Paid, cộng điểm hoặc duyệt hoàn.</w:t>
             </w:r>
           </w:p>
         </w:tc>
@@ -2350,7 +2350,7 @@
                 <w:szCs w:val="17"/>
                 <w:rtl w:val="0"/>
               </w:rPr>
-              <w:t xml:space="preserve">Receptionist điểm danh lớp cầu lông/bóng rổ. Coach (PT) quản lý PT entitlement/session, training profile được phép, workout plan, result, homework và progress.</w:t>
+              <w:t xml:space="preserve">Coach lớp cầu lông/bóng rổ tạo workout plan, workout result, nhận xét và homework cho học viên được phân công; Receptionist hoặc Coach được phân công điểm danh đúng buổi. Không quản lý PT 1:1.</w:t>
             </w:r>
           </w:p>
         </w:tc>
@@ -16753,7 +16753,7 @@
                 <w:szCs w:val="17"/>
                 <w:rtl w:val="0"/>
               </w:rPr>
-              <w:t xml:space="preserve">1. Coach mở lịch của mình. 2. Backend lấy CoachId từ token và chỉ trả lớp/buổi có CoachId bằng UserId của chính Coach (BR-97): bộ môn, ngày/giờ, Room, trạng thái và danh sách học viên của lớp (họ tên, tình trạng điểm danh). 3. Coach (PT) còn thấy lịch PT và học viên được phân công theo quan hệ huấn luyện Active (BR-99).</w:t>
+              <w:t xml:space="preserve">Coach mở lịch của mình. Backend lấy danh tính Coach từ JWT và chỉ trả lớp hoặc buổi đang được phân công. Buổi dạy thay hiển thị cho Coach thay trong phạm vi buổi đó; không tự cấp quyền xem toàn bộ lớp hay hồ sơ sức khỏe học viên. classId/sessionId là ID tài nguyên để kiểm tra phân công, không phải mã xác thực.</w:t>
             </w:r>
           </w:p>
         </w:tc>
@@ -17146,7 +17146,7 @@
                 <w:szCs w:val="17"/>
                 <w:rtl w:val="0"/>
               </w:rPr>
-              <w:t xml:space="preserve">Receptionist; Coach (PT) cho buổi PT</w:t>
+              <w:t xml:space="preserve">Receptionist hoặc Coach được phân công đúng buổi lớp nhóm</w:t>
             </w:r>
           </w:p>
         </w:tc>
@@ -17386,7 +17386,7 @@
                 <w:szCs w:val="17"/>
                 <w:rtl w:val="0"/>
               </w:rPr>
-              <w:t xml:space="preserve">1. Receptionist mở roster/check-in của lớp cầu lông/bóng rổ. 2. Chọn Enrollment hợp lệ. 3. Ghi PRESENT hoặc ABSENT. 4. Hệ thống lưu Attendance và actor/time. Với PT, Coach (PT) ghi trạng thái buổi theo entity PT session được đặc tả; Coach không có action điểm danh lớp nhóm.</w:t>
+              <w:t xml:space="preserve">Receptionist hoặc Coach được phân công mở roster của buổi lớp cầu lông/bóng rổ, chọn Enrollment CONFIRMED và ghi PRESENT hoặc ABSENT. Hệ thống lưu Attendance, người thao tác, thời gian và audit khi sửa. Backend kiểm tra CoachId của buổi từ sessionId cùng danh tính trong JWT.</w:t>
             </w:r>
           </w:p>
         </w:tc>
@@ -17466,7 +17466,7 @@
                 <w:szCs w:val="17"/>
                 <w:rtl w:val="0"/>
               </w:rPr>
-              <w:t xml:space="preserve">Không có Attendance lớp nếu Member không có Enrollment. Coach hoặc Manager gọi action điểm danh lớp nhóm -&gt; 403. NO_SHOW do job tạo sau EndAtUtc theo rule.</w:t>
+              <w:t xml:space="preserve">Không ghi Attendance nếu Member không có Enrollment CONFIRMED hoặc Coach không được phân công buổi đó. Coach ngoài phạm vi và Manager không có quyền điểm danh trả 403; sau cửa sổ sửa 24 giờ trả lỗi theo hợp đồng API.</w:t>
             </w:r>
           </w:p>
         </w:tc>

</xml_diff>

<commit_message>
Set checkout hold to 10-30 minutes and align Flow 4 docs
Centralize hold validation, normalize legacy settings, update Manager form, and add focused policy tests.

Align Flow 4 and Coach absence specifications with the approved request and access rules; remove the temporary alignment plan.
</commit_message>
<xml_diff>
--- a/docs/SWP391_Report_SRS.docx
+++ b/docs/SWP391_Report_SRS.docx
@@ -781,11 +781,7 @@
         </w:rPr>
       </w:pPr>
       <w:r>
-        <w:rPr>
-          <w:rFonts w:ascii="Times New Roman" w:cs="Times New Roman" w:eastAsia="Times New Roman" w:hAnsi="Times New Roman"/>
-          <w:rtl w:val="0"/>
-        </w:rPr>
-        <w:t xml:space="preserve">Five account roles: System Administrator, Center Manager, Coach, Member and Receptionist. Guest is not an account role. A Coach holds at least one CoachSpecialty (several are allowed), each linked to a Sport; a Coach with the Personal Training specialty, written Coach (PT), runs PT. PT is a Gym service.</w:t>
+        <w:t>Five account roles: System Administrator, Center Manager, Coach, Member and Receptionist. Guest is not an account role. A Coach has at least one sport specialty and may teach multiple sports. The current product has no one-to-one PT service; Coaches teach assigned badminton or basketball classes.</w:t>
       </w:r>
     </w:p>
     <w:p>
@@ -980,11 +976,7 @@
         </w:rPr>
       </w:pPr>
       <w:r>
-        <w:rPr>
-          <w:rFonts w:ascii="Times New Roman" w:cs="Times New Roman" w:eastAsia="Times New Roman" w:hAnsi="Times New Roman"/>
-          <w:rtl w:val="0"/>
-        </w:rPr>
-        <w:t xml:space="preserve">Five account roles: System Administrator, Center Manager, Coach, Member and Receptionist. Guest is not an account role. A Coach holds at least one CoachSpecialty (several are allowed), each linked to a Sport; a Coach with the Personal Training specialty, written Coach (PT), runs PT. PT is a Gym service.</w:t>
+        <w:t>Five account roles: System Administrator, Center Manager, Coach, Member and Receptionist. Guest is not an account role. A Coach has at least one sport specialty and may teach multiple sports. The current product has no one-to-one PT service; Coaches teach assigned badminton or basketball classes.</w:t>
       </w:r>
     </w:p>
     <w:p>
@@ -2756,7 +2748,7 @@
         </w:rPr>
       </w:pPr>
       <w:r>
-        <w:t xml:space="preserve">SportHub is a centralized system for one center. Five user roles use the web client. A Coach's CoachSpecialty set decides which Sports they may teach and whether they run PT, without adding a role. AI System is an optional external actor. Payment uses VNPay Sandbox/VNPay-QR; email supports OTP and Invoice/Paid/Refund notifications through a background/outbox flow.</w:t>
+        <w:t>SportHub is a centralized system for one center. Five user roles use the web client. A Coach's CoachSpecialty set decides which Sports they may teach and which group classes they may teach, without adding a role. AI System is an optional external actor. Payment uses VNPay Sandbox/VNPay-QR; email supports OTP and Invoice/Paid/Refund notifications through a background/outbox flow.</w:t>
       </w:r>
     </w:p>
     <w:p>
@@ -3656,11 +3648,7 @@
         </w:rPr>
       </w:pPr>
       <w:r>
-        <w:rPr>
-          <w:rFonts w:ascii="Times New Roman" w:cs="Times New Roman" w:eastAsia="Times New Roman" w:hAnsi="Times New Roman"/>
-          <w:rtl w:val="0"/>
-        </w:rPr>
-        <w:t xml:space="preserve">The AI System is an external actor. SportHub sends only the input that the backend retrieves from MemberTrainingProfile, workout history and an Active Coach-Member relationship. Only a Coach (PT) with an Active relationship may request workout suggestions. AI provides suggestions and cannot modify Payment, Membership, Schedule or official Workout Plan data directly.</w:t>
+        <w:t>The AI System is an external actor. Flow 5 may suggest training content using only the data a Coach is permitted to read for an assigned student. The Coach reviews the suggestion before saving an official class plan or result; AI cannot modify Payment, Membership or Schedule directly.</w:t>
       </w:r>
     </w:p>
     <w:p>
@@ -6365,7 +6353,7 @@
         </w:rPr>
       </w:pPr>
       <w:r>
-        <w:t>Correctness-critical constraints include case-insensitive unique Email, OTP controls, atomic Capacity reservation, Membership/PT validity, Coach category and ownership checks, unique gateway references, at most one successful Payment per Invoice, idempotent IPN/QueryDR, transactional fulfillment and cash-basis revenue.</w:t>
+        <w:t>Correctness-critical constraints include case-insensitive unique Email, OTP controls, atomic Capacity reservation, Membership validity and Coach class/session assignment checks, unique gateway references, at most one successful Payment per Invoice, idempotent IPN/QueryDR, transactional fulfillment and cash-basis revenue.</w:t>
       </w:r>
     </w:p>
     <w:p>
@@ -9458,13 +9446,7 @@
               </w:rPr>
             </w:pPr>
             <w:r>
-              <w:rPr>
-                <w:rFonts w:ascii="Times New Roman" w:cs="Times New Roman" w:eastAsia="Times New Roman" w:hAnsi="Times New Roman"/>
-                <w:sz w:val="20"/>
-                <w:szCs w:val="15"/>
-                <w:rtl w:val="0"/>
-              </w:rPr>
-              <w:t xml:space="preserve">Receptionist; Coach (PT) cho buổi PT</w:t>
+              <w:t>Receptionist; Coach được phân công đúng buổi lớp nhóm</w:t>
             </w:r>
           </w:p>
         </w:tc>
@@ -9608,13 +9590,7 @@
               </w:rPr>
             </w:pPr>
             <w:r>
-              <w:rPr>
-                <w:rFonts w:ascii="Times New Roman" w:cs="Times New Roman" w:eastAsia="Times New Roman" w:hAnsi="Times New Roman"/>
-                <w:sz w:val="20"/>
-                <w:szCs w:val="15"/>
-                <w:rtl w:val="0"/>
-              </w:rPr>
-              <w:t xml:space="preserve">Member self; Coach (PT) authorized</w:t>
+              <w:t>Member tự khai; Coach chủ nhiệm lớp đang phụ trách chỉ đọc</w:t>
             </w:r>
           </w:p>
         </w:tc>
@@ -9758,13 +9734,7 @@
               </w:rPr>
             </w:pPr>
             <w:r>
-              <w:rPr>
-                <w:rFonts w:ascii="Times New Roman" w:cs="Times New Roman" w:eastAsia="Times New Roman" w:hAnsi="Times New Roman"/>
-                <w:sz w:val="20"/>
-                <w:szCs w:val="15"/>
-                <w:rtl w:val="0"/>
-              </w:rPr>
-              <w:t xml:space="preserve">Coach (PT)</w:t>
+              <w:t>Coach chủ nhiệm lớp; Coach dạy thay chỉ trong buổi được giao</w:t>
             </w:r>
           </w:p>
         </w:tc>
@@ -9908,13 +9878,7 @@
               </w:rPr>
             </w:pPr>
             <w:r>
-              <w:rPr>
-                <w:rFonts w:ascii="Times New Roman" w:cs="Times New Roman" w:eastAsia="Times New Roman" w:hAnsi="Times New Roman"/>
-                <w:sz w:val="20"/>
-                <w:szCs w:val="15"/>
-                <w:rtl w:val="0"/>
-              </w:rPr>
-              <w:t xml:space="preserve">Coach (PT)</w:t>
+              <w:t>Coach được phân công buổi lớp nhóm</w:t>
             </w:r>
           </w:p>
         </w:tc>
@@ -11137,7 +11101,7 @@
         </w:rPr>
       </w:pPr>
       <w:r>
-        <w:t xml:space="preserve">UC-07 groups course creation, publishing, session scheduling, room assignment and Coach assignment by specialty, plus threshold monitoring, session reschedule/cancel (BR-54) and Incident Notices. Courses use whole-course enrollment; PT is a separate paid Gym service.</w:t>
+        <w:t>UC-07 groups course creation, publishing, session scheduling, room assignment and Coach assignment by specialty, plus threshold monitoring, session reschedule/cancel (BR-54) and Incident Notices. Courses use whole-course enrollment; The current product does not sell one-to-one PT.</w:t>
       </w:r>
     </w:p>
     <w:p>
@@ -11184,11 +11148,7 @@
         </w:rPr>
       </w:pPr>
       <w:r>
-        <w:rPr>
-          <w:rFonts w:ascii="Times New Roman" w:cs="Times New Roman" w:eastAsia="Times New Roman" w:hAnsi="Times New Roman"/>
-          <w:rtl w:val="0"/>
-        </w:rPr>
-        <w:t xml:space="preserve">• Workout result and progress evaluation are grouped into UC-13 because both occur after a PT session and are performed only by an authorized Coach (PT).</w:t>
+        <w:t>Workout result and progress evaluation in UC-13 belong to an assigned badminton or basketball class session. Only the assigned Coach may record a student's result for that session.</w:t>
       </w:r>
     </w:p>
     <w:p>
@@ -16132,11 +16092,7 @@
               <w:ind w:left="0" w:right="0" w:firstLine="0"/>
             </w:pPr>
             <w:r>
-              <w:rPr>
-                <w:rFonts w:ascii="Times New Roman" w:hAnsi="Times New Roman"/>
-                <w:sz w:val="20"/>
-              </w:rPr>
-              <w:t xml:space="preserve">1. Member xem lớp PUBLISHED và chọn lớp. 2. Hệ thống kiểm tra còn chỗ sau khi tính cả SeatHold (BR-116) và Member không có ghi danh hoặc chỗ giữ khác giao lịch (BR-114). 3. Khi bắt đầu checkout, hệ thống tạo SeatHold 15 phút (cấu hình được, BR-115). 4. Thanh toán theo UC-15; khi thành công, SeatHold chuyển thành Enrollment CONFIRMED cho cả khóa. 5. Trước buổi đầu tiên, Member có thể hủy ghi danh và được hoàn 100% giá trị thực trả bằng điểm (BR-122). 6. Thuê sân: Member chọn khối 60 phút còn trống (Room tương thích Sport, trong giờ hoạt động, không bị khóa, không giao buổi lớp/PT/lượt thuê khác, BR-126), checkout và thanh toán theo UC-15.</w:t>
+              <w:t>1. Member xem lớp PUBLISHED và chọn lớp. 2. Hệ thống kiểm tra còn chỗ sau khi tính cả SeatHold (BR-116) và Member không có ghi danh hoặc chỗ giữ khác giao lịch (BR-114). 3. Khi bắt đầu checkout, hệ thống tạo SeatHold tối đa 10–30 phút theo cấu hình Manager (mặc định 15; BR-115). 4. Thanh toán theo UC-15; khi thành công, SeatHold chuyển thành Enrollment CONFIRMED cho cả khóa. 5. Trước buổi đầu tiên, Member có thể hủy ghi danh và được hoàn 100% giá trị thực trả bằng điểm (BR-122). 6. Thuê sân: Member chọn khối 60 phút còn trống (Room tương thích Sport, trong giờ hoạt động, không bị khóa, không giao buổi lớp/PT/lượt thuê khác, BR-126), checkout và thanh toán theo UC-15.</w:t>
             </w:r>
           </w:p>
         </w:tc>
@@ -17773,13 +17729,7 @@
               </w:rPr>
             </w:pPr>
             <w:r>
-              <w:rPr>
-                <w:rFonts w:ascii="Times New Roman" w:cs="Times New Roman" w:eastAsia="Times New Roman" w:hAnsi="Times New Roman"/>
-                <w:sz w:val="20"/>
-                <w:szCs w:val="17"/>
-                <w:rtl w:val="0"/>
-              </w:rPr>
-              <w:t xml:space="preserve">Member self; Coach (PT) authorized</w:t>
+              <w:t>Member tự khai; Coach chủ nhiệm đang được phân công chỉ đọc</w:t>
             </w:r>
           </w:p>
         </w:tc>
@@ -17933,13 +17883,7 @@
               </w:rPr>
             </w:pPr>
             <w:r>
-              <w:rPr>
-                <w:rFonts w:ascii="Times New Roman" w:cs="Times New Roman" w:eastAsia="Times New Roman" w:hAnsi="Times New Roman"/>
-                <w:sz w:val="20"/>
-                <w:szCs w:val="17"/>
-                <w:rtl w:val="0"/>
-              </w:rPr>
-              <w:t xml:space="preserve">Member tồn tại; Coach (PT) chỉ có quyền khi Coach-Member relationship ACTIVE.</w:t>
+              <w:t>Member tồn tại; Coach chỉ được xem học viên Confirmed trong lớp Published/InProgress mình làm chủ nhiệm.</w:t>
             </w:r>
           </w:p>
         </w:tc>
@@ -18013,13 +17957,7 @@
               </w:rPr>
             </w:pPr>
             <w:r>
-              <w:rPr>
-                <w:rFonts w:ascii="Times New Roman" w:cs="Times New Roman" w:eastAsia="Times New Roman" w:hAnsi="Times New Roman"/>
-                <w:sz w:val="20"/>
-                <w:szCs w:val="17"/>
-                <w:rtl w:val="0"/>
-              </w:rPr>
-              <w:t xml:space="preserve">1. Member cập nhật Goal/ExperienceLevel/Notes của mình. 2. Coach (PT) được đọc/điều chỉnh trong phạm vi quan hệ Active theo policy. 3. Hệ thống ghi UpdatedAt.</w:t>
+              <w:t>1. Member cập nhật Goal/ExperienceLevel/Notes của mình. 2. Coach chủ nhiệm đọc hồ sơ trong phạm vi lớp đang phụ trách, không sửa hồ sơ tự khai. 3. Hệ thống ghi UpdatedAt.</w:t>
             </w:r>
           </w:p>
         </w:tc>
@@ -18093,13 +18031,7 @@
               </w:rPr>
             </w:pPr>
             <w:r>
-              <w:rPr>
-                <w:rFonts w:ascii="Times New Roman" w:cs="Times New Roman" w:eastAsia="Times New Roman" w:hAnsi="Times New Roman"/>
-                <w:sz w:val="20"/>
-                <w:szCs w:val="17"/>
-                <w:rtl w:val="0"/>
-              </w:rPr>
-              <w:t xml:space="preserve">Coach không có Specialty Personal Training hoặc không có relationship -&gt; 403.</w:t>
+              <w:t>Coach không còn phân công, lớp Completed/Cancelled hoặc ghi danh đã kết thúc thì không được đọc hồ sơ; HLV dạy thay chỉ xem roster buổi được giao.</w:t>
             </w:r>
           </w:p>
         </w:tc>
@@ -18406,13 +18338,7 @@
               </w:rPr>
             </w:pPr>
             <w:r>
-              <w:rPr>
-                <w:rFonts w:ascii="Times New Roman" w:cs="Times New Roman" w:eastAsia="Times New Roman" w:hAnsi="Times New Roman"/>
-                <w:sz w:val="20"/>
-                <w:szCs w:val="17"/>
-                <w:rtl w:val="0"/>
-              </w:rPr>
-              <w:t xml:space="preserve">Coach (PT)</w:t>
+              <w:t>Coach được phân công lớp/buổi</w:t>
             </w:r>
           </w:p>
         </w:tc>
@@ -18566,13 +18492,7 @@
               </w:rPr>
             </w:pPr>
             <w:r>
-              <w:rPr>
-                <w:rFonts w:ascii="Times New Roman" w:cs="Times New Roman" w:eastAsia="Times New Roman" w:hAnsi="Times New Roman"/>
-                <w:sz w:val="20"/>
-                <w:szCs w:val="17"/>
-                <w:rtl w:val="0"/>
-              </w:rPr>
-              <w:t xml:space="preserve">Coach (PT) có Coach-Member relationship ACTIVE.</w:t>
+              <w:t>Lớp Published/InProgress, Coach đang được phân công; kế hoạch cá nhân chỉ cho học viên Confirmed.</w:t>
             </w:r>
           </w:p>
         </w:tc>
@@ -18646,13 +18566,7 @@
               </w:rPr>
             </w:pPr>
             <w:r>
-              <w:rPr>
-                <w:rFonts w:ascii="Times New Roman" w:cs="Times New Roman" w:eastAsia="Times New Roman" w:hAnsi="Times New Roman"/>
-                <w:sz w:val="20"/>
-                <w:szCs w:val="17"/>
-                <w:rtl w:val="0"/>
-              </w:rPr>
-              <w:t xml:space="preserve">1. Coach (PT) chọn Member được phụ trách. 2. Xem profile và lịch sử cần thiết. 3. Tạo WorkoutPlan và WorkoutPlanItem. 4. Chỉnh sets/reps/notes theo chuyên môn. 5. Lưu official plan.</w:t>
+              <w:t>1. Coach chọn lớp hoặc buổi được giao. 2. Xem hồ sơ trong phạm vi được phép. 3. Tạo PLAN cho lớp, buổi hoặc học viên; chỉnh nội dung theo chuyên môn. 4. Lưu bản ghi chính thức. AI Flow 5 chỉ tạo bản nháp để Coach duyệt.</w:t>
             </w:r>
           </w:p>
         </w:tc>
@@ -18726,13 +18640,7 @@
               </w:rPr>
             </w:pPr>
             <w:r>
-              <w:rPr>
-                <w:rFonts w:ascii="Times New Roman" w:cs="Times New Roman" w:eastAsia="Times New Roman" w:hAnsi="Times New Roman"/>
-                <w:sz w:val="20"/>
-                <w:szCs w:val="17"/>
-                <w:rtl w:val="0"/>
-              </w:rPr>
-              <w:t xml:space="preserve">Coach không có Specialty Personal Training hoặc không có relationship -&gt; 403. Coach (PT) có thể dùng UC-20; AI không bắt buộc.</w:t>
+              <w:t>Coach dạy thay không được ghi nội dung cả khóa; PLAN của họ phải gắn sessionId của buổi được giao. Coach ngoài phân công bị chặn.</w:t>
             </w:r>
           </w:p>
         </w:tc>
@@ -18806,13 +18714,7 @@
               </w:rPr>
             </w:pPr>
             <w:r>
-              <w:rPr>
-                <w:rFonts w:ascii="Times New Roman" w:cs="Times New Roman" w:eastAsia="Times New Roman" w:hAnsi="Times New Roman"/>
-                <w:sz w:val="20"/>
-                <w:szCs w:val="17"/>
-                <w:rtl w:val="0"/>
-              </w:rPr>
-              <w:t xml:space="preserve">Official WorkoutPlan được tạo bởi Coach (PT) được phân công.</w:t>
+              <w:t>PLAN được lưu trong ClassTeachingRecord và chỉ hiển thị đúng lớp/học viên.</w:t>
             </w:r>
           </w:p>
         </w:tc>
@@ -19039,13 +18941,7 @@
               </w:rPr>
             </w:pPr>
             <w:r>
-              <w:rPr>
-                <w:rFonts w:ascii="Times New Roman" w:cs="Times New Roman" w:eastAsia="Times New Roman" w:hAnsi="Times New Roman"/>
-                <w:sz w:val="20"/>
-                <w:szCs w:val="17"/>
-                <w:rtl w:val="0"/>
-              </w:rPr>
-              <w:t xml:space="preserve">Coach (PT)</w:t>
+              <w:t>Coach được phân công buổi lớp nhóm</w:t>
             </w:r>
           </w:p>
         </w:tc>
@@ -19199,11 +19095,7 @@
               </w:rPr>
             </w:pPr>
             <w:r>
-              <w:rPr>
-                <w:rFonts w:ascii="Times New Roman" w:hAnsi="Times New Roman"/>
-                <w:sz w:val="20"/>
-              </w:rPr>
-              <w:t xml:space="preserve">Coach (PT) thực sự phụ trách buổi PT; điều kiện booking/session tuân theo mô hình PT được duyệt.</w:t>
+              <w:t>Buổi không bị hủy, đã bắt đầu; học viên có Enrollment Confirmed.</w:t>
             </w:r>
           </w:p>
         </w:tc>
@@ -19277,13 +19169,7 @@
               </w:rPr>
             </w:pPr>
             <w:r>
-              <w:rPr>
-                <w:rFonts w:ascii="Times New Roman" w:cs="Times New Roman" w:eastAsia="Times New Roman" w:hAnsi="Times New Roman"/>
-                <w:sz w:val="20"/>
-                <w:szCs w:val="17"/>
-                <w:rtl w:val="0"/>
-              </w:rPr>
-              <w:t>1. Chọn Member và buổi PT thuộc phạm vi. 2. Ghi WorkoutResult, ProgressNote và CoachComment. 3. So sánh lịch sử. 4. Đánh giá tiến độ và quyết định điều chỉnh plan.</w:t>
+              <w:t>1. Coach mở buổi được giao. 2. Ghi RESULT, nhận xét và điểm kỹ năng tùy chọn cho đúng học viên. 3. Xem tiến độ/historical assessments theo quyền chủ nhiệm; sửa kết quả của mình với version hiện tại.</w:t>
             </w:r>
           </w:p>
         </w:tc>
@@ -19357,13 +19243,7 @@
               </w:rPr>
             </w:pPr>
             <w:r>
-              <w:rPr>
-                <w:rFonts w:ascii="Times New Roman" w:cs="Times New Roman" w:eastAsia="Times New Roman" w:hAnsi="Times New Roman"/>
-                <w:sz w:val="20"/>
-                <w:szCs w:val="17"/>
-                <w:rtl w:val="0"/>
-              </w:rPr>
-              <w:t xml:space="preserve">Coach không có Specialty Personal Training hoặc ngoài phạm vi -&gt; 403. Entity liên kết PT session/result phải được chốt theo SSOT §7 trước khi triển khai.</w:t>
+              <w:t>Coach không được giao buổi hoặc học viên không còn ghi danh bị chặn. HLV dạy thay không xem hồ sơ/lịch sử toàn khóa.</w:t>
             </w:r>
           </w:p>
         </w:tc>
@@ -19437,13 +19317,7 @@
               </w:rPr>
             </w:pPr>
             <w:r>
-              <w:rPr>
-                <w:rFonts w:ascii="Times New Roman" w:cs="Times New Roman" w:eastAsia="Times New Roman" w:hAnsi="Times New Roman"/>
-                <w:sz w:val="20"/>
-                <w:szCs w:val="17"/>
-                <w:rtl w:val="0"/>
-              </w:rPr>
-              <w:t xml:space="preserve">WorkoutResult/feedback được lưu làm lịch sử và input tham khảo cho AI.</w:t>
+              <w:t>RESULT gắn ClassSession và Member, được giữ làm lịch sử và tham khảo cho Flow 5.</w:t>
             </w:r>
           </w:p>
         </w:tc>
@@ -19830,13 +19704,7 @@
               </w:rPr>
             </w:pPr>
             <w:r>
-              <w:rPr>
-                <w:rFonts w:ascii="Times New Roman" w:cs="Times New Roman" w:eastAsia="Times New Roman" w:hAnsi="Times New Roman"/>
-                <w:sz w:val="20"/>
-                <w:szCs w:val="17"/>
-                <w:rtl w:val="0"/>
-              </w:rPr>
-              <w:t xml:space="preserve">Member đăng nhập.</w:t>
+              <w:t>Member có Enrollment Confirmed, EndedAt rỗng trong lớp Published/InProgress/Completed.</w:t>
             </w:r>
           </w:p>
         </w:tc>
@@ -19910,19 +19778,7 @@
               </w:rPr>
             </w:pPr>
             <w:r>
-              <w:rPr>
-                <w:rFonts w:ascii="Times New Roman" w:cs="Times New Roman" w:eastAsia="Times New Roman" w:hAnsi="Times New Roman"/>
-                <w:sz w:val="20"/>
-                <w:szCs w:val="17"/>
-                <w:rtl w:val="0"/>
-              </w:rPr>
-              <w:t xml:space="preserve">1. Mở khu vực Training.</w:t>
-              <w:br w:type="textWrapping"/>
-              <w:t xml:space="preserve"> 2. Xem official WorkoutPlan hiện tại.</w:t>
-              <w:br w:type="textWrapping"/>
-              <w:t xml:space="preserve"> 3. Xem WorkoutResult/coach feedback trước đây.</w:t>
-              <w:br w:type="textWrapping"/>
-              <w:t xml:space="preserve"> 4. Xem tổng hợp tiến độ cá nhân.</w:t>
+              <w:t>1. Mở My Schedule và lớp đã ghi danh. 2. Xem PLAN, HOMEWORK, RESULT/nhận xét của mình và lịch sử buổi; lớp Completed vẫn đọc được. 3. Xem tiến độ cá nhân.</w:t>
             </w:r>
           </w:p>
         </w:tc>
@@ -19996,13 +19852,7 @@
               </w:rPr>
             </w:pPr>
             <w:r>
-              <w:rPr>
-                <w:rFonts w:ascii="Times New Roman" w:cs="Times New Roman" w:eastAsia="Times New Roman" w:hAnsi="Times New Roman"/>
-                <w:sz w:val="20"/>
-                <w:szCs w:val="17"/>
-                <w:rtl w:val="0"/>
-              </w:rPr>
-              <w:t xml:space="preserve">Chỉ được xem dữ liệu của chính mình.</w:t>
+              <w:t>Không xem nội dung học viên khác. Ghi danh kết thúc hoặc lớp Cancelled/Draft thì không còn quyền nội dung; lịch sử tài chính vẫn được giữ.</w:t>
             </w:r>
           </w:p>
         </w:tc>
@@ -23594,13 +23444,7 @@
               </w:rPr>
             </w:pPr>
             <w:r>
-              <w:rPr>
-                <w:rFonts w:ascii="Times New Roman" w:cs="Times New Roman" w:eastAsia="Times New Roman" w:hAnsi="Times New Roman"/>
-                <w:sz w:val="20"/>
-                <w:szCs w:val="17"/>
-                <w:rtl w:val="0"/>
-              </w:rPr>
-              <w:t xml:space="preserve">1. Coach (PT) chọn Member và yêu cầu suggestion. 2. Backend kiểm tra specialty/relationship và lấy Goal/Level/history từ server. 3. IAiRecommendationService gửi context tối thiểu. 4. AI trả suggestion. 5. Coach (PT) review/edit và có thể lưu qua UC-12.</w:t>
+              <w:t>1. Coach chọn học viên thuộc lớp mình đang phụ trách và yêu cầu suggestion. 2. Backend kiểm tra phân công/ghi danh và lấy profile/history được phép từ server. 3. AI trả bản nháp. 4. Coach review/edit và có thể lưu PLAN chính thức qua UC-12.</w:t>
             </w:r>
           </w:p>
         </w:tc>
@@ -24605,14 +24449,7 @@
         </w:rPr>
       </w:pPr>
       <w:r>
-        <w:rPr>
-          <w:rFonts w:ascii="Consolas" w:cs="Consolas" w:eastAsia="Consolas" w:hAnsi="Consolas"/>
-          <w:color w:val="444444"/>
-          <w:sz w:val="18"/>
-          <w:szCs w:val="18"/>
-          <w:rtl w:val="0"/>
-        </w:rPr>
-        <w:t xml:space="preserve">Receptionist ghi Present/Absent cho lớp cầu lông/bóng rổ. Coach (PT) quản lý profile được phép, tạo plan, ghi trạng thái/kết quả buổi PT và đánh giá tiến độ. Coach không phụ trách PT chỉ xem lớp/lịch được phân công và không tham gia Training/Attendance actions.</w:t>
+        <w:t>Receptionist or the Coach assigned to a class session records Present/Absent for confirmed students. The primary Coach creates class or individual plans and records results/comments; an assigned substitute works only within their session. Homework after a completed session is optional. Members with a confirmed, unended enrollment retain access to their class history after the class becomes Completed.</w:t>
       </w:r>
     </w:p>
     <w:p>
@@ -24658,14 +24495,7 @@
         </w:rPr>
       </w:pPr>
       <w:r>
-        <w:rPr>
-          <w:rFonts w:ascii="Consolas" w:cs="Consolas" w:eastAsia="Consolas" w:hAnsi="Consolas"/>
-          <w:color w:val="444444"/>
-          <w:sz w:val="18"/>
-          <w:szCs w:val="18"/>
-          <w:rtl w:val="0"/>
-        </w:rPr>
-        <w:t xml:space="preserve">Coach (PT) chọn Member có quan hệ Active -&gt; backend kiểm tra specialty/ownership và lấy profile/history -&gt; AI System trả suggestion -&gt; Coach (PT) review/edit -&gt; lưu official plan nếu phù hợp.</w:t>
+        <w:t>An assigned Coach may request a Flow 5 workout suggestion for a student within their authorized scope. The backend builds context from permitted profile and class history; the Coach reviews and edits the draft before saving it. AI does not write an official plan on its own.</w:t>
       </w:r>
     </w:p>
     <w:p>
@@ -24759,7 +24589,7 @@
         </w:rPr>
       </w:pPr>
       <w:r>
-        <w:t>Membership được tạo Active cùng transaction Payment thành công và có hiệu lực từ StartDate đến hết EndDate. Lần mua mới lấy ngày Việt Nam của vnp_PayDate; early renewal tạo record mới sau EndDate. PT là gói trả phí riêng và chỉ checkout khi Membership Active.</w:t>
+        <w:t>Membership được tạo Active cùng transaction Payment thành công và có hiệu lực từ StartDate đến hết EndDate. Lần mua mới lấy ngày Việt Nam của vnp_PayDate; early renewal tạo record mới sau EndDate.</w:t>
       </w:r>
     </w:p>
     <w:p/>
@@ -24938,7 +24768,7 @@
         </w:rPr>
       </w:pPr>
       <w:r>
-        <w:t>Mô hình dữ liệu và field xem docs/Center-Management-System-Design-v3.md và docs/entity-field-purpose.md. PT dùng PtEntitlement/PtSession, khóa nhóm dùng Class/Enrollment/ClassSession, refund dùng PaymentAdjustment và PointLedgerEntry. Seed PT riêng cần migration để khớp ba môn sản phẩm.</w:t>
+        <w:t>Mô hình dữ liệu và field xem docs/Center-Management-System-Design-v3.md. Lớp nhóm dùng Class/Enrollment/ClassSession/ClassTeachingRecord; điểm danh theo Enrollment và Session. Hoàn điểm dùng PaymentAdjustment và PointLedgerEntry. Không có gói PT 1:1 trong phạm vi hiện hành.</w:t>
       </w:r>
     </w:p>
     <w:p>
@@ -24949,7 +24779,7 @@
         </w:rPr>
       </w:pPr>
       <w:r>
-        <w:t>Mô hình dữ liệu và field xem docs/Center-Management-System-Design-v3.md và docs/entity-field-purpose.md. PT dùng PtEntitlement/PtSession, khóa nhóm dùng Class/Enrollment/ClassSession, refund dùng PaymentAdjustment và PointLedgerEntry. Seed PT riêng cần migration để khớp ba môn sản phẩm.</w:t>
+        <w:t>Mô hình dữ liệu và field xem docs/Center-Management-System-Design-v3.md. Lớp nhóm dùng Class/Enrollment/ClassSession/ClassTeachingRecord; điểm danh theo Enrollment và Session. Hoàn điểm dùng PaymentAdjustment và PointLedgerEntry. Không có gói PT 1:1 trong phạm vi hiện hành.</w:t>
       </w:r>
     </w:p>
     <w:p>

</xml_diff>

<commit_message>
feat: implement payment support and day pass workflow
</commit_message>
<xml_diff>
--- a/docs/SWP391_Report_SRS.docx
+++ b/docs/SWP391_Report_SRS.docx
@@ -1381,7 +1381,23 @@
                 <w:rFonts w:ascii="Times New Roman" w:hAnsi="Times New Roman"/>
                 <w:sz w:val="20"/>
               </w:rPr>
-              <w:t xml:space="preserve">Quản lý vận hành Membership, môn/phòng/giá, lớp nhiều buổi và lịch; phân công Coach theo chuyên môn, xử lý báo vắng, dạy thay hoặc dời buổi; quản lý ngưỡng lớp, sự cố, hoàn điểm, báo cáo và Audit Log. Không tạo tài khoản Coach hoặc quản lý dịch vụ PT 1:1.</w:t>
+              <w:t xml:space="preserve">Quản lý vận hành Membership, môn/phòng/giá, lớp nhiều buổi và lịch; phân công Coach theo chuyên môn, xử lý báo vắng, dạy thay hoặc dời buổi; quản lý ngưỡng lớp, sự cố, hoàn điểm</w:t>
+            </w:r>
+            <w:ins w:id="9001" w:author="Claude" w:date="2026-10-24T22:45:00Z">
+              <w:r>
+                <w:rPr>
+                  <w:rFonts w:ascii="Times New Roman" w:hAnsi="Times New Roman"/>
+                  <w:sz w:val="20"/>
+                </w:rPr>
+                <w:t xml:space="preserve">, xử lý Support Request và ghi nhận hoàn chuyển khoản (BR-151)</w:t>
+              </w:r>
+            </w:ins>
+            <w:r>
+              <w:rPr>
+                <w:rFonts w:ascii="Times New Roman" w:hAnsi="Times New Roman"/>
+                <w:sz w:val="20"/>
+              </w:rPr>
+              <w:t xml:space="preserve">, báo cáo và Audit Log. Không tạo tài khoản Coach hoặc quản lý dịch vụ PT 1:1.</w:t>
             </w:r>
           </w:p>
         </w:tc>
@@ -1530,7 +1546,23 @@
                 <w:rFonts w:ascii="Times New Roman" w:hAnsi="Times New Roman"/>
                 <w:sz w:val="20"/>
               </w:rPr>
-              <w:t xml:space="preserve">Tự đăng ký hoặc đăng nhập Google; mua Membership, khóa lớp và thuê sân; thanh toán bằng điểm và/hoặc VNPay-QR; xem hóa đơn, ví điểm, lịch lớp, kế hoạch, kết quả và bài tập Coach gửi; tạo yêu cầu hoàn điểm theo quyền. Không có gói PT 1:1 trong phạm vi hiện hành.</w:t>
+              <w:t xml:space="preserve">Tự đăng ký hoặc đăng nhập Google; mua Membership, khóa lớp và thuê sân; thanh toán bằng điểm và/hoặc VNPay-QR; xem hóa đơn, ví điểm, lịch lớp, kế hoạch, kết quả và bài tập Coach gửi; tạo yêu cầu hoàn điểm theo quyền</w:t>
+            </w:r>
+            <w:ins w:id="9002" w:author="Claude" w:date="2026-10-24T22:45:00Z">
+              <w:r>
+                <w:rPr>
+                  <w:rFonts w:ascii="Times New Roman" w:hAnsi="Times New Roman"/>
+                  <w:sz w:val="20"/>
+                </w:rPr>
+                <w:t xml:space="preserve">; tự gửi Support Request từ trang Trợ giúp, gồm yêu cầu hoàn chuyển khoản cho hóa đơn đã thanh toán (BR-147, BR-150)</w:t>
+              </w:r>
+            </w:ins>
+            <w:r>
+              <w:rPr>
+                <w:rFonts w:ascii="Times New Roman" w:hAnsi="Times New Roman"/>
+                <w:sz w:val="20"/>
+              </w:rPr>
+              <w:t xml:space="preserve">. Không có gói PT 1:1 trong phạm vi hiện hành.</w:t>
             </w:r>
           </w:p>
         </w:tc>
@@ -1601,7 +1633,23 @@
                 <w:rFonts w:ascii="Times New Roman" w:hAnsi="Times New Roman"/>
                 <w:sz w:val="20"/>
               </w:rPr>
-              <w:t xml:space="preserve">Tạo Member tại quầy; Gym check-in/out; checkout hộ Member (dùng điểm hộ cần OTP); ghi Present/Absent cho lớp cầu lông/bóng rổ cùng với Coach được phân công đúng buổi; hỗ trợ đối soát/fulfillment lại và tạo yêu cầu hoàn hộ. Không tự đánh dấu Paid, cộng điểm hoặc duyệt hoàn.</w:t>
+              <w:t xml:space="preserve">Tạo Member tại quầy; Gym check-in/out; checkout hộ Member (dùng điểm hộ cần OTP); ghi Present/Absent cho lớp cầu lông/bóng rổ cùng với Coach được phân công đúng buổi; hỗ trợ đối soát/fulfillment lại và tạo yêu cầu hoàn hộ</w:t>
+            </w:r>
+            <w:ins w:id="9003" w:author="Claude" w:date="2026-10-24T22:45:00Z">
+              <w:r>
+                <w:rPr>
+                  <w:rFonts w:ascii="Times New Roman" w:hAnsi="Times New Roman"/>
+                  <w:sz w:val="20"/>
+                </w:rPr>
+                <w:t xml:space="preserve">; tiếp nhận, chuyển hoặc ghi chú Support Request (không ghi nhận chuyển khoản)</w:t>
+              </w:r>
+            </w:ins>
+            <w:r>
+              <w:rPr>
+                <w:rFonts w:ascii="Times New Roman" w:hAnsi="Times New Roman"/>
+                <w:sz w:val="20"/>
+              </w:rPr>
+              <w:t xml:space="preserve">. Không tự đánh dấu Paid, cộng điểm hoặc duyệt hoàn.</w:t>
             </w:r>
           </w:p>
         </w:tc>
@@ -2228,7 +2276,32 @@
                 <w:rFonts w:ascii="Times New Roman" w:hAnsi="Times New Roman"/>
                 <w:sz w:val="20"/>
               </w:rPr>
-              <w:t xml:space="preserve">Invoice/InvoiceItem snapshot; checkout chia điểm + VNPay-QR (hoặc toàn điểm); PaymentAttempt, IPN/QueryDR, reconciliation; ví điểm; hoàn trả theo InvoiceItem bằng điểm; báo cáo hội viên, đăng ký lớp, doanh thu (cash basis) và Audit Log.</w:t>
+              <w:t xml:space="preserve">Invoice/InvoiceItem snapshot; checkout chia điểm + VNPay-QR (hoặc toàn điểm); PaymentAttempt, IPN/QueryDR, reconciliation; ví điểm; </w:t>
+            </w:r>
+            <w:del w:id="9004" w:author="Claude" w:date="2026-10-24T22:45:00Z">
+              <w:r>
+                <w:rPr>
+                  <w:rFonts w:ascii="Times New Roman" w:hAnsi="Times New Roman"/>
+                  <w:sz w:val="20"/>
+                </w:rPr>
+                <w:delText xml:space="preserve">hoàn trả theo InvoiceItem bằng điểm;</w:delText>
+              </w:r>
+            </w:del>
+            <w:ins w:id="9005" w:author="Claude" w:date="2026-10-24T22:45:00Z">
+              <w:r>
+                <w:rPr>
+                  <w:rFonts w:ascii="Times New Roman" w:hAnsi="Times New Roman"/>
+                  <w:sz w:val="20"/>
+                </w:rPr>
+                <w:t xml:space="preserve">hoàn trả theo InvoiceItem bằng điểm; Support Request (SLA 48 giờ) và hoàn chuyển khoản do Center Manager ghi nhận; vé Gym ngày bán 06:00–22:00;</w:t>
+              </w:r>
+            </w:ins>
+            <w:r>
+              <w:rPr>
+                <w:rFonts w:ascii="Times New Roman" w:hAnsi="Times New Roman"/>
+                <w:sz w:val="20"/>
+              </w:rPr>
+              <w:t xml:space="preserve"> báo cáo hội viên, đăng ký lớp, doanh thu (cash basis) và Audit Log.</w:t>
             </w:r>
           </w:p>
         </w:tc>
@@ -2600,7 +2673,20 @@
         </w:rPr>
       </w:pPr>
       <w:r>
-        <w:t xml:space="preserve">Out of scope includes multi-center/multi-tenant support, a dedicated mobile application, Momo, production payment certification, payroll, salary/commission, employment contracts, staff cost reports and profit reporting. VNPay Sandbox/VNPay-QR and transactional email for OTP/Invoice/Paid/Refund remain in scope; provider credentials are deployment configuration. Revenue reports follow cash basis on VNPay cash collected; points redeemed and points issued are reported separately, refunds are returned as points (not cash), and reports do not subtract payroll or other operating costs.</w:t>
+        <w:t xml:space="preserve">Out of scope includes multi-center/multi-tenant support, a dedicated mobile application, Momo, production payment certification, payroll, salary/commission, employment contracts, staff cost reports and profit reporting. VNPay Sandbox/VNPay-QR and transactional email for OTP/Invoice/Paid/Refund remain in scope; provider credentials are deployment configuration. Revenue reports follow cash basis on VNPay cash collected; points redeemed and points issued are reported separately, </w:t>
+      </w:r>
+      <w:del w:id="9006" w:author="Claude" w:date="2026-10-24T22:45:00Z">
+        <w:r>
+          <w:delText xml:space="preserve">refunds are returned as points (not cash)</w:delText>
+        </w:r>
+      </w:del>
+      <w:ins w:id="9007" w:author="Claude" w:date="2026-10-24T22:45:00Z">
+        <w:r>
+          <w:t xml:space="preserve">automatic refunds are returned as points; bank-transfer refunds are made only through a Support Request, outside the system by the Center Manager, and are reported on a separate "đã hoàn chuyển khoản" line (bankRefundPaid); the system never calls a bank or VNPay Refund API</w:t>
+        </w:r>
+      </w:ins>
+      <w:r>
+        <w:t xml:space="preserve">, and reports do not subtract payroll or other operating costs.</w:t>
       </w:r>
     </w:p>
     <w:p>
@@ -7285,6 +7371,15 @@
               </w:rPr>
               <w:t>OTP/Google onboarding; invoice snapshot; split payment điểm + VNPay; backend verify; atomic fulfillment/reconciliation; refund theo item bằng điểm.</w:t>
             </w:r>
+            <w:ins w:id="9008" w:author="Claude" w:date="2026-10-24T22:45:00Z">
+              <w:r>
+                <w:rPr>
+                  <w:rFonts w:ascii="Times New Roman" w:hAnsi="Times New Roman"/>
+                  <w:sz w:val="20"/>
+                </w:rPr>
+                <w:t xml:space="preserve"> Thanh toán đến muộn: còn chỗ thì tự cấp quyền lợi, không thì "đã thu tiền, chưa cấp quyền lợi" và Member nhận điểm ngay hoặc gửi Support Request (BR-88, BR-117); hoàn chuyển khoản chỉ qua Support Request (BR-135).</w:t>
+              </w:r>
+            </w:ins>
           </w:p>
         </w:tc>
       </w:tr>
@@ -7733,6 +7828,231 @@
               </w:rPr>
               <w:t>Coach có nhiều chuyên môn theo môn; PT thuộc Gym. Coach PT quản lý tập luyện được phân công; Receptionist điểm danh lớp; payroll ngoài phạm vi.</w:t>
             </w:r>
+          </w:p>
+        </w:tc>
+      </w:tr>
+      <w:tr>
+        <w:trPr>
+          <w:cantSplit w:val="0"/>
+          <w:tblHeader w:val="0"/>
+          <w:ins w:id="9009" w:author="Claude" w:date="2026-10-24T22:45:00Z"/>
+        </w:trPr>
+        <w:tc>
+          <w:tcPr>
+            <w:tcBorders>
+              <w:top w:color="000000" w:space="0" w:sz="0" w:val="nil"/>
+              <w:left w:color="000000" w:space="0" w:sz="5" w:val="single"/>
+              <w:bottom w:color="000000" w:space="0" w:sz="5" w:val="single"/>
+              <w:right w:color="000000" w:space="0" w:sz="5" w:val="single"/>
+            </w:tcBorders>
+            <w:tcMar>
+              <w:top w:w="0.0" w:type="dxa"/>
+              <w:left w:w="100.0" w:type="dxa"/>
+              <w:bottom w:w="0.0" w:type="dxa"/>
+              <w:right w:w="100.0" w:type="dxa"/>
+            </w:tcMar>
+            <w:vAlign w:val="top"/>
+          </w:tcPr>
+          <w:p>
+            <w:pPr>
+              <w:ind w:left="0" w:right="0" w:firstLine="0"/>
+              <w:rPr>
+                <w:ins w:id="9010" w:author="Claude" w:date="2026-10-24T22:45:00Z"/>
+              </w:rPr>
+            </w:pPr>
+            <w:ins w:id="9011" w:author="Claude" w:date="2026-10-24T22:45:00Z">
+              <w:r>
+                <w:rPr>
+                  <w:rFonts w:ascii="Times New Roman" w:hAnsi="Times New Roman"/>
+                  <w:sz w:val="20"/>
+                </w:rPr>
+                <w:t xml:space="preserve">BR-145</w:t>
+              </w:r>
+            </w:ins>
+          </w:p>
+        </w:tc>
+        <w:tc>
+          <w:tcPr>
+            <w:tcBorders>
+              <w:top w:color="000000" w:space="0" w:sz="0" w:val="nil"/>
+              <w:left w:color="000000" w:space="0" w:sz="0" w:val="nil"/>
+              <w:bottom w:color="000000" w:space="0" w:sz="5" w:val="single"/>
+              <w:right w:color="000000" w:space="0" w:sz="5" w:val="single"/>
+            </w:tcBorders>
+            <w:tcMar>
+              <w:top w:w="0.0" w:type="dxa"/>
+              <w:left w:w="100.0" w:type="dxa"/>
+              <w:bottom w:w="0.0" w:type="dxa"/>
+              <w:right w:w="100.0" w:type="dxa"/>
+            </w:tcMar>
+            <w:vAlign w:val="top"/>
+          </w:tcPr>
+          <w:p>
+            <w:pPr>
+              <w:ind w:left="0" w:right="0" w:firstLine="0"/>
+              <w:rPr>
+                <w:ins w:id="9012" w:author="Claude" w:date="2026-10-24T22:45:00Z"/>
+              </w:rPr>
+            </w:pPr>
+            <w:ins w:id="9013" w:author="Claude" w:date="2026-10-24T22:45:00Z">
+              <w:r>
+                <w:rPr>
+                  <w:rFonts w:ascii="Times New Roman" w:hAnsi="Times New Roman"/>
+                  <w:sz w:val="20"/>
+                </w:rPr>
+                <w:t xml:space="preserve">Vé Gym 1 ngày: bán 06:00 đến trước 22:00 giờ Việt Nam, hết hạn 22:00 cùng ngày mua; trong 60 phút cuối trước 22:00 báo ghi chú Gym đóng cửa (closingSoon, closesAtUtc); thanh toán thành công sau 22:00 không tự cấp vé.</w:t>
+              </w:r>
+            </w:ins>
+          </w:p>
+        </w:tc>
+      </w:tr>
+      <w:tr>
+        <w:trPr>
+          <w:cantSplit w:val="0"/>
+          <w:tblHeader w:val="0"/>
+          <w:ins w:id="9014" w:author="Claude" w:date="2026-10-24T22:45:00Z"/>
+        </w:trPr>
+        <w:tc>
+          <w:tcPr>
+            <w:tcBorders>
+              <w:top w:color="000000" w:space="0" w:sz="0" w:val="nil"/>
+              <w:left w:color="000000" w:space="0" w:sz="5" w:val="single"/>
+              <w:bottom w:color="000000" w:space="0" w:sz="5" w:val="single"/>
+              <w:right w:color="000000" w:space="0" w:sz="5" w:val="single"/>
+            </w:tcBorders>
+            <w:tcMar>
+              <w:top w:w="0.0" w:type="dxa"/>
+              <w:left w:w="100.0" w:type="dxa"/>
+              <w:bottom w:w="0.0" w:type="dxa"/>
+              <w:right w:w="100.0" w:type="dxa"/>
+            </w:tcMar>
+            <w:vAlign w:val="top"/>
+          </w:tcPr>
+          <w:p>
+            <w:pPr>
+              <w:ind w:left="0" w:right="0" w:firstLine="0"/>
+              <w:rPr>
+                <w:ins w:id="9015" w:author="Claude" w:date="2026-10-24T22:45:00Z"/>
+              </w:rPr>
+            </w:pPr>
+            <w:ins w:id="9016" w:author="Claude" w:date="2026-10-24T22:45:00Z">
+              <w:r>
+                <w:rPr>
+                  <w:rFonts w:ascii="Times New Roman" w:hAnsi="Times New Roman"/>
+                  <w:sz w:val="20"/>
+                </w:rPr>
+                <w:t xml:space="preserve">BR-146</w:t>
+              </w:r>
+            </w:ins>
+          </w:p>
+        </w:tc>
+        <w:tc>
+          <w:tcPr>
+            <w:tcBorders>
+              <w:top w:color="000000" w:space="0" w:sz="0" w:val="nil"/>
+              <w:left w:color="000000" w:space="0" w:sz="0" w:val="nil"/>
+              <w:bottom w:color="000000" w:space="0" w:sz="5" w:val="single"/>
+              <w:right w:color="000000" w:space="0" w:sz="5" w:val="single"/>
+            </w:tcBorders>
+            <w:tcMar>
+              <w:top w:w="0.0" w:type="dxa"/>
+              <w:left w:w="100.0" w:type="dxa"/>
+              <w:bottom w:w="0.0" w:type="dxa"/>
+              <w:right w:w="100.0" w:type="dxa"/>
+            </w:tcMar>
+            <w:vAlign w:val="top"/>
+          </w:tcPr>
+          <w:p>
+            <w:pPr>
+              <w:ind w:left="0" w:right="0" w:firstLine="0"/>
+              <w:rPr>
+                <w:ins w:id="9017" w:author="Claude" w:date="2026-10-24T22:45:00Z"/>
+              </w:rPr>
+            </w:pPr>
+            <w:ins w:id="9018" w:author="Claude" w:date="2026-10-24T22:45:00Z">
+              <w:r>
+                <w:rPr>
+                  <w:rFonts w:ascii="Times New Roman" w:hAnsi="Times New Roman"/>
+                  <w:sz w:val="20"/>
+                </w:rPr>
+                <w:t xml:space="preserve">vnp_ExpireDate bằng thời hạn checkout; khi checkout vừa hết hạn gọi QueryDR trước khi nhả chỗ.</w:t>
+              </w:r>
+            </w:ins>
+          </w:p>
+        </w:tc>
+      </w:tr>
+      <w:tr>
+        <w:trPr>
+          <w:cantSplit w:val="0"/>
+          <w:tblHeader w:val="0"/>
+          <w:ins w:id="9019" w:author="Claude" w:date="2026-10-24T22:45:00Z"/>
+        </w:trPr>
+        <w:tc>
+          <w:tcPr>
+            <w:tcBorders>
+              <w:top w:color="000000" w:space="0" w:sz="0" w:val="nil"/>
+              <w:left w:color="000000" w:space="0" w:sz="5" w:val="single"/>
+              <w:bottom w:color="000000" w:space="0" w:sz="5" w:val="single"/>
+              <w:right w:color="000000" w:space="0" w:sz="5" w:val="single"/>
+            </w:tcBorders>
+            <w:tcMar>
+              <w:top w:w="0.0" w:type="dxa"/>
+              <w:left w:w="100.0" w:type="dxa"/>
+              <w:bottom w:w="0.0" w:type="dxa"/>
+              <w:right w:w="100.0" w:type="dxa"/>
+            </w:tcMar>
+            <w:vAlign w:val="top"/>
+          </w:tcPr>
+          <w:p>
+            <w:pPr>
+              <w:ind w:left="0" w:right="0" w:firstLine="0"/>
+              <w:rPr>
+                <w:ins w:id="9020" w:author="Claude" w:date="2026-10-24T22:45:00Z"/>
+              </w:rPr>
+            </w:pPr>
+            <w:ins w:id="9021" w:author="Claude" w:date="2026-10-24T22:45:00Z">
+              <w:r>
+                <w:rPr>
+                  <w:rFonts w:ascii="Times New Roman" w:hAnsi="Times New Roman"/>
+                  <w:sz w:val="20"/>
+                </w:rPr>
+                <w:t xml:space="preserve">BR-147–154</w:t>
+              </w:r>
+            </w:ins>
+          </w:p>
+        </w:tc>
+        <w:tc>
+          <w:tcPr>
+            <w:tcBorders>
+              <w:top w:color="000000" w:space="0" w:sz="0" w:val="nil"/>
+              <w:left w:color="000000" w:space="0" w:sz="0" w:val="nil"/>
+              <w:bottom w:color="000000" w:space="0" w:sz="5" w:val="single"/>
+              <w:right w:color="000000" w:space="0" w:sz="5" w:val="single"/>
+            </w:tcBorders>
+            <w:tcMar>
+              <w:top w:w="0.0" w:type="dxa"/>
+              <w:left w:w="100.0" w:type="dxa"/>
+              <w:bottom w:w="0.0" w:type="dxa"/>
+              <w:right w:w="100.0" w:type="dxa"/>
+            </w:tcMar>
+            <w:vAlign w:val="top"/>
+          </w:tcPr>
+          <w:p>
+            <w:pPr>
+              <w:ind w:left="0" w:right="0" w:firstLine="0"/>
+              <w:rPr>
+                <w:ins w:id="9022" w:author="Claude" w:date="2026-10-24T22:45:00Z"/>
+              </w:rPr>
+            </w:pPr>
+            <w:ins w:id="9023" w:author="Claude" w:date="2026-10-24T22:45:00Z">
+              <w:r>
+                <w:rPr>
+                  <w:rFonts w:ascii="Times New Roman" w:hAnsi="Times New Roman"/>
+                  <w:sz w:val="20"/>
+                </w:rPr>
+                <w:t xml:space="preserve">Support Request: Member tự gửi từ trang Trợ giúp, SLA 48 giờ, Remind us, nhắc nhân viên; request PAYMENT hoàn chuyển khoản do Center Manager ghi nhận, Member xác nhận; bảo vệ dữ liệu tài khoản ngân hàng; sự cố phía trung tâm: Member chọn nhận điểm ngay hoặc hoàn tiền qua Support Request.</w:t>
+              </w:r>
+            </w:ins>
           </w:p>
         </w:tc>
       </w:tr>
@@ -11077,6 +11397,169 @@
           </w:p>
         </w:tc>
       </w:tr>
+      <w:tr>
+        <w:trPr>
+          <w:cantSplit w:val="0"/>
+          <w:tblHeader w:val="0"/>
+          <w:ins w:id="9024" w:author="Claude" w:date="2026-10-24T22:45:00Z"/>
+        </w:trPr>
+        <w:tc>
+          <w:tcPr>
+            <w:tcBorders>
+              <w:top w:color="000000" w:space="0" w:sz="0" w:val="nil"/>
+              <w:left w:color="000000" w:space="0" w:sz="5" w:val="single"/>
+              <w:bottom w:color="000000" w:space="0" w:sz="5" w:val="single"/>
+              <w:right w:color="000000" w:space="0" w:sz="5" w:val="single"/>
+            </w:tcBorders>
+            <w:tcMar>
+              <w:top w:w="0.0" w:type="dxa"/>
+              <w:left w:w="100.0" w:type="dxa"/>
+              <w:bottom w:w="0.0" w:type="dxa"/>
+              <w:right w:w="100.0" w:type="dxa"/>
+            </w:tcMar>
+            <w:vAlign w:val="top"/>
+          </w:tcPr>
+          <w:p>
+            <w:pPr>
+              <w:ind w:left="0" w:right="0" w:firstLine="0"/>
+              <w:rPr>
+                <w:ins w:id="9025" w:author="Claude" w:date="2026-10-24T22:45:00Z"/>
+                <w:rFonts w:ascii="Times New Roman" w:cs="Times New Roman" w:eastAsia="Times New Roman" w:hAnsi="Times New Roman"/>
+                <w:sz w:val="15"/>
+                <w:szCs w:val="15"/>
+              </w:rPr>
+            </w:pPr>
+            <w:ins w:id="9026" w:author="Claude" w:date="2026-10-24T22:45:00Z">
+              <w:r>
+                <w:rPr>
+                  <w:rFonts w:ascii="Times New Roman" w:cs="Times New Roman" w:eastAsia="Times New Roman" w:hAnsi="Times New Roman"/>
+                  <w:sz w:val="20"/>
+                  <w:szCs w:val="15"/>
+                  <w:rtl w:val="0"/>
+                </w:rPr>
+                <w:t xml:space="preserve">UC-22</w:t>
+              </w:r>
+            </w:ins>
+          </w:p>
+        </w:tc>
+        <w:tc>
+          <w:tcPr>
+            <w:tcBorders>
+              <w:top w:color="000000" w:space="0" w:sz="0" w:val="nil"/>
+              <w:left w:color="000000" w:space="0" w:sz="0" w:val="nil"/>
+              <w:bottom w:color="000000" w:space="0" w:sz="5" w:val="single"/>
+              <w:right w:color="000000" w:space="0" w:sz="5" w:val="single"/>
+            </w:tcBorders>
+            <w:tcMar>
+              <w:top w:w="0.0" w:type="dxa"/>
+              <w:left w:w="100.0" w:type="dxa"/>
+              <w:bottom w:w="0.0" w:type="dxa"/>
+              <w:right w:w="100.0" w:type="dxa"/>
+            </w:tcMar>
+            <w:vAlign w:val="top"/>
+          </w:tcPr>
+          <w:p>
+            <w:pPr>
+              <w:ind w:left="0" w:right="0" w:firstLine="0"/>
+              <w:rPr>
+                <w:ins w:id="9027" w:author="Claude" w:date="2026-10-24T22:45:00Z"/>
+                <w:rFonts w:ascii="Times New Roman" w:cs="Times New Roman" w:eastAsia="Times New Roman" w:hAnsi="Times New Roman"/>
+                <w:sz w:val="15"/>
+                <w:szCs w:val="15"/>
+              </w:rPr>
+            </w:pPr>
+            <w:ins w:id="9028" w:author="Claude" w:date="2026-10-24T22:45:00Z">
+              <w:r>
+                <w:rPr>
+                  <w:rFonts w:ascii="Times New Roman" w:cs="Times New Roman" w:eastAsia="Times New Roman" w:hAnsi="Times New Roman"/>
+                  <w:sz w:val="20"/>
+                  <w:szCs w:val="15"/>
+                  <w:rtl w:val="0"/>
+                </w:rPr>
+                <w:t xml:space="preserve">Gửi và xử lý Support Request (hoàn chuyển khoản)</w:t>
+              </w:r>
+            </w:ins>
+          </w:p>
+        </w:tc>
+        <w:tc>
+          <w:tcPr>
+            <w:tcBorders>
+              <w:top w:color="000000" w:space="0" w:sz="0" w:val="nil"/>
+              <w:left w:color="000000" w:space="0" w:sz="0" w:val="nil"/>
+              <w:bottom w:color="000000" w:space="0" w:sz="5" w:val="single"/>
+              <w:right w:color="000000" w:space="0" w:sz="5" w:val="single"/>
+            </w:tcBorders>
+            <w:tcMar>
+              <w:top w:w="0.0" w:type="dxa"/>
+              <w:left w:w="100.0" w:type="dxa"/>
+              <w:bottom w:w="0.0" w:type="dxa"/>
+              <w:right w:w="100.0" w:type="dxa"/>
+            </w:tcMar>
+            <w:vAlign w:val="top"/>
+          </w:tcPr>
+          <w:p>
+            <w:pPr>
+              <w:ind w:left="0" w:right="0" w:firstLine="0"/>
+              <w:rPr>
+                <w:ins w:id="9029" w:author="Claude" w:date="2026-10-24T22:45:00Z"/>
+                <w:rFonts w:ascii="Times New Roman" w:cs="Times New Roman" w:eastAsia="Times New Roman" w:hAnsi="Times New Roman"/>
+                <w:sz w:val="15"/>
+                <w:szCs w:val="15"/>
+              </w:rPr>
+            </w:pPr>
+            <w:ins w:id="9030" w:author="Claude" w:date="2026-10-24T22:45:00Z">
+              <w:r>
+                <w:rPr>
+                  <w:rFonts w:ascii="Times New Roman" w:cs="Times New Roman" w:eastAsia="Times New Roman" w:hAnsi="Times New Roman"/>
+                  <w:sz w:val="20"/>
+                  <w:szCs w:val="15"/>
+                  <w:rtl w:val="0"/>
+                </w:rPr>
+                <w:t xml:space="preserve">Member; Receptionist; Center Manager</w:t>
+              </w:r>
+            </w:ins>
+          </w:p>
+        </w:tc>
+        <w:tc>
+          <w:tcPr>
+            <w:tcBorders>
+              <w:top w:color="000000" w:space="0" w:sz="0" w:val="nil"/>
+              <w:left w:color="000000" w:space="0" w:sz="0" w:val="nil"/>
+              <w:bottom w:color="000000" w:space="0" w:sz="5" w:val="single"/>
+              <w:right w:color="000000" w:space="0" w:sz="5" w:val="single"/>
+            </w:tcBorders>
+            <w:tcMar>
+              <w:top w:w="0.0" w:type="dxa"/>
+              <w:left w:w="100.0" w:type="dxa"/>
+              <w:bottom w:w="0.0" w:type="dxa"/>
+              <w:right w:w="100.0" w:type="dxa"/>
+            </w:tcMar>
+            <w:vAlign w:val="top"/>
+          </w:tcPr>
+          <w:p>
+            <w:pPr>
+              <w:ind w:left="0" w:right="0" w:firstLine="0"/>
+              <w:rPr>
+                <w:ins w:id="9031" w:author="Claude" w:date="2026-10-24T22:45:00Z"/>
+                <w:rFonts w:ascii="Times New Roman" w:cs="Times New Roman" w:eastAsia="Times New Roman" w:hAnsi="Times New Roman"/>
+                <w:sz w:val="15"/>
+                <w:szCs w:val="15"/>
+              </w:rPr>
+            </w:pPr>
+            <w:ins w:id="9032" w:author="Claude" w:date="2026-10-24T22:45:00Z">
+              <w:r>
+                <w:rPr>
+                  <w:rFonts w:ascii="Times New Roman" w:cs="Times New Roman" w:eastAsia="Times New Roman" w:hAnsi="Times New Roman"/>
+                  <w:sz w:val="20"/>
+                  <w:szCs w:val="15"/>
+                  <w:rtl w:val="0"/>
+                </w:rPr>
+                <w:t xml:space="preserve">Required supporting</w:t>
+              </w:r>
+            </w:ins>
+          </w:p>
+        </w:tc>
+      </w:tr>
     </w:tbl>
     <w:p>
       <w:pPr>
@@ -11126,8 +11609,18 @@
         </w:rPr>
       </w:pPr>
       <w:r>
-        <w:t>UC-15 covers checkout, points plus VNPay, PaymentAttempt, verified IPN/QueryDR and fulfillment. UC-16 covers InvoiceItem-based point refund request, approval and atomic wallet credit; no bank or gateway refund.</w:t>
+        <w:t xml:space="preserve">UC-15 covers checkout, points plus VNPay, PaymentAttempt, verified IPN/QueryDR and fulfillment. UC-16 covers InvoiceItem-based point refund request, approval and atomic wallet credit; </w:t>
       </w:r>
+      <w:del w:id="9033" w:author="Claude" w:date="2026-10-24T22:45:00Z">
+        <w:r>
+          <w:delText xml:space="preserve">no bank or gateway refund.</w:delText>
+        </w:r>
+      </w:del>
+      <w:ins w:id="9034" w:author="Claude" w:date="2026-10-24T22:45:00Z">
+        <w:r>
+          <w:t xml:space="preserve">no gateway refund; bank-transfer refund is requested only through a Support Request and recorded by the Center Manager (UC-22).</w:t>
+        </w:r>
+      </w:ins>
     </w:p>
     <w:p>
       <w:pPr>
@@ -11174,8 +11667,26 @@
           <w:rFonts w:ascii="Times New Roman" w:cs="Times New Roman" w:eastAsia="Times New Roman" w:hAnsi="Times New Roman"/>
           <w:rtl w:val="0"/>
         </w:rPr>
-        <w:t>• Do not keep the Support Request within the current scope as mentioned in the previous report, but the current thiết kế hệ thống/ERD/API lacks entity/endpoint backing. If the team wants to keep it, they need to update the Source-of-Truth first.</w:t>
+        <w:t xml:space="preserve">• </w:t>
       </w:r>
+      <w:del w:id="9035" w:author="Claude" w:date="2026-10-24T22:45:00Z">
+        <w:r>
+          <w:rPr>
+            <w:rFonts w:ascii="Times New Roman" w:cs="Times New Roman" w:eastAsia="Times New Roman" w:hAnsi="Times New Roman"/>
+            <w:rtl w:val="0"/>
+          </w:rPr>
+          <w:delText xml:space="preserve">Do not keep the Support Request within the current scope as mentioned in the previous report, but the current thiết kế hệ thống/ERD/API lacks entity/endpoint backing. If the team wants to keep it, they need to update the Source-of-Truth first.</w:delText>
+        </w:r>
+      </w:del>
+      <w:ins w:id="9036" w:author="Claude" w:date="2026-10-24T22:45:00Z">
+        <w:r>
+          <w:rPr>
+            <w:rFonts w:ascii="Times New Roman" w:cs="Times New Roman" w:eastAsia="Times New Roman" w:hAnsi="Times New Roman"/>
+            <w:rtl w:val="0"/>
+          </w:rPr>
+          <w:t xml:space="preserve">The Support Request is within the current scope (Payment-Support-Workflow.md, decided 24/10/2026): a Member submits it from the Help page, and PAYMENT-category requests are the only route to a bank-transfer refund, recorded by the Center Manager (UC-22, BR-147–BR-154). The entities and endpoints in that document are proposed and not yet implemented.</w:t>
+        </w:r>
+      </w:ins>
     </w:p>
     <w:p>
       <w:pPr>
@@ -14970,6 +15481,15 @@
               </w:rPr>
               <w:t>Không mua PT cùng checkout tạo Membership mới. Attempt hết hạn có thể retry. Gateway đã nhận tiền nhưng fulfillment lỗi → ReconciliationRequired và backend retry; staff không tự đánh dấu Paid.</w:t>
             </w:r>
+            <w:ins w:id="9037" w:author="Claude" w:date="2026-10-24T22:45:00Z">
+              <w:r>
+                <w:rPr>
+                  <w:rFonts w:ascii="Times New Roman" w:hAnsi="Times New Roman"/>
+                  <w:sz w:val="20"/>
+                </w:rPr>
+                <w:t xml:space="preserve"> Vé Gym 1 ngày chỉ bán từ 06:00 đến trước 22:00 giờ Việt Nam và hết hạn 22:00 cùng ngày mua; ngoài khung giờ này từ chối tạo checkout (409 day_pass_outside_hours), trong 60 phút cuối trước giờ đóng cửa 22:00 báo Member ngay lúc đặt ghi chú Gym đóng cửa, checkout trả closingSoon và closesAtUtc (BR-145).</w:t>
+              </w:r>
+            </w:ins>
           </w:p>
         </w:tc>
       </w:tr>
@@ -16092,7 +16612,28 @@
               <w:ind w:left="0" w:right="0" w:firstLine="0"/>
             </w:pPr>
             <w:r>
-              <w:t>1. Member xem lớp PUBLISHED và chọn lớp. 2. Hệ thống kiểm tra còn chỗ sau khi tính cả SeatHold (BR-116) và Member không có ghi danh hoặc chỗ giữ khác giao lịch (BR-114). 3. Khi bắt đầu checkout, hệ thống tạo SeatHold tối đa 10–30 phút theo cấu hình Manager (mặc định 15; BR-115). 4. Thanh toán theo UC-15; khi thành công, SeatHold chuyển thành Enrollment CONFIRMED cho cả khóa. 5. Trước buổi đầu tiên, Member có thể hủy ghi danh và được hoàn 100% giá trị thực trả bằng điểm (BR-122). 6. Thuê sân: Member chọn khối 60 phút còn trống (Room tương thích Sport, trong giờ hoạt động, không bị khóa, không giao buổi lớp/PT/lượt thuê khác, BR-126), checkout và thanh toán theo UC-15.</w:t>
+              <w:t xml:space="preserve">1. Member xem lớp PUBLISHED và chọn lớp. 2. Hệ thống kiểm tra còn chỗ sau khi tính cả SeatHold (BR-116) và Member không có ghi danh hoặc chỗ giữ khác giao lịch (BR-114). 3. Khi bắt đầu checkout, hệ thống tạo SeatHold tối đa 10–30 phút theo cấu hình Manager (mặc định 15; BR-115). 4. Thanh toán theo UC-15; khi thành công, SeatHold chuyển thành Enrollment CONFIRMED cho cả khóa. 5. </w:t>
+            </w:r>
+            <w:del w:id="9088" w:author="Claude" w:date="2026-10-24T22:45:00Z">
+              <w:r>
+                <w:delText xml:space="preserve">Trước buổi đầu tiên, Member có thể hủy ghi danh và được hoàn 100% giá trị thực trả bằng điểm (BR-122).</w:delText>
+              </w:r>
+            </w:del>
+            <w:ins w:id="9089" w:author="Claude" w:date="2026-10-24T22:45:00Z">
+              <w:r>
+                <w:t xml:space="preserve">Member có thể hủy ghi danh nhưng không được hoàn; khi bấm hủy, giao diện hiện pop-up thông báo Member hủy và không được hoàn tiền (BR-122).</w:t>
+              </w:r>
+            </w:ins>
+            <w:r>
+              <w:t xml:space="preserve"> 6. Thuê sân: Member chọn khối 60 phút còn trống (Room tương thích Sport, trong giờ hoạt động, không bị khóa, không giao buổi lớp/PT/lượt thuê khác, BR-126)</w:t>
+            </w:r>
+            <w:ins w:id="9090" w:author="Claude" w:date="2026-10-24T22:45:00Z">
+              <w:r>
+                <w:t xml:space="preserve"> và chỉ hiển thị trong 3 ngày lịch tính từ ngày hiện tại</w:t>
+              </w:r>
+            </w:ins>
+            <w:r>
+              <w:t xml:space="preserve">, checkout và thanh toán theo UC-15.</w:t>
             </w:r>
           </w:p>
         </w:tc>
@@ -16164,7 +16705,32 @@
                 <w:rFonts w:ascii="Times New Roman" w:hAnsi="Times New Roman"/>
                 <w:sz w:val="20"/>
               </w:rPr>
-              <w:t xml:space="preserve">Lớp đầy, không PUBLISHED, đã qua buổi đầu tiên, trùng lịch ghi danh khác hoặc SeatHold hết hạn → từ chối hoặc phải checkout lại; không có Waitlist. Lớp chưa đạt ngưỡng: Member được email để chọn chuyển lớp hoặc hoàn điểm. Membership hết hạn không hủy ghi danh đã CONFIRMED.</w:t>
+              <w:t xml:space="preserve">Lớp đầy, không PUBLISHED, đã qua buổi đầu tiên, trùng lịch ghi danh khác hoặc SeatHold hết hạn → từ chối hoặc phải checkout lại; không có Waitlist. Lớp chưa đạt ngưỡng: Member được email để chọn </w:t>
+            </w:r>
+            <w:del w:id="9098" w:author="Claude" w:date="2026-10-24T22:45:00Z">
+              <w:r>
+                <w:rPr>
+                  <w:rFonts w:ascii="Times New Roman" w:hAnsi="Times New Roman"/>
+                  <w:sz w:val="20"/>
+                </w:rPr>
+                <w:delText xml:space="preserve">chuyển lớp hoặc hoàn điểm.</w:delText>
+              </w:r>
+            </w:del>
+            <w:ins w:id="9099" w:author="Claude" w:date="2026-10-24T22:45:00Z">
+              <w:r>
+                <w:rPr>
+                  <w:rFonts w:ascii="Times New Roman" w:hAnsi="Times New Roman"/>
+                  <w:sz w:val="20"/>
+                </w:rPr>
+                <w:t xml:space="preserve">chuyển lớp hoặc hoàn (nhận điểm ngay hoặc hoàn tiền qua Support Request, BR-154).</w:t>
+              </w:r>
+            </w:ins>
+            <w:r>
+              <w:rPr>
+                <w:rFonts w:ascii="Times New Roman" w:hAnsi="Times New Roman"/>
+                <w:sz w:val="20"/>
+              </w:rPr>
+              <w:t xml:space="preserve"> Membership hết hạn không hủy ghi danh đã CONFIRMED.</w:t>
             </w:r>
           </w:p>
         </w:tc>
@@ -20445,7 +21011,32 @@
                 <w:rFonts w:ascii="Times New Roman" w:hAnsi="Times New Roman"/>
                 <w:sz w:val="20"/>
               </w:rPr>
-              <w:t xml:space="preserve">ReturnUrl không xác nhận tiền. Callback lặp phải idempotent. Attempt Expired được retry. SeatHold/điểm hết hạn được nhả đúng một lần. IPN muộn/QueryDR hợp lệ → PaidAfterReconciliation. Fulfillment lỗi sau khi gateway nhận tiền → ReconciliationRequired.</w:t>
+              <w:t xml:space="preserve">ReturnUrl không xác nhận tiền. Callback lặp phải idempotent. Attempt Expired được retry. SeatHold/điểm hết hạn được nhả đúng một lần. </w:t>
+            </w:r>
+            <w:del w:id="9038" w:author="Claude" w:date="2026-10-24T22:45:00Z">
+              <w:r>
+                <w:rPr>
+                  <w:rFonts w:ascii="Times New Roman" w:hAnsi="Times New Roman"/>
+                  <w:sz w:val="20"/>
+                </w:rPr>
+                <w:delText xml:space="preserve">IPN muộn/QueryDR hợp lệ → PaidAfterReconciliation.</w:delText>
+              </w:r>
+            </w:del>
+            <w:ins w:id="9039" w:author="Claude" w:date="2026-10-24T22:45:00Z">
+              <w:r>
+                <w:rPr>
+                  <w:rFonts w:ascii="Times New Roman" w:hAnsi="Times New Roman"/>
+                  <w:sz w:val="20"/>
+                </w:rPr>
+                <w:t xml:space="preserve">IPN muộn/QueryDR hợp lệ (BR-88): nếu chỗ hoặc khung giờ còn hợp lệ thì tự cấp quyền lợi, Invoice PAID_AFTER_RECONCILIATION (fulfillmentOutcome = FULFILLED), không có bước nhân viên xác nhận; nếu không cấp được (kể cả vé Gym ngày quá 22:00) thì ghi nhận "đã thu tiền, chưa cấp quyền lợi" (RECONCILIATION_REQUIRED), thông báo Member và Receptionist; Member chọn nhận điểm ngay (Invoice COMPENSATED) hoặc gửi Support Request, chỉ được chọn một lần. vnp_ExpireDate bằng thời hạn checkout; khi checkout vừa hết hạn, backend gọi QueryDR trước khi nhả chỗ (BR-146).</w:t>
+              </w:r>
+            </w:ins>
+            <w:r>
+              <w:rPr>
+                <w:rFonts w:ascii="Times New Roman" w:hAnsi="Times New Roman"/>
+                <w:sz w:val="20"/>
+              </w:rPr>
+              <w:t xml:space="preserve"> Fulfillment lỗi sau khi gateway nhận tiền → ReconciliationRequired.</w:t>
             </w:r>
           </w:p>
         </w:tc>
@@ -21023,13 +21614,115 @@
             <w:pPr>
               <w:ind w:left="0" w:right="0" w:firstLine="0"/>
             </w:pPr>
+            <w:del w:id="9093" w:author="Claude" w:date="2026-10-24T22:45:00Z">
+              <w:r>
+                <w:rPr>
+                  <w:rFonts w:ascii="Times New Roman" w:hAnsi="Times New Roman"/>
+                  <w:sz w:val="20"/>
+                </w:rPr>
+                <w:delText xml:space="preserve">Membership còn &gt;= 2/3 thời hạn, kể cả chưa StartDate (gói gia hạn sớm), hoàn chuẩn tối đa 50% giá trị thực trả; dưới ngưỡng/Expired không hoàn.</w:delText>
+              </w:r>
+            </w:del>
+            <w:ins w:id="9094" w:author="Claude" w:date="2026-10-24T22:45:00Z">
+              <w:r>
+                <w:rPr>
+                  <w:rFonts w:ascii="Times New Roman" w:hAnsi="Times New Roman"/>
+                  <w:sz w:val="20"/>
+                </w:rPr>
+                <w:t xml:space="preserve">Member tự hủy Membership Gym không được hoàn ở mọi thời điểm, giao diện hiện pop-up thông báo hủy và không được hoàn tiền (BR-91); Member tự hủy thuê sân cũng không hoàn (BR-129).</w:t>
+              </w:r>
+            </w:ins>
             <w:r>
               <w:rPr>
                 <w:rFonts w:ascii="Times New Roman" w:hAnsi="Times New Roman"/>
                 <w:sz w:val="20"/>
               </w:rPr>
-              <w:t xml:space="preserve">Membership còn &gt;= 2/3 thời hạn, kể cả chưa StartDate (gói gia hạn sớm), hoàn chuẩn tối đa 50% giá trị thực trả; dưới ngưỡng/Expired không hoàn. Sự cố tạm thời của trung tâm không phải căn cứ hoàn: Gym được bù bằng gia hạn Membership, lớp được bù buổi (UC-07, BR-130); chỉ vấn đề khác khiến trung tâm không thể cung cấp dịch vụ mới xét ngoại lệ (Center Fault) do Manager phê duyệt: Membership hoàn theo ngày còn lại / tổng ngày, PT theo buổi chưa dùng / TotalQuota, không hoàn 100% (BR-91). PT chưa consume session nào hoàn 50%; đã consume không hoàn chuẩn. Khóa lớp: trước buổi đầu tiên hoàn 100%; từ buổi đầu tiên không hoàn chuẩn. Hoàn luôn bằng điểm, không gọi VNPay Refund API nên không có trạng thái Processing/Failed do cổng thanh toán; Receptionist không tự cộng điểm. Retry không cộng điểm trùng (ReferenceId duy nhất).</w:t>
-            </w:r>
+              <w:t xml:space="preserve"> Sự cố tạm thời của trung tâm không phải căn cứ hoàn: Gym được bù bằng gia hạn Membership, lớp được bù buổi (UC-07, BR-130); chỉ vấn đề khác khiến trung tâm không thể cung cấp dịch vụ mới xét ngoại lệ (Center Fault) do Manager phê duyệt: Membership hoàn theo ngày còn lại / tổng ngày, PT theo buổi chưa dùng / TotalQuota, không hoàn 100% (BR-91). </w:t>
+            </w:r>
+            <w:del w:id="9095" w:author="Claude" w:date="2026-10-24T22:45:00Z">
+              <w:r>
+                <w:rPr>
+                  <w:rFonts w:ascii="Times New Roman" w:hAnsi="Times New Roman"/>
+                  <w:sz w:val="20"/>
+                </w:rPr>
+                <w:delText xml:space="preserve">PT chưa consume session nào hoàn 50%; đã consume không hoàn chuẩn.</w:delText>
+              </w:r>
+            </w:del>
+            <w:ins w:id="9096" w:author="Claude" w:date="2026-10-24T22:45:00Z">
+              <w:r>
+                <w:rPr>
+                  <w:rFonts w:ascii="Times New Roman" w:hAnsi="Times New Roman"/>
+                  <w:sz w:val="20"/>
+                </w:rPr>
+                <w:t xml:space="preserve">Member tự hủy gói PT không hoàn (BR-92).</w:t>
+              </w:r>
+            </w:ins>
+            <w:r>
+              <w:rPr>
+                <w:rFonts w:ascii="Times New Roman" w:hAnsi="Times New Roman"/>
+                <w:sz w:val="20"/>
+              </w:rPr>
+              <w:t xml:space="preserve"> </w:t>
+            </w:r>
+            <w:del w:id="9091" w:author="Claude" w:date="2026-10-24T22:45:00Z">
+              <w:r>
+                <w:rPr>
+                  <w:rFonts w:ascii="Times New Roman" w:hAnsi="Times New Roman"/>
+                  <w:sz w:val="20"/>
+                </w:rPr>
+                <w:delText xml:space="preserve">Khóa lớp: trước buổi đầu tiên hoàn 100%; từ buổi đầu tiên không hoàn chuẩn.</w:delText>
+              </w:r>
+            </w:del>
+            <w:ins w:id="9092" w:author="Claude" w:date="2026-10-24T22:45:00Z">
+              <w:r>
+                <w:rPr>
+                  <w:rFonts w:ascii="Times New Roman" w:hAnsi="Times New Roman"/>
+                  <w:sz w:val="20"/>
+                </w:rPr>
+                <w:t xml:space="preserve">Khóa lớp: Member đã ghi danh tự hủy thì không hoàn ở mọi thời điểm, giao diện hiện pop-up thông báo không được hoàn tiền (BR-122); lớp do trung tâm hủy vẫn hoàn theo BR-122.</w:t>
+              </w:r>
+            </w:ins>
+            <w:r>
+              <w:rPr>
+                <w:rFonts w:ascii="Times New Roman" w:hAnsi="Times New Roman"/>
+                <w:sz w:val="20"/>
+              </w:rPr>
+              <w:t xml:space="preserve"> </w:t>
+            </w:r>
+            <w:del w:id="9040" w:author="Claude" w:date="2026-10-24T22:45:00Z">
+              <w:r>
+                <w:rPr>
+                  <w:rFonts w:ascii="Times New Roman" w:hAnsi="Times New Roman"/>
+                  <w:sz w:val="20"/>
+                </w:rPr>
+                <w:delText xml:space="preserve">Hoàn luôn bằng điểm, không gọi VNPay Refund API nên không có trạng thái Processing/Failed do cổng thanh toán; Receptionist không tự cộng điểm.</w:delText>
+              </w:r>
+            </w:del>
+            <w:ins w:id="9041" w:author="Claude" w:date="2026-10-24T22:45:00Z">
+              <w:r>
+                <w:rPr>
+                  <w:rFonts w:ascii="Times New Roman" w:hAnsi="Times New Roman"/>
+                  <w:sz w:val="20"/>
+                </w:rPr>
+                <w:t xml:space="preserve">Hoàn tự động luôn bằng điểm, không gọi VNPay Refund API hay API ngân hàng nên không có trạng thái Processing/Failed do cổng thanh toán; hoàn chuyển khoản chỉ qua Support Request (UC-22). Đã mua thì không hoàn khi Member tự hủy gói, ghi danh hoặc thuê sân ngoài chính sách hoàn điểm theo InvoiceItem ở trên; hoàn chỉ phát sinh khi Member gửi Support Request (Center Manager hỗ trợ) hoặc do sự cố phía trung tâm (lớp bị hủy, lớp dưới ngưỡng, hủy sân do trung tâm); Manager hoàn điểm cho lớp học khi lớp do phía trung tâm hủy (lớp bị hủy, lớp dưới ngưỡng); Member tự hủy thì không hoàn (BR-135). Receptionist không tự cộng điểm.</w:t>
+              </w:r>
+            </w:ins>
+            <w:r>
+              <w:rPr>
+                <w:rFonts w:ascii="Times New Roman" w:hAnsi="Times New Roman"/>
+                <w:sz w:val="20"/>
+              </w:rPr>
+              <w:t xml:space="preserve"> Retry không cộng điểm trùng (ReferenceId duy nhất).</w:t>
+            </w:r>
+            <w:ins w:id="9097" w:author="Claude" w:date="2026-10-24T22:45:00Z">
+              <w:r>
+                <w:rPr>
+                  <w:rFonts w:ascii="Times New Roman" w:hAnsi="Times New Roman"/>
+                  <w:sz w:val="20"/>
+                </w:rPr>
+                <w:t xml:space="preserve"> Sự cố hoặc quyết định phía trung tâm (lớp bị hủy, lớp dưới ngưỡng, hủy sân): Member chọn nhận điểm ngay hoặc hoàn tiền qua Support Request (UC-22, BR-154).</w:t>
+              </w:r>
+            </w:ins>
           </w:p>
         </w:tc>
       </w:tr>
@@ -21637,7 +22330,32 @@
                 <w:rFonts w:ascii="Times New Roman" w:hAnsi="Times New Roman"/>
                 <w:sz w:val="20"/>
               </w:rPr>
-              <w:t xml:space="preserve">Không có dữ liệu → report rỗng hợp lệ. Hoàn trả bằng điểm nên không có khoản Refunded bằng tiền. Invoice chưa thanh toán không tính vào doanh thu. System Administrator không tự có quyền xem.</w:t>
+              <w:t xml:space="preserve">Không có dữ liệu → report rỗng hợp lệ. </w:t>
+            </w:r>
+            <w:del w:id="9042" w:author="Claude" w:date="2026-10-24T22:45:00Z">
+              <w:r>
+                <w:rPr>
+                  <w:rFonts w:ascii="Times New Roman" w:hAnsi="Times New Roman"/>
+                  <w:sz w:val="20"/>
+                </w:rPr>
+                <w:delText xml:space="preserve">Hoàn trả bằng điểm nên không có khoản Refunded bằng tiền.</w:delText>
+              </w:r>
+            </w:del>
+            <w:ins w:id="9043" w:author="Claude" w:date="2026-10-24T22:45:00Z">
+              <w:r>
+                <w:rPr>
+                  <w:rFonts w:ascii="Times New Roman" w:hAnsi="Times New Roman"/>
+                  <w:sz w:val="20"/>
+                </w:rPr>
+                <w:t xml:space="preserve">Hoàn tự động bằng điểm nên không có khoản Refunded bằng tiền theo cách đảo số; khoản Center Manager đã chuyển khoản qua Support Request được báo riêng ở dòng "đã hoàn chuyển khoản" (bankRefundPaid, bankRefundCount) trên báo cáo doanh thu và dashboard (BR-95, BR-151).</w:t>
+              </w:r>
+            </w:ins>
+            <w:r>
+              <w:rPr>
+                <w:rFonts w:ascii="Times New Roman" w:hAnsi="Times New Roman"/>
+                <w:sz w:val="20"/>
+              </w:rPr>
+              <w:t xml:space="preserve"> Invoice chưa thanh toán không tính vào doanh thu. System Administrator không tự có quyền xem.</w:t>
             </w:r>
           </w:p>
         </w:tc>
@@ -22276,6 +22994,17 @@
               </w:rPr>
               <w:t>In-app notification được lưu trong hệ thống; OTP và Invoice/Paid/Refund email gửi qua outbox/background job. SMS ngoài scope.</w:t>
             </w:r>
+            <w:ins w:id="9044" w:author="Claude" w:date="2026-10-24T22:45:00Z">
+              <w:r>
+                <w:rPr>
+                  <w:rFonts w:ascii="Times New Roman" w:cs="Times New Roman" w:eastAsia="Times New Roman" w:hAnsi="Times New Roman"/>
+                  <w:sz w:val="20"/>
+                  <w:szCs w:val="17"/>
+                  <w:rtl w:val="0"/>
+                </w:rPr>
+                <w:t xml:space="preserve"> Thông báo Support Request: nhắc quá hạn 48 giờ, Remind us, đã ghi nhận chuyển khoản (kèm email cho Member), Member báo chưa nhận (BR-148, BR-149, BR-151, BR-152).</w:t>
+              </w:r>
+            </w:ins>
           </w:p>
         </w:tc>
       </w:tr>
@@ -24251,6 +24980,653 @@
     </w:tbl>
     <w:p>
       <w:pPr>
+        <w:pStyle w:val="Heading3"/>
+        <w:keepNext/>
+        <w:keepLines w:val="0"/>
+        <w:pageBreakBefore w:val="0"/>
+        <w:spacing w:before="280" w:lineRule="auto"/>
+        <w:ind w:left="0" w:firstLine="0"/>
+        <w:rPr>
+          <w:ins w:id="9045" w:author="Claude" w:date="2026-10-24T22:45:00Z"/>
+          <w:rFonts w:ascii="Times New Roman" w:cs="Times New Roman" w:eastAsia="Times New Roman" w:hAnsi="Times New Roman"/>
+          <w:b w:val="1"/>
+          <w:bCs w:val="1"/>
+          <w:color w:val="000000"/>
+          <w:sz w:val="26"/>
+          <w:szCs w:val="26"/>
+        </w:rPr>
+      </w:pPr>
+      <w:ins w:id="9046" w:author="Claude" w:date="2026-10-24T22:45:00Z">
+        <w:r>
+          <w:rPr>
+            <w:rFonts w:ascii="Times New Roman" w:cs="Times New Roman" w:eastAsia="Times New Roman" w:hAnsi="Times New Roman"/>
+            <w:b w:val="1"/>
+            <w:bCs w:val="1"/>
+            <w:color w:val="000000"/>
+            <w:sz w:val="26"/>
+            <w:szCs w:val="26"/>
+            <w:rtl w:val="0"/>
+          </w:rPr>
+          <w:t xml:space="preserve">UC-22 - Gửi và xử lý Support Request (hoàn chuyển khoản)</w:t>
+        </w:r>
+      </w:ins>
+    </w:p>
+    <w:tbl>
+      <w:tblPr>
+        <w:tblStyle w:val="Table23"/>
+        <w:tblW w:w="8865.0" w:type="dxa"/>
+        <w:jc w:val="left"/>
+        <w:tblBorders>
+          <w:top w:color="000000" w:space="0" w:sz="0" w:val="nil"/>
+          <w:left w:color="000000" w:space="0" w:sz="0" w:val="nil"/>
+          <w:bottom w:color="000000" w:space="0" w:sz="0" w:val="nil"/>
+          <w:right w:color="000000" w:space="0" w:sz="0" w:val="nil"/>
+          <w:insideH w:color="000000" w:space="0" w:sz="0" w:val="nil"/>
+          <w:insideV w:color="000000" w:space="0" w:sz="0" w:val="nil"/>
+        </w:tblBorders>
+        <w:tblLayout w:type="fixed"/>
+        <w:tblLook w:val="0600"/>
+      </w:tblPr>
+      <w:tblGrid>
+        <w:gridCol w:w="2265"/>
+        <w:gridCol w:w="6600"/>
+        <w:tblGridChange w:id="0">
+          <w:tblGrid>
+            <w:gridCol w:w="2265"/>
+            <w:gridCol w:w="6600"/>
+          </w:tblGrid>
+        </w:tblGridChange>
+      </w:tblGrid>
+      <w:tr>
+        <w:trPr>
+          <w:cantSplit w:val="0"/>
+          <w:tblHeader w:val="0"/>
+          <w:ins w:id="9047" w:author="Claude" w:date="2026-10-24T22:45:00Z"/>
+        </w:trPr>
+        <w:tc>
+          <w:tcPr>
+            <w:tcBorders>
+              <w:top w:color="000000" w:space="0" w:sz="5" w:val="single"/>
+              <w:left w:color="000000" w:space="0" w:sz="5" w:val="single"/>
+              <w:bottom w:color="000000" w:space="0" w:sz="5" w:val="single"/>
+              <w:right w:color="000000" w:space="0" w:sz="5" w:val="single"/>
+            </w:tcBorders>
+            <w:shd w:fill="2f5597" w:val="clear"/>
+            <w:tcMar>
+              <w:top w:w="0.0" w:type="dxa"/>
+              <w:left w:w="100.0" w:type="dxa"/>
+              <w:bottom w:w="0.0" w:type="dxa"/>
+              <w:right w:w="100.0" w:type="dxa"/>
+            </w:tcMar>
+            <w:vAlign w:val="top"/>
+          </w:tcPr>
+          <w:p>
+            <w:pPr>
+              <w:keepNext/>
+              <w:ind w:left="0" w:right="0" w:firstLine="0"/>
+              <w:rPr>
+                <w:ins w:id="9048" w:author="Claude" w:date="2026-10-24T22:45:00Z"/>
+                <w:rFonts w:ascii="Times New Roman" w:cs="Times New Roman" w:eastAsia="Times New Roman" w:hAnsi="Times New Roman"/>
+                <w:b w:val="1"/>
+                <w:bCs w:val="1"/>
+                <w:color w:val="ffffff"/>
+                <w:sz w:val="17"/>
+                <w:szCs w:val="17"/>
+              </w:rPr>
+            </w:pPr>
+            <w:ins w:id="9049" w:author="Claude" w:date="2026-10-24T22:45:00Z">
+              <w:r>
+                <w:rPr>
+                  <w:rFonts w:ascii="Times New Roman" w:cs="Times New Roman" w:eastAsia="Times New Roman" w:hAnsi="Times New Roman"/>
+                  <w:b w:val="1"/>
+                  <w:bCs w:val="1"/>
+                  <w:color w:val="ffffff"/>
+                  <w:sz w:val="18"/>
+                  <w:szCs w:val="17"/>
+                  <w:rtl w:val="0"/>
+                </w:rPr>
+                <w:t xml:space="preserve">Mục</w:t>
+              </w:r>
+            </w:ins>
+          </w:p>
+        </w:tc>
+        <w:tc>
+          <w:tcPr>
+            <w:tcBorders>
+              <w:top w:color="000000" w:space="0" w:sz="5" w:val="single"/>
+              <w:left w:color="000000" w:space="0" w:sz="0" w:val="nil"/>
+              <w:bottom w:color="000000" w:space="0" w:sz="5" w:val="single"/>
+              <w:right w:color="000000" w:space="0" w:sz="5" w:val="single"/>
+            </w:tcBorders>
+            <w:shd w:fill="2f5597" w:val="clear"/>
+            <w:tcMar>
+              <w:top w:w="0.0" w:type="dxa"/>
+              <w:left w:w="100.0" w:type="dxa"/>
+              <w:bottom w:w="0.0" w:type="dxa"/>
+              <w:right w:w="100.0" w:type="dxa"/>
+            </w:tcMar>
+            <w:vAlign w:val="top"/>
+          </w:tcPr>
+          <w:p>
+            <w:pPr>
+              <w:keepNext/>
+              <w:ind w:left="0" w:right="0" w:firstLine="0"/>
+              <w:rPr>
+                <w:ins w:id="9050" w:author="Claude" w:date="2026-10-24T22:45:00Z"/>
+                <w:rFonts w:ascii="Times New Roman" w:cs="Times New Roman" w:eastAsia="Times New Roman" w:hAnsi="Times New Roman"/>
+                <w:b w:val="1"/>
+                <w:bCs w:val="1"/>
+                <w:color w:val="ffffff"/>
+                <w:sz w:val="17"/>
+                <w:szCs w:val="17"/>
+              </w:rPr>
+            </w:pPr>
+            <w:ins w:id="9051" w:author="Claude" w:date="2026-10-24T22:45:00Z">
+              <w:r>
+                <w:rPr>
+                  <w:rFonts w:ascii="Times New Roman" w:cs="Times New Roman" w:eastAsia="Times New Roman" w:hAnsi="Times New Roman"/>
+                  <w:b w:val="1"/>
+                  <w:bCs w:val="1"/>
+                  <w:color w:val="ffffff"/>
+                  <w:sz w:val="18"/>
+                  <w:szCs w:val="17"/>
+                  <w:rtl w:val="0"/>
+                </w:rPr>
+                <w:t xml:space="preserve">Nội dung</w:t>
+              </w:r>
+            </w:ins>
+          </w:p>
+        </w:tc>
+      </w:tr>
+      <w:tr>
+        <w:trPr>
+          <w:cantSplit w:val="0"/>
+          <w:tblHeader w:val="0"/>
+          <w:ins w:id="9052" w:author="Claude" w:date="2026-10-24T22:45:00Z"/>
+        </w:trPr>
+        <w:tc>
+          <w:tcPr>
+            <w:tcBorders>
+              <w:top w:color="000000" w:space="0" w:sz="0" w:val="nil"/>
+              <w:left w:color="000000" w:space="0" w:sz="5" w:val="single"/>
+              <w:bottom w:color="000000" w:space="0" w:sz="5" w:val="single"/>
+              <w:right w:color="000000" w:space="0" w:sz="5" w:val="single"/>
+            </w:tcBorders>
+            <w:tcMar>
+              <w:top w:w="0.0" w:type="dxa"/>
+              <w:left w:w="100.0" w:type="dxa"/>
+              <w:bottom w:w="0.0" w:type="dxa"/>
+              <w:right w:w="100.0" w:type="dxa"/>
+            </w:tcMar>
+            <w:vAlign w:val="top"/>
+          </w:tcPr>
+          <w:p>
+            <w:pPr>
+              <w:keepNext/>
+              <w:ind w:left="0" w:right="0" w:firstLine="0"/>
+              <w:rPr>
+                <w:ins w:id="9053" w:author="Claude" w:date="2026-10-24T22:45:00Z"/>
+                <w:rFonts w:ascii="Times New Roman" w:cs="Times New Roman" w:eastAsia="Times New Roman" w:hAnsi="Times New Roman"/>
+                <w:sz w:val="17"/>
+                <w:szCs w:val="17"/>
+              </w:rPr>
+            </w:pPr>
+            <w:ins w:id="9054" w:author="Claude" w:date="2026-10-24T22:45:00Z">
+              <w:r>
+                <w:rPr>
+                  <w:rFonts w:ascii="Times New Roman" w:cs="Times New Roman" w:eastAsia="Times New Roman" w:hAnsi="Times New Roman"/>
+                  <w:sz w:val="20"/>
+                  <w:szCs w:val="17"/>
+                  <w:rtl w:val="0"/>
+                </w:rPr>
+                <w:t xml:space="preserve">Tác nhân</w:t>
+              </w:r>
+            </w:ins>
+          </w:p>
+        </w:tc>
+        <w:tc>
+          <w:tcPr>
+            <w:tcBorders>
+              <w:top w:color="000000" w:space="0" w:sz="0" w:val="nil"/>
+              <w:left w:color="000000" w:space="0" w:sz="0" w:val="nil"/>
+              <w:bottom w:color="000000" w:space="0" w:sz="5" w:val="single"/>
+              <w:right w:color="000000" w:space="0" w:sz="5" w:val="single"/>
+            </w:tcBorders>
+            <w:tcMar>
+              <w:top w:w="0.0" w:type="dxa"/>
+              <w:left w:w="100.0" w:type="dxa"/>
+              <w:bottom w:w="0.0" w:type="dxa"/>
+              <w:right w:w="100.0" w:type="dxa"/>
+            </w:tcMar>
+            <w:vAlign w:val="top"/>
+          </w:tcPr>
+          <w:p>
+            <w:pPr>
+              <w:ind w:left="0" w:right="0" w:firstLine="0"/>
+              <w:rPr>
+                <w:ins w:id="9055" w:author="Claude" w:date="2026-10-24T22:45:00Z"/>
+              </w:rPr>
+            </w:pPr>
+            <w:ins w:id="9056" w:author="Claude" w:date="2026-10-24T22:45:00Z">
+              <w:r>
+                <w:rPr>
+                  <w:rFonts w:ascii="Times New Roman" w:hAnsi="Times New Roman"/>
+                  <w:sz w:val="20"/>
+                </w:rPr>
+                <w:t xml:space="preserve">Member; Receptionist; Center Manager</w:t>
+              </w:r>
+            </w:ins>
+          </w:p>
+        </w:tc>
+      </w:tr>
+      <w:tr>
+        <w:trPr>
+          <w:cantSplit w:val="0"/>
+          <w:tblHeader w:val="0"/>
+          <w:ins w:id="9057" w:author="Claude" w:date="2026-10-24T22:45:00Z"/>
+        </w:trPr>
+        <w:tc>
+          <w:tcPr>
+            <w:tcBorders>
+              <w:top w:color="000000" w:space="0" w:sz="0" w:val="nil"/>
+              <w:left w:color="000000" w:space="0" w:sz="5" w:val="single"/>
+              <w:bottom w:color="000000" w:space="0" w:sz="5" w:val="single"/>
+              <w:right w:color="000000" w:space="0" w:sz="5" w:val="single"/>
+            </w:tcBorders>
+            <w:tcMar>
+              <w:top w:w="0.0" w:type="dxa"/>
+              <w:left w:w="100.0" w:type="dxa"/>
+              <w:bottom w:w="0.0" w:type="dxa"/>
+              <w:right w:w="100.0" w:type="dxa"/>
+            </w:tcMar>
+            <w:vAlign w:val="top"/>
+          </w:tcPr>
+          <w:p>
+            <w:pPr>
+              <w:keepNext/>
+              <w:ind w:left="0" w:right="0" w:firstLine="0"/>
+              <w:rPr>
+                <w:ins w:id="9058" w:author="Claude" w:date="2026-10-24T22:45:00Z"/>
+                <w:rFonts w:ascii="Times New Roman" w:cs="Times New Roman" w:eastAsia="Times New Roman" w:hAnsi="Times New Roman"/>
+                <w:sz w:val="17"/>
+                <w:szCs w:val="17"/>
+              </w:rPr>
+            </w:pPr>
+            <w:ins w:id="9059" w:author="Claude" w:date="2026-10-24T22:45:00Z">
+              <w:r>
+                <w:rPr>
+                  <w:rFonts w:ascii="Times New Roman" w:cs="Times New Roman" w:eastAsia="Times New Roman" w:hAnsi="Times New Roman"/>
+                  <w:sz w:val="20"/>
+                  <w:szCs w:val="17"/>
+                  <w:rtl w:val="0"/>
+                </w:rPr>
+                <w:t xml:space="preserve">Mức ưu tiên</w:t>
+              </w:r>
+            </w:ins>
+          </w:p>
+        </w:tc>
+        <w:tc>
+          <w:tcPr>
+            <w:tcBorders>
+              <w:top w:color="000000" w:space="0" w:sz="0" w:val="nil"/>
+              <w:left w:color="000000" w:space="0" w:sz="0" w:val="nil"/>
+              <w:bottom w:color="000000" w:space="0" w:sz="5" w:val="single"/>
+              <w:right w:color="000000" w:space="0" w:sz="5" w:val="single"/>
+            </w:tcBorders>
+            <w:tcMar>
+              <w:top w:w="0.0" w:type="dxa"/>
+              <w:left w:w="100.0" w:type="dxa"/>
+              <w:bottom w:w="0.0" w:type="dxa"/>
+              <w:right w:w="100.0" w:type="dxa"/>
+            </w:tcMar>
+            <w:vAlign w:val="top"/>
+          </w:tcPr>
+          <w:p>
+            <w:pPr>
+              <w:ind w:left="0" w:right="0" w:firstLine="0"/>
+              <w:rPr>
+                <w:ins w:id="9060" w:author="Claude" w:date="2026-10-24T22:45:00Z"/>
+              </w:rPr>
+            </w:pPr>
+            <w:ins w:id="9061" w:author="Claude" w:date="2026-10-24T22:45:00Z">
+              <w:r>
+                <w:rPr>
+                  <w:rFonts w:ascii="Times New Roman" w:hAnsi="Times New Roman"/>
+                  <w:sz w:val="20"/>
+                </w:rPr>
+                <w:t xml:space="preserve">Required supporting</w:t>
+              </w:r>
+            </w:ins>
+          </w:p>
+        </w:tc>
+      </w:tr>
+      <w:tr>
+        <w:trPr>
+          <w:cantSplit w:val="0"/>
+          <w:tblHeader w:val="0"/>
+          <w:ins w:id="9062" w:author="Claude" w:date="2026-10-24T22:45:00Z"/>
+        </w:trPr>
+        <w:tc>
+          <w:tcPr>
+            <w:tcBorders>
+              <w:top w:color="000000" w:space="0" w:sz="0" w:val="nil"/>
+              <w:left w:color="000000" w:space="0" w:sz="5" w:val="single"/>
+              <w:bottom w:color="000000" w:space="0" w:sz="5" w:val="single"/>
+              <w:right w:color="000000" w:space="0" w:sz="5" w:val="single"/>
+            </w:tcBorders>
+            <w:tcMar>
+              <w:top w:w="0.0" w:type="dxa"/>
+              <w:left w:w="100.0" w:type="dxa"/>
+              <w:bottom w:w="0.0" w:type="dxa"/>
+              <w:right w:w="100.0" w:type="dxa"/>
+            </w:tcMar>
+            <w:vAlign w:val="top"/>
+          </w:tcPr>
+          <w:p>
+            <w:pPr>
+              <w:keepNext/>
+              <w:ind w:left="0" w:right="0" w:firstLine="0"/>
+              <w:rPr>
+                <w:ins w:id="9063" w:author="Claude" w:date="2026-10-24T22:45:00Z"/>
+                <w:rFonts w:ascii="Times New Roman" w:cs="Times New Roman" w:eastAsia="Times New Roman" w:hAnsi="Times New Roman"/>
+                <w:sz w:val="17"/>
+                <w:szCs w:val="17"/>
+              </w:rPr>
+            </w:pPr>
+            <w:ins w:id="9064" w:author="Claude" w:date="2026-10-24T22:45:00Z">
+              <w:r>
+                <w:rPr>
+                  <w:rFonts w:ascii="Times New Roman" w:cs="Times New Roman" w:eastAsia="Times New Roman" w:hAnsi="Times New Roman"/>
+                  <w:sz w:val="20"/>
+                  <w:szCs w:val="17"/>
+                  <w:rtl w:val="0"/>
+                </w:rPr>
+                <w:t xml:space="preserve">Tiền điều kiện</w:t>
+              </w:r>
+            </w:ins>
+          </w:p>
+        </w:tc>
+        <w:tc>
+          <w:tcPr>
+            <w:tcBorders>
+              <w:top w:color="000000" w:space="0" w:sz="0" w:val="nil"/>
+              <w:left w:color="000000" w:space="0" w:sz="0" w:val="nil"/>
+              <w:bottom w:color="000000" w:space="0" w:sz="5" w:val="single"/>
+              <w:right w:color="000000" w:space="0" w:sz="5" w:val="single"/>
+            </w:tcBorders>
+            <w:tcMar>
+              <w:top w:w="0.0" w:type="dxa"/>
+              <w:left w:w="100.0" w:type="dxa"/>
+              <w:bottom w:w="0.0" w:type="dxa"/>
+              <w:right w:w="100.0" w:type="dxa"/>
+            </w:tcMar>
+            <w:vAlign w:val="top"/>
+          </w:tcPr>
+          <w:p>
+            <w:pPr>
+              <w:ind w:left="0" w:right="0" w:firstLine="0"/>
+              <w:rPr>
+                <w:ins w:id="9065" w:author="Claude" w:date="2026-10-24T22:45:00Z"/>
+              </w:rPr>
+            </w:pPr>
+            <w:ins w:id="9066" w:author="Claude" w:date="2026-10-24T22:45:00Z">
+              <w:r>
+                <w:rPr>
+                  <w:rFonts w:ascii="Times New Roman" w:hAnsi="Times New Roman"/>
+                  <w:sz w:val="20"/>
+                </w:rPr>
+                <w:t xml:space="preserve">Member đã đăng nhập. Request PAYMENT cũng được dùng khi Member chọn hoàn tiền sau sự cố phía trung tâm (BR-154). Với request PAYMENT: Member có hóa đơn đã thanh toán bằng VNPay của chính mình và hóa đơn đó chưa có request PAYMENT đang mở.</w:t>
+              </w:r>
+            </w:ins>
+          </w:p>
+        </w:tc>
+      </w:tr>
+      <w:tr>
+        <w:trPr>
+          <w:cantSplit w:val="0"/>
+          <w:tblHeader w:val="0"/>
+          <w:ins w:id="9067" w:author="Claude" w:date="2026-10-24T22:45:00Z"/>
+        </w:trPr>
+        <w:tc>
+          <w:tcPr>
+            <w:tcBorders>
+              <w:top w:color="000000" w:space="0" w:sz="0" w:val="nil"/>
+              <w:left w:color="000000" w:space="0" w:sz="5" w:val="single"/>
+              <w:bottom w:color="000000" w:space="0" w:sz="5" w:val="single"/>
+              <w:right w:color="000000" w:space="0" w:sz="5" w:val="single"/>
+            </w:tcBorders>
+            <w:tcMar>
+              <w:top w:w="0.0" w:type="dxa"/>
+              <w:left w:w="100.0" w:type="dxa"/>
+              <w:bottom w:w="0.0" w:type="dxa"/>
+              <w:right w:w="100.0" w:type="dxa"/>
+            </w:tcMar>
+            <w:vAlign w:val="top"/>
+          </w:tcPr>
+          <w:p>
+            <w:pPr>
+              <w:keepNext/>
+              <w:ind w:left="0" w:right="0" w:firstLine="0"/>
+              <w:rPr>
+                <w:ins w:id="9068" w:author="Claude" w:date="2026-10-24T22:45:00Z"/>
+                <w:rFonts w:ascii="Times New Roman" w:cs="Times New Roman" w:eastAsia="Times New Roman" w:hAnsi="Times New Roman"/>
+                <w:sz w:val="17"/>
+                <w:szCs w:val="17"/>
+              </w:rPr>
+            </w:pPr>
+            <w:ins w:id="9069" w:author="Claude" w:date="2026-10-24T22:45:00Z">
+              <w:r>
+                <w:rPr>
+                  <w:rFonts w:ascii="Times New Roman" w:cs="Times New Roman" w:eastAsia="Times New Roman" w:hAnsi="Times New Roman"/>
+                  <w:sz w:val="20"/>
+                  <w:szCs w:val="17"/>
+                  <w:rtl w:val="0"/>
+                </w:rPr>
+                <w:t xml:space="preserve">Luồng chính</w:t>
+              </w:r>
+            </w:ins>
+          </w:p>
+        </w:tc>
+        <w:tc>
+          <w:tcPr>
+            <w:tcBorders>
+              <w:top w:color="000000" w:space="0" w:sz="0" w:val="nil"/>
+              <w:left w:color="000000" w:space="0" w:sz="0" w:val="nil"/>
+              <w:bottom w:color="000000" w:space="0" w:sz="5" w:val="single"/>
+              <w:right w:color="000000" w:space="0" w:sz="5" w:val="single"/>
+            </w:tcBorders>
+            <w:tcMar>
+              <w:top w:w="0.0" w:type="dxa"/>
+              <w:left w:w="100.0" w:type="dxa"/>
+              <w:bottom w:w="0.0" w:type="dxa"/>
+              <w:right w:w="100.0" w:type="dxa"/>
+            </w:tcMar>
+            <w:vAlign w:val="top"/>
+          </w:tcPr>
+          <w:p>
+            <w:pPr>
+              <w:ind w:left="0" w:right="0" w:firstLine="0"/>
+              <w:rPr>
+                <w:ins w:id="9070" w:author="Claude" w:date="2026-10-24T22:45:00Z"/>
+              </w:rPr>
+            </w:pPr>
+            <w:ins w:id="9071" w:author="Claude" w:date="2026-10-24T22:45:00Z">
+              <w:r>
+                <w:rPr>
+                  <w:rFonts w:ascii="Times New Roman" w:hAnsi="Times New Roman"/>
+                  <w:sz w:val="20"/>
+                </w:rPr>
+                <w:t xml:space="preserve">1. Member gửi Support Request từ trang Trợ giúp; với danh mục PAYMENT chọn hóa đơn, nhập số tài khoản, tên ngân hàng, tên chủ tài khoản và đính kèm 1 đến 3 ảnh minh chứng; request vào hàng đợi OPEN với slaDueAtUtc = thời điểm tạo + 48 giờ (BR-147, BR-150). 2. Receptionist tiếp nhận, chuyển hoặc ghi chú; Center Manager xử lý. 3. Center Manager chuyển khoản ngoài hệ thống, chọn "Record payout", nhập số tiền và đính kèm 1 đến 3 ảnh chứng từ; hệ thống ghi một lần, đóng request (DONE), ghi Audit Log SUPPORT_PAYOUT_RECORDED, gửi thông báo và email cho Member và đưa số tiền vào báo cáo doanh thu, dashboard ở dòng "đã hoàn chuyển khoản" (BR-151). 4. Member xem ảnh chứng từ và bấm "I received it" hoặc "Not received"; không bấm gì sau 3 ngày thì hệ thống tự coi là đã nhận (BR-152).</w:t>
+              </w:r>
+            </w:ins>
+          </w:p>
+        </w:tc>
+      </w:tr>
+      <w:tr>
+        <w:trPr>
+          <w:cantSplit w:val="0"/>
+          <w:tblHeader w:val="0"/>
+          <w:ins w:id="9072" w:author="Claude" w:date="2026-10-24T22:45:00Z"/>
+        </w:trPr>
+        <w:tc>
+          <w:tcPr>
+            <w:tcBorders>
+              <w:top w:color="000000" w:space="0" w:sz="0" w:val="nil"/>
+              <w:left w:color="000000" w:space="0" w:sz="5" w:val="single"/>
+              <w:bottom w:color="000000" w:space="0" w:sz="5" w:val="single"/>
+              <w:right w:color="000000" w:space="0" w:sz="5" w:val="single"/>
+            </w:tcBorders>
+            <w:tcMar>
+              <w:top w:w="0.0" w:type="dxa"/>
+              <w:left w:w="100.0" w:type="dxa"/>
+              <w:bottom w:w="0.0" w:type="dxa"/>
+              <w:right w:w="100.0" w:type="dxa"/>
+            </w:tcMar>
+            <w:vAlign w:val="top"/>
+          </w:tcPr>
+          <w:p>
+            <w:pPr>
+              <w:keepNext/>
+              <w:ind w:left="0" w:right="0" w:firstLine="0"/>
+              <w:rPr>
+                <w:ins w:id="9073" w:author="Claude" w:date="2026-10-24T22:45:00Z"/>
+                <w:rFonts w:ascii="Times New Roman" w:cs="Times New Roman" w:eastAsia="Times New Roman" w:hAnsi="Times New Roman"/>
+                <w:sz w:val="17"/>
+                <w:szCs w:val="17"/>
+              </w:rPr>
+            </w:pPr>
+            <w:ins w:id="9074" w:author="Claude" w:date="2026-10-24T22:45:00Z">
+              <w:r>
+                <w:rPr>
+                  <w:rFonts w:ascii="Times New Roman" w:cs="Times New Roman" w:eastAsia="Times New Roman" w:hAnsi="Times New Roman"/>
+                  <w:sz w:val="20"/>
+                  <w:szCs w:val="17"/>
+                  <w:rtl w:val="0"/>
+                </w:rPr>
+                <w:t xml:space="preserve">Luồng thay thế / ngoại lệ</w:t>
+              </w:r>
+            </w:ins>
+          </w:p>
+        </w:tc>
+        <w:tc>
+          <w:tcPr>
+            <w:tcBorders>
+              <w:top w:color="000000" w:space="0" w:sz="0" w:val="nil"/>
+              <w:left w:color="000000" w:space="0" w:sz="0" w:val="nil"/>
+              <w:bottom w:color="000000" w:space="0" w:sz="5" w:val="single"/>
+              <w:right w:color="000000" w:space="0" w:sz="5" w:val="single"/>
+            </w:tcBorders>
+            <w:tcMar>
+              <w:top w:w="0.0" w:type="dxa"/>
+              <w:left w:w="100.0" w:type="dxa"/>
+              <w:bottom w:w="0.0" w:type="dxa"/>
+              <w:right w:w="100.0" w:type="dxa"/>
+            </w:tcMar>
+            <w:vAlign w:val="top"/>
+          </w:tcPr>
+          <w:p>
+            <w:pPr>
+              <w:ind w:left="0" w:right="0" w:firstLine="0"/>
+              <w:rPr>
+                <w:ins w:id="9075" w:author="Claude" w:date="2026-10-24T22:45:00Z"/>
+              </w:rPr>
+            </w:pPr>
+            <w:ins w:id="9076" w:author="Claude" w:date="2026-10-24T22:45:00Z">
+              <w:r>
+                <w:rPr>
+                  <w:rFonts w:ascii="Times New Roman" w:hAnsi="Times New Roman"/>
+                  <w:sz w:val="20"/>
+                </w:rPr>
+                <w:t xml:space="preserve">Chọn PAYMENT mà thiếu hóa đơn, thông tin tài khoản hoặc ảnh (không đủ 1 đến 3) bị từ chối 400 (payment_request_invoice_required, payment_request_bank_required, payment_request_proof_required); hóa đơn đã có request PAYMENT đang mở (409 payment_request_already_open). Receptionist ghi nhận chuyển khoản bị từ chối (403). Số tiền vượt phần đã thu (409 payout_amount_exceeds_paid), ghi lần hai (409 payout_already_recorded) hoặc thiếu ảnh chứng từ (400 payout_proof_required) bị từ chối. Center Manager có thể Reject kèm lý do. Member bấm "Not received" thì request về OPEN và thông báo Center Manager. Request quá 48 giờ chưa xử lý: Member được gửi lại ("Remind us", cách nhau tối thiểu 48 giờ) và hệ thống nhắc nhân viên (BR-148, BR-149). Số tài khoản được mã hóa, không ghi log và xóa sau 90 ngày kể từ khi đóng request, giữ toàn bộ ảnh (BR-153).</w:t>
+              </w:r>
+            </w:ins>
+          </w:p>
+        </w:tc>
+      </w:tr>
+      <w:tr>
+        <w:trPr>
+          <w:cantSplit w:val="0"/>
+          <w:tblHeader w:val="0"/>
+          <w:ins w:id="9077" w:author="Claude" w:date="2026-10-24T22:45:00Z"/>
+        </w:trPr>
+        <w:tc>
+          <w:tcPr>
+            <w:tcBorders>
+              <w:top w:color="000000" w:space="0" w:sz="0" w:val="nil"/>
+              <w:left w:color="000000" w:space="0" w:sz="5" w:val="single"/>
+              <w:bottom w:color="000000" w:space="0" w:sz="5" w:val="single"/>
+              <w:right w:color="000000" w:space="0" w:sz="5" w:val="single"/>
+            </w:tcBorders>
+            <w:tcMar>
+              <w:top w:w="0.0" w:type="dxa"/>
+              <w:left w:w="100.0" w:type="dxa"/>
+              <w:bottom w:w="0.0" w:type="dxa"/>
+              <w:right w:w="100.0" w:type="dxa"/>
+            </w:tcMar>
+            <w:vAlign w:val="top"/>
+          </w:tcPr>
+          <w:p>
+            <w:pPr>
+              <w:keepNext w:val="0"/>
+              <w:ind w:left="0" w:right="0" w:firstLine="0"/>
+              <w:rPr>
+                <w:ins w:id="9078" w:author="Claude" w:date="2026-10-24T22:45:00Z"/>
+                <w:rFonts w:ascii="Times New Roman" w:cs="Times New Roman" w:eastAsia="Times New Roman" w:hAnsi="Times New Roman"/>
+                <w:sz w:val="17"/>
+                <w:szCs w:val="17"/>
+              </w:rPr>
+            </w:pPr>
+            <w:ins w:id="9079" w:author="Claude" w:date="2026-10-24T22:45:00Z">
+              <w:r>
+                <w:rPr>
+                  <w:rFonts w:ascii="Times New Roman" w:cs="Times New Roman" w:eastAsia="Times New Roman" w:hAnsi="Times New Roman"/>
+                  <w:sz w:val="20"/>
+                  <w:szCs w:val="17"/>
+                  <w:rtl w:val="0"/>
+                </w:rPr>
+                <w:t xml:space="preserve">Hậu điều kiện</w:t>
+              </w:r>
+            </w:ins>
+          </w:p>
+        </w:tc>
+        <w:tc>
+          <w:tcPr>
+            <w:tcBorders>
+              <w:top w:color="000000" w:space="0" w:sz="0" w:val="nil"/>
+              <w:left w:color="000000" w:space="0" w:sz="0" w:val="nil"/>
+              <w:bottom w:color="000000" w:space="0" w:sz="5" w:val="single"/>
+              <w:right w:color="000000" w:space="0" w:sz="5" w:val="single"/>
+            </w:tcBorders>
+            <w:tcMar>
+              <w:top w:w="0.0" w:type="dxa"/>
+              <w:left w:w="100.0" w:type="dxa"/>
+              <w:bottom w:w="0.0" w:type="dxa"/>
+              <w:right w:w="100.0" w:type="dxa"/>
+            </w:tcMar>
+            <w:vAlign w:val="top"/>
+          </w:tcPr>
+          <w:p>
+            <w:pPr>
+              <w:ind w:left="0" w:right="0" w:firstLine="0"/>
+              <w:rPr>
+                <w:ins w:id="9080" w:author="Claude" w:date="2026-10-24T22:45:00Z"/>
+              </w:rPr>
+            </w:pPr>
+            <w:ins w:id="9081" w:author="Claude" w:date="2026-10-24T22:45:00Z">
+              <w:r>
+                <w:rPr>
+                  <w:rFonts w:ascii="Times New Roman" w:hAnsi="Times New Roman"/>
+                  <w:sz w:val="20"/>
+                </w:rPr>
+                <w:t xml:space="preserve">Request CLOSED (DONE hoặc REJECTED) có lịch sử và Audit Log; mỗi request chỉ có một lần ghi nhận chuyển khoản và tổng số tiền đã chuyển cho một hóa đơn không vượt phần VNPay đã thu; không gọi API ngân hàng hay VNPay Refund API.</w:t>
+              </w:r>
+            </w:ins>
+          </w:p>
+        </w:tc>
+      </w:tr>
+    </w:tbl>
+    <w:p>
+      <w:pPr>
         <w:keepNext/>
         <w:pageBreakBefore/>
         <w:spacing w:after="240" w:before="240" w:lineRule="auto"/>
@@ -24405,6 +25781,11 @@
       <w:r>
         <w:t xml:space="preserve">Checkout tạo Invoice/InvoiceItem snapshot → chọn điểm (tùy chọn) → PaymentAttempt VNPay-QR cho phần tiền còn lại → IPN/QueryDR → transactional fulfillment → email receipt. Refund request theo InvoiceItem → Manager approve/reject → backend cộng điểm vào ví trong cùng transaction (không gọi VNPay Refund API). Doanh thu cash basis theo ngày thu tiền (vnp_PayDate).</w:t>
       </w:r>
+      <w:ins w:id="9082" w:author="Claude" w:date="2026-10-24T22:45:00Z">
+        <w:r>
+          <w:t xml:space="preserve"> Vé Gym ngày bán 06:00–22:00 và hết hạn 22:00 cùng ngày. Thanh toán đến muộn: còn chỗ thì tự cấp quyền lợi, không thì Member nhận điểm ngay hoặc gửi Support Request. Support Request PAYMENT: Member gửi kèm thông tin nhận tiền và ảnh minh chứng → Center Manager chuyển khoản ngoài hệ thống và Record payout → thông báo, email Member → Member xác nhận (hoặc tự xác nhận sau 3 ngày).</w:t>
+        </w:r>
+      </w:ins>
     </w:p>
     <w:p>
       <w:pPr>
@@ -24664,6 +26045,11 @@
       <w:r>
         <w:t>Invoice: Issued, Paid, Void, PaidAfterReconciliation. Checkout/attempt quản lý expiry. Chỉ backend xác minh IPN/QueryDR hoặc hoàn tất bằng toàn điểm mới cấp quyền lợi; Return không xác nhận payment. Snapshot đã trả không sửa theo catalog.</w:t>
       </w:r>
+      <w:ins w:id="9083" w:author="Claude" w:date="2026-10-24T22:45:00Z">
+        <w:r>
+          <w:t xml:space="preserve"> Khi tiền về muộn, fulfillmentOutcome là FULFILLED (tự cấp quyền lợi) hoặc RECONCILIATION_REQUIRED; Invoice chuyển COMPENSATED khi Member chọn nhận điểm ngay (BR-88).</w:t>
+        </w:r>
+      </w:ins>
     </w:p>
     <w:p>
       <w:pPr>
@@ -24692,8 +26078,18 @@
         </w:rPr>
       </w:pPr>
       <w:r>
-        <w:t>Refund dùng PaymentAdjustment theo InvoiceItem: Requested → Rejected hoặc được duyệt/Completed cùng ledger credit và hủy quyền lợi trong transaction. Chỉ hoàn bằng điểm, không dùng VNPay Refund API.</w:t>
+        <w:t xml:space="preserve">Refund dùng PaymentAdjustment theo InvoiceItem: Requested → Rejected hoặc được duyệt/Completed cùng ledger credit và hủy quyền lợi trong transaction. </w:t>
       </w:r>
+      <w:del w:id="9084" w:author="Claude" w:date="2026-10-24T22:45:00Z">
+        <w:r>
+          <w:delText xml:space="preserve">Chỉ hoàn bằng điểm, không dùng VNPay Refund API.</w:delText>
+        </w:r>
+      </w:del>
+      <w:ins w:id="9085" w:author="Claude" w:date="2026-10-24T22:45:00Z">
+        <w:r>
+          <w:t xml:space="preserve">Hoàn tự động chỉ bằng điểm, không dùng VNPay Refund API; hoàn chuyển khoản đi qua Support Request (OPEN → ASSIGNED → IN_PROGRESS → CLOSED, kết quả DONE hoặc REJECTED) và được ghi nhận một lần ở member_support_payouts; Member báo chưa nhận thì request về OPEN, không phản hồi sau 3 ngày thì tự xác nhận đã nhận.</w:t>
+        </w:r>
+      </w:ins>
     </w:p>
     <w:p>
       <w:pPr>
@@ -24770,6 +26166,11 @@
       <w:r>
         <w:t>Mô hình dữ liệu và field xem docs/Center-Management-System-Design-v3.md. Lớp nhóm dùng Class/Enrollment/ClassSession/ClassTeachingRecord; điểm danh theo Enrollment và Session. Hoàn điểm dùng PaymentAdjustment và PointLedgerEntry. Không có gói PT 1:1 trong phạm vi hiện hành.</w:t>
       </w:r>
+      <w:ins w:id="9086" w:author="Claude" w:date="2026-10-24T22:45:00Z">
+        <w:r>
+          <w:t xml:space="preserve"> Support Request hoàn chuyển khoản dùng member_support_requests (thêm sla_due_at_utc, invoice_id, remind_count), member_support_payout_details (số tài khoản mã hóa), member_support_payouts và member_support_attachments (Payment-Support-Workflow.md mục 7; đề xuất, chưa triển khai).</w:t>
+        </w:r>
+      </w:ins>
     </w:p>
     <w:p>
       <w:pPr>
@@ -24781,6 +26182,11 @@
       <w:r>
         <w:t>Mô hình dữ liệu và field xem docs/Center-Management-System-Design-v3.md. Lớp nhóm dùng Class/Enrollment/ClassSession/ClassTeachingRecord; điểm danh theo Enrollment và Session. Hoàn điểm dùng PaymentAdjustment và PointLedgerEntry. Không có gói PT 1:1 trong phạm vi hiện hành.</w:t>
       </w:r>
+      <w:ins w:id="9087" w:author="Claude" w:date="2026-10-24T22:45:00Z">
+        <w:r>
+          <w:t xml:space="preserve"> Support Request hoàn chuyển khoản dùng member_support_requests (thêm sla_due_at_utc, invoice_id, remind_count), member_support_payout_details (số tài khoản mã hóa), member_support_payouts và member_support_attachments (Payment-Support-Workflow.md mục 7; đề xuất, chưa triển khai).</w:t>
+        </w:r>
+      </w:ins>
     </w:p>
     <w:p>
       <w:pPr>

</xml_diff>

<commit_message>
feat: complete member support and refund resolution workflow
Add Member Help requests with SLA reminders, payment payout proof and receipt confirmation, and late-payment choices to convert to points or request support.

Require eligible VNPay invoices for payment support, reserve handling for managers, require payout notes, remove stored bank details with a migration, and update support reminders.

Unify six support statuses and colors across roles, complete the final progress step, update notifications, docs and tests, and remove obsolete files and generated artifacts.
</commit_message>
<xml_diff>
--- a/docs/SWP391_Report_SRS.docx
+++ b/docs/SWP391_Report_SRS.docx
@@ -1389,7 +1389,7 @@
                   <w:rFonts w:ascii="Times New Roman" w:hAnsi="Times New Roman"/>
                   <w:sz w:val="20"/>
                 </w:rPr>
-                <w:t xml:space="preserve">, xử lý Support Request và ghi nhận hoàn chuyển khoản (BR-151)</w:t>
+                <w:t xml:space="preserve">, xử lý Support Request, liên hệ Member qua điện thoại, ghi chú và ghi nhận hoàn chuyển khoản (BR-151), tặng điểm bồi thường sự cố Gym (BR-155)</w:t>
               </w:r>
             </w:ins>
             <w:r>
@@ -1641,7 +1641,7 @@
                   <w:rFonts w:ascii="Times New Roman" w:hAnsi="Times New Roman"/>
                   <w:sz w:val="20"/>
                 </w:rPr>
-                <w:t xml:space="preserve">; tiếp nhận, chuyển hoặc ghi chú Support Request (không ghi nhận chuyển khoản)</w:t>
+                <w:t xml:space="preserve">; ghi nhận Support Request hộ Member; với request PAYMENT chỉ xem và hỗ trợ Member gửi lại, không xử lý hay ghi nhận chuyển khoản</w:t>
               </w:r>
             </w:ins>
             <w:r>
@@ -8050,7 +8050,82 @@
                   <w:rFonts w:ascii="Times New Roman" w:hAnsi="Times New Roman"/>
                   <w:sz w:val="20"/>
                 </w:rPr>
-                <w:t xml:space="preserve">Support Request: Member tự gửi từ trang Trợ giúp, SLA 48 giờ, Remind us, nhắc nhân viên; request PAYMENT hoàn chuyển khoản do Center Manager ghi nhận, Member xác nhận; bảo vệ dữ liệu tài khoản ngân hàng; sự cố phía trung tâm: Member chọn nhận điểm ngay hoặc hoàn tiền qua Support Request.</w:t>
+                <w:t xml:space="preserve">Support Request: Member tự gửi từ trang Trợ giúp, SLA 48 giờ, Remind us, nhắc nhân viên; request PAYMENT hoàn chuyển khoản chỉ do Center Manager xử lý (liên hệ Member qua điện thoại, ghi chú, ghi nhận), Receptionist chỉ xem và hỗ trợ gửi lại, Member xác nhận; không thu thập số tài khoản; sự cố phía trung tâm: Member chọn nhận điểm ngay hoặc hoàn tiền qua Support Request, không chọn thì tự hoàn điểm sau 2 ngày.</w:t>
+              </w:r>
+            </w:ins>
+          </w:p>
+        </w:tc>
+      </w:tr>
+      <w:tr>
+        <w:trPr>
+          <w:cantSplit w:val="0"/>
+          <w:tblHeader w:val="0"/>
+          <w:ins w:id="9024" w:author="Claude" w:date="2026-10-24T22:45:00Z"/>
+        </w:trPr>
+        <w:tc>
+          <w:tcPr>
+            <w:tcBorders>
+              <w:top w:color="000000" w:space="0" w:sz="0" w:val="nil"/>
+              <w:left w:color="000000" w:space="0" w:sz="5" w:val="single"/>
+              <w:bottom w:color="000000" w:space="0" w:sz="5" w:val="single"/>
+              <w:right w:color="000000" w:space="0" w:sz="5" w:val="single"/>
+            </w:tcBorders>
+            <w:tcMar>
+              <w:top w:w="0.0" w:type="dxa"/>
+              <w:left w:w="100.0" w:type="dxa"/>
+              <w:bottom w:w="0.0" w:type="dxa"/>
+              <w:right w:w="100.0" w:type="dxa"/>
+            </w:tcMar>
+            <w:vAlign w:val="top"/>
+          </w:tcPr>
+          <w:p>
+            <w:pPr>
+              <w:ind w:left="0" w:right="0" w:firstLine="0"/>
+              <w:rPr>
+                <w:ins w:id="9025" w:author="Claude" w:date="2026-10-24T22:45:00Z"/>
+              </w:rPr>
+            </w:pPr>
+            <w:ins w:id="9026" w:author="Claude" w:date="2026-10-24T22:45:00Z">
+              <w:r>
+                <w:rPr>
+                  <w:rFonts w:ascii="Times New Roman" w:hAnsi="Times New Roman"/>
+                  <w:sz w:val="20"/>
+                </w:rPr>
+                <w:t xml:space="preserve">BR-155</w:t>
+              </w:r>
+            </w:ins>
+          </w:p>
+        </w:tc>
+        <w:tc>
+          <w:tcPr>
+            <w:tcBorders>
+              <w:top w:color="000000" w:space="0" w:sz="0" w:val="nil"/>
+              <w:left w:color="000000" w:space="0" w:sz="0" w:val="nil"/>
+              <w:bottom w:color="000000" w:space="0" w:sz="5" w:val="single"/>
+              <w:right w:color="000000" w:space="0" w:sz="5" w:val="single"/>
+            </w:tcBorders>
+            <w:tcMar>
+              <w:top w:w="0.0" w:type="dxa"/>
+              <w:left w:w="100.0" w:type="dxa"/>
+              <w:bottom w:w="0.0" w:type="dxa"/>
+              <w:right w:w="100.0" w:type="dxa"/>
+            </w:tcMar>
+            <w:vAlign w:val="top"/>
+          </w:tcPr>
+          <w:p>
+            <w:pPr>
+              <w:ind w:left="0" w:right="0" w:firstLine="0"/>
+              <w:rPr>
+                <w:ins w:id="9027" w:author="Claude" w:date="2026-10-24T22:45:00Z"/>
+              </w:rPr>
+            </w:pPr>
+            <w:ins w:id="9028" w:author="Claude" w:date="2026-10-24T22:45:00Z">
+              <w:r>
+                <w:rPr>
+                  <w:rFonts w:ascii="Times New Roman" w:hAnsi="Times New Roman"/>
+                  <w:sz w:val="20"/>
+                </w:rPr>
+                <w:t xml:space="preserve">Sự cố Gym tạm thời: Center Manager tặng điểm (tự nhập số điểm, lọc người hoặc nhóm nhận) thay cho gia hạn Membership.</w:t>
               </w:r>
             </w:ins>
           </w:p>
@@ -11401,7 +11476,7 @@
         <w:trPr>
           <w:cantSplit w:val="0"/>
           <w:tblHeader w:val="0"/>
-          <w:ins w:id="9024" w:author="Claude" w:date="2026-10-24T22:45:00Z"/>
+          <w:ins w:id="9029" w:author="Claude" w:date="2026-10-24T22:45:00Z"/>
         </w:trPr>
         <w:tc>
           <w:tcPr>
@@ -11423,13 +11498,13 @@
             <w:pPr>
               <w:ind w:left="0" w:right="0" w:firstLine="0"/>
               <w:rPr>
-                <w:ins w:id="9025" w:author="Claude" w:date="2026-10-24T22:45:00Z"/>
+                <w:ins w:id="9030" w:author="Claude" w:date="2026-10-24T22:45:00Z"/>
                 <w:rFonts w:ascii="Times New Roman" w:cs="Times New Roman" w:eastAsia="Times New Roman" w:hAnsi="Times New Roman"/>
                 <w:sz w:val="15"/>
                 <w:szCs w:val="15"/>
               </w:rPr>
             </w:pPr>
-            <w:ins w:id="9026" w:author="Claude" w:date="2026-10-24T22:45:00Z">
+            <w:ins w:id="9031" w:author="Claude" w:date="2026-10-24T22:45:00Z">
               <w:r>
                 <w:rPr>
                   <w:rFonts w:ascii="Times New Roman" w:cs="Times New Roman" w:eastAsia="Times New Roman" w:hAnsi="Times New Roman"/>
@@ -11462,13 +11537,13 @@
             <w:pPr>
               <w:ind w:left="0" w:right="0" w:firstLine="0"/>
               <w:rPr>
-                <w:ins w:id="9027" w:author="Claude" w:date="2026-10-24T22:45:00Z"/>
+                <w:ins w:id="9032" w:author="Claude" w:date="2026-10-24T22:45:00Z"/>
                 <w:rFonts w:ascii="Times New Roman" w:cs="Times New Roman" w:eastAsia="Times New Roman" w:hAnsi="Times New Roman"/>
                 <w:sz w:val="15"/>
                 <w:szCs w:val="15"/>
               </w:rPr>
             </w:pPr>
-            <w:ins w:id="9028" w:author="Claude" w:date="2026-10-24T22:45:00Z">
+            <w:ins w:id="9033" w:author="Claude" w:date="2026-10-24T22:45:00Z">
               <w:r>
                 <w:rPr>
                   <w:rFonts w:ascii="Times New Roman" w:cs="Times New Roman" w:eastAsia="Times New Roman" w:hAnsi="Times New Roman"/>
@@ -11501,13 +11576,13 @@
             <w:pPr>
               <w:ind w:left="0" w:right="0" w:firstLine="0"/>
               <w:rPr>
-                <w:ins w:id="9029" w:author="Claude" w:date="2026-10-24T22:45:00Z"/>
+                <w:ins w:id="9034" w:author="Claude" w:date="2026-10-24T22:45:00Z"/>
                 <w:rFonts w:ascii="Times New Roman" w:cs="Times New Roman" w:eastAsia="Times New Roman" w:hAnsi="Times New Roman"/>
                 <w:sz w:val="15"/>
                 <w:szCs w:val="15"/>
               </w:rPr>
             </w:pPr>
-            <w:ins w:id="9030" w:author="Claude" w:date="2026-10-24T22:45:00Z">
+            <w:ins w:id="9035" w:author="Claude" w:date="2026-10-24T22:45:00Z">
               <w:r>
                 <w:rPr>
                   <w:rFonts w:ascii="Times New Roman" w:cs="Times New Roman" w:eastAsia="Times New Roman" w:hAnsi="Times New Roman"/>
@@ -11540,13 +11615,13 @@
             <w:pPr>
               <w:ind w:left="0" w:right="0" w:firstLine="0"/>
               <w:rPr>
-                <w:ins w:id="9031" w:author="Claude" w:date="2026-10-24T22:45:00Z"/>
+                <w:ins w:id="9036" w:author="Claude" w:date="2026-10-24T22:45:00Z"/>
                 <w:rFonts w:ascii="Times New Roman" w:cs="Times New Roman" w:eastAsia="Times New Roman" w:hAnsi="Times New Roman"/>
                 <w:sz w:val="15"/>
                 <w:szCs w:val="15"/>
               </w:rPr>
             </w:pPr>
-            <w:ins w:id="9032" w:author="Claude" w:date="2026-10-24T22:45:00Z">
+            <w:ins w:id="9037" w:author="Claude" w:date="2026-10-24T22:45:00Z">
               <w:r>
                 <w:rPr>
                   <w:rFonts w:ascii="Times New Roman" w:cs="Times New Roman" w:eastAsia="Times New Roman" w:hAnsi="Times New Roman"/>
@@ -11611,12 +11686,12 @@
       <w:r>
         <w:t xml:space="preserve">UC-15 covers checkout, points plus VNPay, PaymentAttempt, verified IPN/QueryDR and fulfillment. UC-16 covers InvoiceItem-based point refund request, approval and atomic wallet credit; </w:t>
       </w:r>
-      <w:del w:id="9033" w:author="Claude" w:date="2026-10-24T22:45:00Z">
+      <w:del w:id="9038" w:author="Claude" w:date="2026-10-24T22:45:00Z">
         <w:r>
           <w:delText xml:space="preserve">no bank or gateway refund.</w:delText>
         </w:r>
       </w:del>
-      <w:ins w:id="9034" w:author="Claude" w:date="2026-10-24T22:45:00Z">
+      <w:ins w:id="9039" w:author="Claude" w:date="2026-10-24T22:45:00Z">
         <w:r>
           <w:t xml:space="preserve">no gateway refund; bank-transfer refund is requested only through a Support Request and recorded by the Center Manager (UC-22).</w:t>
         </w:r>
@@ -11669,7 +11744,7 @@
         </w:rPr>
         <w:t xml:space="preserve">• </w:t>
       </w:r>
-      <w:del w:id="9035" w:author="Claude" w:date="2026-10-24T22:45:00Z">
+      <w:del w:id="9040" w:author="Claude" w:date="2026-10-24T22:45:00Z">
         <w:r>
           <w:rPr>
             <w:rFonts w:ascii="Times New Roman" w:cs="Times New Roman" w:eastAsia="Times New Roman" w:hAnsi="Times New Roman"/>
@@ -11678,7 +11753,7 @@
           <w:delText xml:space="preserve">Do not keep the Support Request within the current scope as mentioned in the previous report, but the current thiết kế hệ thống/ERD/API lacks entity/endpoint backing. If the team wants to keep it, they need to update the Source-of-Truth first.</w:delText>
         </w:r>
       </w:del>
-      <w:ins w:id="9036" w:author="Claude" w:date="2026-10-24T22:45:00Z">
+      <w:ins w:id="9041" w:author="Claude" w:date="2026-10-24T22:45:00Z">
         <w:r>
           <w:rPr>
             <w:rFonts w:ascii="Times New Roman" w:cs="Times New Roman" w:eastAsia="Times New Roman" w:hAnsi="Times New Roman"/>
@@ -15481,7 +15556,7 @@
               </w:rPr>
               <w:t>Không mua PT cùng checkout tạo Membership mới. Attempt hết hạn có thể retry. Gateway đã nhận tiền nhưng fulfillment lỗi → ReconciliationRequired và backend retry; staff không tự đánh dấu Paid.</w:t>
             </w:r>
-            <w:ins w:id="9037" w:author="Claude" w:date="2026-10-24T22:45:00Z">
+            <w:ins w:id="9042" w:author="Claude" w:date="2026-10-24T22:45:00Z">
               <w:r>
                 <w:rPr>
                   <w:rFonts w:ascii="Times New Roman" w:hAnsi="Times New Roman"/>
@@ -16614,12 +16689,12 @@
             <w:r>
               <w:t xml:space="preserve">1. Member xem lớp PUBLISHED và chọn lớp. 2. Hệ thống kiểm tra còn chỗ sau khi tính cả SeatHold (BR-116) và Member không có ghi danh hoặc chỗ giữ khác giao lịch (BR-114). 3. Khi bắt đầu checkout, hệ thống tạo SeatHold tối đa 10–30 phút theo cấu hình Manager (mặc định 15; BR-115). 4. Thanh toán theo UC-15; khi thành công, SeatHold chuyển thành Enrollment CONFIRMED cho cả khóa. 5. </w:t>
             </w:r>
-            <w:del w:id="9088" w:author="Claude" w:date="2026-10-24T22:45:00Z">
+            <w:del w:id="9093" w:author="Claude" w:date="2026-10-24T22:45:00Z">
               <w:r>
                 <w:delText xml:space="preserve">Trước buổi đầu tiên, Member có thể hủy ghi danh và được hoàn 100% giá trị thực trả bằng điểm (BR-122).</w:delText>
               </w:r>
             </w:del>
-            <w:ins w:id="9089" w:author="Claude" w:date="2026-10-24T22:45:00Z">
+            <w:ins w:id="9094" w:author="Claude" w:date="2026-10-24T22:45:00Z">
               <w:r>
                 <w:t xml:space="preserve">Member có thể hủy ghi danh nhưng không được hoàn; khi bấm hủy, giao diện hiện pop-up thông báo Member hủy và không được hoàn tiền (BR-122).</w:t>
               </w:r>
@@ -16627,7 +16702,7 @@
             <w:r>
               <w:t xml:space="preserve"> 6. Thuê sân: Member chọn khối 60 phút còn trống (Room tương thích Sport, trong giờ hoạt động, không bị khóa, không giao buổi lớp/PT/lượt thuê khác, BR-126)</w:t>
             </w:r>
-            <w:ins w:id="9090" w:author="Claude" w:date="2026-10-24T22:45:00Z">
+            <w:ins w:id="9095" w:author="Claude" w:date="2026-10-24T22:45:00Z">
               <w:r>
                 <w:t xml:space="preserve"> và chỉ hiển thị trong 3 ngày lịch tính từ ngày hiện tại</w:t>
               </w:r>
@@ -16707,7 +16782,7 @@
               </w:rPr>
               <w:t xml:space="preserve">Lớp đầy, không PUBLISHED, đã qua buổi đầu tiên, trùng lịch ghi danh khác hoặc SeatHold hết hạn → từ chối hoặc phải checkout lại; không có Waitlist. Lớp chưa đạt ngưỡng: Member được email để chọn </w:t>
             </w:r>
-            <w:del w:id="9098" w:author="Claude" w:date="2026-10-24T22:45:00Z">
+            <w:del w:id="9105" w:author="Claude" w:date="2026-10-24T22:45:00Z">
               <w:r>
                 <w:rPr>
                   <w:rFonts w:ascii="Times New Roman" w:hAnsi="Times New Roman"/>
@@ -16716,7 +16791,7 @@
                 <w:delText xml:space="preserve">chuyển lớp hoặc hoàn điểm.</w:delText>
               </w:r>
             </w:del>
-            <w:ins w:id="9099" w:author="Claude" w:date="2026-10-24T22:45:00Z">
+            <w:ins w:id="9106" w:author="Claude" w:date="2026-10-24T22:45:00Z">
               <w:r>
                 <w:rPr>
                   <w:rFonts w:ascii="Times New Roman" w:hAnsi="Times New Roman"/>
@@ -21013,7 +21088,7 @@
               </w:rPr>
               <w:t xml:space="preserve">ReturnUrl không xác nhận tiền. Callback lặp phải idempotent. Attempt Expired được retry. SeatHold/điểm hết hạn được nhả đúng một lần. </w:t>
             </w:r>
-            <w:del w:id="9038" w:author="Claude" w:date="2026-10-24T22:45:00Z">
+            <w:del w:id="9043" w:author="Claude" w:date="2026-10-24T22:45:00Z">
               <w:r>
                 <w:rPr>
                   <w:rFonts w:ascii="Times New Roman" w:hAnsi="Times New Roman"/>
@@ -21022,7 +21097,7 @@
                 <w:delText xml:space="preserve">IPN muộn/QueryDR hợp lệ → PaidAfterReconciliation.</w:delText>
               </w:r>
             </w:del>
-            <w:ins w:id="9039" w:author="Claude" w:date="2026-10-24T22:45:00Z">
+            <w:ins w:id="9044" w:author="Claude" w:date="2026-10-24T22:45:00Z">
               <w:r>
                 <w:rPr>
                   <w:rFonts w:ascii="Times New Roman" w:hAnsi="Times New Roman"/>
@@ -21614,7 +21689,7 @@
             <w:pPr>
               <w:ind w:left="0" w:right="0" w:firstLine="0"/>
             </w:pPr>
-            <w:del w:id="9093" w:author="Claude" w:date="2026-10-24T22:45:00Z">
+            <w:del w:id="9098" w:author="Claude" w:date="2026-10-24T22:45:00Z">
               <w:r>
                 <w:rPr>
                   <w:rFonts w:ascii="Times New Roman" w:hAnsi="Times New Roman"/>
@@ -21623,7 +21698,7 @@
                 <w:delText xml:space="preserve">Membership còn &gt;= 2/3 thời hạn, kể cả chưa StartDate (gói gia hạn sớm), hoàn chuẩn tối đa 50% giá trị thực trả; dưới ngưỡng/Expired không hoàn.</w:delText>
               </w:r>
             </w:del>
-            <w:ins w:id="9094" w:author="Claude" w:date="2026-10-24T22:45:00Z">
+            <w:ins w:id="9099" w:author="Claude" w:date="2026-10-24T22:45:00Z">
               <w:r>
                 <w:rPr>
                   <w:rFonts w:ascii="Times New Roman" w:hAnsi="Times New Roman"/>
@@ -21637,9 +21712,34 @@
                 <w:rFonts w:ascii="Times New Roman" w:hAnsi="Times New Roman"/>
                 <w:sz w:val="20"/>
               </w:rPr>
-              <w:t xml:space="preserve"> Sự cố tạm thời của trung tâm không phải căn cứ hoàn: Gym được bù bằng gia hạn Membership, lớp được bù buổi (UC-07, BR-130); chỉ vấn đề khác khiến trung tâm không thể cung cấp dịch vụ mới xét ngoại lệ (Center Fault) do Manager phê duyệt: Membership hoàn theo ngày còn lại / tổng ngày, PT theo buổi chưa dùng / TotalQuota, không hoàn 100% (BR-91). </w:t>
-            </w:r>
-            <w:del w:id="9095" w:author="Claude" w:date="2026-10-24T22:45:00Z">
+              <w:t xml:space="preserve"> Sự cố tạm thời của trung tâm không phải căn cứ hoàn: </w:t>
+            </w:r>
+            <w:del w:id="9100" w:author="Claude" w:date="2026-10-24T22:45:00Z">
+              <w:r>
+                <w:rPr>
+                  <w:rFonts w:ascii="Times New Roman" w:hAnsi="Times New Roman"/>
+                  <w:sz w:val="20"/>
+                </w:rPr>
+                <w:delText xml:space="preserve">Gym được bù bằng gia hạn Membership,</w:delText>
+              </w:r>
+            </w:del>
+            <w:ins w:id="9101" w:author="Claude" w:date="2026-10-24T22:45:00Z">
+              <w:r>
+                <w:rPr>
+                  <w:rFonts w:ascii="Times New Roman" w:hAnsi="Times New Roman"/>
+                  <w:sz w:val="20"/>
+                </w:rPr>
+                <w:t xml:space="preserve">Gym được bù bằng điểm do Center Manager tặng (BR-130, BR-155),</w:t>
+              </w:r>
+            </w:ins>
+            <w:r>
+              <w:rPr>
+                <w:rFonts w:ascii="Times New Roman" w:hAnsi="Times New Roman"/>
+                <w:sz w:val="20"/>
+              </w:rPr>
+              <w:t xml:space="preserve"> lớp được bù buổi (UC-07, BR-130); chỉ vấn đề khác khiến trung tâm không thể cung cấp dịch vụ mới xét ngoại lệ (Center Fault) do Manager phê duyệt: Membership hoàn theo ngày còn lại / tổng ngày, PT theo buổi chưa dùng / TotalQuota, không hoàn 100% (BR-91). </w:t>
+            </w:r>
+            <w:del w:id="9102" w:author="Claude" w:date="2026-10-24T22:45:00Z">
               <w:r>
                 <w:rPr>
                   <w:rFonts w:ascii="Times New Roman" w:hAnsi="Times New Roman"/>
@@ -21648,7 +21748,7 @@
                 <w:delText xml:space="preserve">PT chưa consume session nào hoàn 50%; đã consume không hoàn chuẩn.</w:delText>
               </w:r>
             </w:del>
-            <w:ins w:id="9096" w:author="Claude" w:date="2026-10-24T22:45:00Z">
+            <w:ins w:id="9103" w:author="Claude" w:date="2026-10-24T22:45:00Z">
               <w:r>
                 <w:rPr>
                   <w:rFonts w:ascii="Times New Roman" w:hAnsi="Times New Roman"/>
@@ -21664,7 +21764,7 @@
               </w:rPr>
               <w:t xml:space="preserve"> </w:t>
             </w:r>
-            <w:del w:id="9091" w:author="Claude" w:date="2026-10-24T22:45:00Z">
+            <w:del w:id="9096" w:author="Claude" w:date="2026-10-24T22:45:00Z">
               <w:r>
                 <w:rPr>
                   <w:rFonts w:ascii="Times New Roman" w:hAnsi="Times New Roman"/>
@@ -21673,7 +21773,7 @@
                 <w:delText xml:space="preserve">Khóa lớp: trước buổi đầu tiên hoàn 100%; từ buổi đầu tiên không hoàn chuẩn.</w:delText>
               </w:r>
             </w:del>
-            <w:ins w:id="9092" w:author="Claude" w:date="2026-10-24T22:45:00Z">
+            <w:ins w:id="9097" w:author="Claude" w:date="2026-10-24T22:45:00Z">
               <w:r>
                 <w:rPr>
                   <w:rFonts w:ascii="Times New Roman" w:hAnsi="Times New Roman"/>
@@ -21689,7 +21789,7 @@
               </w:rPr>
               <w:t xml:space="preserve"> </w:t>
             </w:r>
-            <w:del w:id="9040" w:author="Claude" w:date="2026-10-24T22:45:00Z">
+            <w:del w:id="9045" w:author="Claude" w:date="2026-10-24T22:45:00Z">
               <w:r>
                 <w:rPr>
                   <w:rFonts w:ascii="Times New Roman" w:hAnsi="Times New Roman"/>
@@ -21698,7 +21798,7 @@
                 <w:delText xml:space="preserve">Hoàn luôn bằng điểm, không gọi VNPay Refund API nên không có trạng thái Processing/Failed do cổng thanh toán; Receptionist không tự cộng điểm.</w:delText>
               </w:r>
             </w:del>
-            <w:ins w:id="9041" w:author="Claude" w:date="2026-10-24T22:45:00Z">
+            <w:ins w:id="9046" w:author="Claude" w:date="2026-10-24T22:45:00Z">
               <w:r>
                 <w:rPr>
                   <w:rFonts w:ascii="Times New Roman" w:hAnsi="Times New Roman"/>
@@ -21714,13 +21814,13 @@
               </w:rPr>
               <w:t xml:space="preserve"> Retry không cộng điểm trùng (ReferenceId duy nhất).</w:t>
             </w:r>
-            <w:ins w:id="9097" w:author="Claude" w:date="2026-10-24T22:45:00Z">
+            <w:ins w:id="9104" w:author="Claude" w:date="2026-10-24T22:45:00Z">
               <w:r>
                 <w:rPr>
                   <w:rFonts w:ascii="Times New Roman" w:hAnsi="Times New Roman"/>
                   <w:sz w:val="20"/>
                 </w:rPr>
-                <w:t xml:space="preserve"> Sự cố hoặc quyết định phía trung tâm (lớp bị hủy, lớp dưới ngưỡng, hủy sân): Member chọn nhận điểm ngay hoặc hoàn tiền qua Support Request (UC-22, BR-154).</w:t>
+                <w:t xml:space="preserve"> Sự cố hoặc quyết định phía trung tâm (lớp bị hủy, lớp dưới ngưỡng, hủy sân): Member chọn nhận điểm ngay hoặc hoàn tiền qua Support Request (UC-22, BR-154). Đã thông báo qua email và trong ứng dụng mà Member không chọn thì sau 2 ngày hệ thống tự hoàn bằng điểm.</w:t>
               </w:r>
             </w:ins>
           </w:p>
@@ -22332,7 +22432,7 @@
               </w:rPr>
               <w:t xml:space="preserve">Không có dữ liệu → report rỗng hợp lệ. </w:t>
             </w:r>
-            <w:del w:id="9042" w:author="Claude" w:date="2026-10-24T22:45:00Z">
+            <w:del w:id="9047" w:author="Claude" w:date="2026-10-24T22:45:00Z">
               <w:r>
                 <w:rPr>
                   <w:rFonts w:ascii="Times New Roman" w:hAnsi="Times New Roman"/>
@@ -22341,7 +22441,7 @@
                 <w:delText xml:space="preserve">Hoàn trả bằng điểm nên không có khoản Refunded bằng tiền.</w:delText>
               </w:r>
             </w:del>
-            <w:ins w:id="9043" w:author="Claude" w:date="2026-10-24T22:45:00Z">
+            <w:ins w:id="9048" w:author="Claude" w:date="2026-10-24T22:45:00Z">
               <w:r>
                 <w:rPr>
                   <w:rFonts w:ascii="Times New Roman" w:hAnsi="Times New Roman"/>
@@ -22994,7 +23094,7 @@
               </w:rPr>
               <w:t>In-app notification được lưu trong hệ thống; OTP và Invoice/Paid/Refund email gửi qua outbox/background job. SMS ngoài scope.</w:t>
             </w:r>
-            <w:ins w:id="9044" w:author="Claude" w:date="2026-10-24T22:45:00Z">
+            <w:ins w:id="9049" w:author="Claude" w:date="2026-10-24T22:45:00Z">
               <w:r>
                 <w:rPr>
                   <w:rFonts w:ascii="Times New Roman" w:cs="Times New Roman" w:eastAsia="Times New Roman" w:hAnsi="Times New Roman"/>
@@ -24987,7 +25087,7 @@
         <w:spacing w:before="280" w:lineRule="auto"/>
         <w:ind w:left="0" w:firstLine="0"/>
         <w:rPr>
-          <w:ins w:id="9045" w:author="Claude" w:date="2026-10-24T22:45:00Z"/>
+          <w:ins w:id="9050" w:author="Claude" w:date="2026-10-24T22:45:00Z"/>
           <w:rFonts w:ascii="Times New Roman" w:cs="Times New Roman" w:eastAsia="Times New Roman" w:hAnsi="Times New Roman"/>
           <w:b w:val="1"/>
           <w:bCs w:val="1"/>
@@ -24996,7 +25096,7 @@
           <w:szCs w:val="26"/>
         </w:rPr>
       </w:pPr>
-      <w:ins w:id="9046" w:author="Claude" w:date="2026-10-24T22:45:00Z">
+      <w:ins w:id="9051" w:author="Claude" w:date="2026-10-24T22:45:00Z">
         <w:r>
           <w:rPr>
             <w:rFonts w:ascii="Times New Roman" w:cs="Times New Roman" w:eastAsia="Times New Roman" w:hAnsi="Times New Roman"/>
@@ -25041,7 +25141,7 @@
         <w:trPr>
           <w:cantSplit w:val="0"/>
           <w:tblHeader w:val="0"/>
-          <w:ins w:id="9047" w:author="Claude" w:date="2026-10-24T22:45:00Z"/>
+          <w:ins w:id="9052" w:author="Claude" w:date="2026-10-24T22:45:00Z"/>
         </w:trPr>
         <w:tc>
           <w:tcPr>
@@ -25065,7 +25165,7 @@
               <w:keepNext/>
               <w:ind w:left="0" w:right="0" w:firstLine="0"/>
               <w:rPr>
-                <w:ins w:id="9048" w:author="Claude" w:date="2026-10-24T22:45:00Z"/>
+                <w:ins w:id="9053" w:author="Claude" w:date="2026-10-24T22:45:00Z"/>
                 <w:rFonts w:ascii="Times New Roman" w:cs="Times New Roman" w:eastAsia="Times New Roman" w:hAnsi="Times New Roman"/>
                 <w:b w:val="1"/>
                 <w:bCs w:val="1"/>
@@ -25074,7 +25174,7 @@
                 <w:szCs w:val="17"/>
               </w:rPr>
             </w:pPr>
-            <w:ins w:id="9049" w:author="Claude" w:date="2026-10-24T22:45:00Z">
+            <w:ins w:id="9054" w:author="Claude" w:date="2026-10-24T22:45:00Z">
               <w:r>
                 <w:rPr>
                   <w:rFonts w:ascii="Times New Roman" w:cs="Times New Roman" w:eastAsia="Times New Roman" w:hAnsi="Times New Roman"/>
@@ -25112,7 +25212,7 @@
               <w:keepNext/>
               <w:ind w:left="0" w:right="0" w:firstLine="0"/>
               <w:rPr>
-                <w:ins w:id="9050" w:author="Claude" w:date="2026-10-24T22:45:00Z"/>
+                <w:ins w:id="9055" w:author="Claude" w:date="2026-10-24T22:45:00Z"/>
                 <w:rFonts w:ascii="Times New Roman" w:cs="Times New Roman" w:eastAsia="Times New Roman" w:hAnsi="Times New Roman"/>
                 <w:b w:val="1"/>
                 <w:bCs w:val="1"/>
@@ -25121,7 +25221,7 @@
                 <w:szCs w:val="17"/>
               </w:rPr>
             </w:pPr>
-            <w:ins w:id="9051" w:author="Claude" w:date="2026-10-24T22:45:00Z">
+            <w:ins w:id="9056" w:author="Claude" w:date="2026-10-24T22:45:00Z">
               <w:r>
                 <w:rPr>
                   <w:rFonts w:ascii="Times New Roman" w:cs="Times New Roman" w:eastAsia="Times New Roman" w:hAnsi="Times New Roman"/>
@@ -25142,7 +25242,7 @@
         <w:trPr>
           <w:cantSplit w:val="0"/>
           <w:tblHeader w:val="0"/>
-          <w:ins w:id="9052" w:author="Claude" w:date="2026-10-24T22:45:00Z"/>
+          <w:ins w:id="9057" w:author="Claude" w:date="2026-10-24T22:45:00Z"/>
         </w:trPr>
         <w:tc>
           <w:tcPr>
@@ -25165,13 +25265,13 @@
               <w:keepNext/>
               <w:ind w:left="0" w:right="0" w:firstLine="0"/>
               <w:rPr>
-                <w:ins w:id="9053" w:author="Claude" w:date="2026-10-24T22:45:00Z"/>
-                <w:rFonts w:ascii="Times New Roman" w:cs="Times New Roman" w:eastAsia="Times New Roman" w:hAnsi="Times New Roman"/>
-                <w:sz w:val="17"/>
-                <w:szCs w:val="17"/>
-              </w:rPr>
-            </w:pPr>
-            <w:ins w:id="9054" w:author="Claude" w:date="2026-10-24T22:45:00Z">
+                <w:ins w:id="9058" w:author="Claude" w:date="2026-10-24T22:45:00Z"/>
+                <w:rFonts w:ascii="Times New Roman" w:cs="Times New Roman" w:eastAsia="Times New Roman" w:hAnsi="Times New Roman"/>
+                <w:sz w:val="17"/>
+                <w:szCs w:val="17"/>
+              </w:rPr>
+            </w:pPr>
+            <w:ins w:id="9059" w:author="Claude" w:date="2026-10-24T22:45:00Z">
               <w:r>
                 <w:rPr>
                   <w:rFonts w:ascii="Times New Roman" w:cs="Times New Roman" w:eastAsia="Times New Roman" w:hAnsi="Times New Roman"/>
@@ -25204,10 +25304,10 @@
             <w:pPr>
               <w:ind w:left="0" w:right="0" w:firstLine="0"/>
               <w:rPr>
-                <w:ins w:id="9055" w:author="Claude" w:date="2026-10-24T22:45:00Z"/>
-              </w:rPr>
-            </w:pPr>
-            <w:ins w:id="9056" w:author="Claude" w:date="2026-10-24T22:45:00Z">
+                <w:ins w:id="9060" w:author="Claude" w:date="2026-10-24T22:45:00Z"/>
+              </w:rPr>
+            </w:pPr>
+            <w:ins w:id="9061" w:author="Claude" w:date="2026-10-24T22:45:00Z">
               <w:r>
                 <w:rPr>
                   <w:rFonts w:ascii="Times New Roman" w:hAnsi="Times New Roman"/>
@@ -25223,7 +25323,7 @@
         <w:trPr>
           <w:cantSplit w:val="0"/>
           <w:tblHeader w:val="0"/>
-          <w:ins w:id="9057" w:author="Claude" w:date="2026-10-24T22:45:00Z"/>
+          <w:ins w:id="9062" w:author="Claude" w:date="2026-10-24T22:45:00Z"/>
         </w:trPr>
         <w:tc>
           <w:tcPr>
@@ -25246,13 +25346,13 @@
               <w:keepNext/>
               <w:ind w:left="0" w:right="0" w:firstLine="0"/>
               <w:rPr>
-                <w:ins w:id="9058" w:author="Claude" w:date="2026-10-24T22:45:00Z"/>
-                <w:rFonts w:ascii="Times New Roman" w:cs="Times New Roman" w:eastAsia="Times New Roman" w:hAnsi="Times New Roman"/>
-                <w:sz w:val="17"/>
-                <w:szCs w:val="17"/>
-              </w:rPr>
-            </w:pPr>
-            <w:ins w:id="9059" w:author="Claude" w:date="2026-10-24T22:45:00Z">
+                <w:ins w:id="9063" w:author="Claude" w:date="2026-10-24T22:45:00Z"/>
+                <w:rFonts w:ascii="Times New Roman" w:cs="Times New Roman" w:eastAsia="Times New Roman" w:hAnsi="Times New Roman"/>
+                <w:sz w:val="17"/>
+                <w:szCs w:val="17"/>
+              </w:rPr>
+            </w:pPr>
+            <w:ins w:id="9064" w:author="Claude" w:date="2026-10-24T22:45:00Z">
               <w:r>
                 <w:rPr>
                   <w:rFonts w:ascii="Times New Roman" w:cs="Times New Roman" w:eastAsia="Times New Roman" w:hAnsi="Times New Roman"/>
@@ -25285,10 +25385,10 @@
             <w:pPr>
               <w:ind w:left="0" w:right="0" w:firstLine="0"/>
               <w:rPr>
-                <w:ins w:id="9060" w:author="Claude" w:date="2026-10-24T22:45:00Z"/>
-              </w:rPr>
-            </w:pPr>
-            <w:ins w:id="9061" w:author="Claude" w:date="2026-10-24T22:45:00Z">
+                <w:ins w:id="9065" w:author="Claude" w:date="2026-10-24T22:45:00Z"/>
+              </w:rPr>
+            </w:pPr>
+            <w:ins w:id="9066" w:author="Claude" w:date="2026-10-24T22:45:00Z">
               <w:r>
                 <w:rPr>
                   <w:rFonts w:ascii="Times New Roman" w:hAnsi="Times New Roman"/>
@@ -25304,7 +25404,7 @@
         <w:trPr>
           <w:cantSplit w:val="0"/>
           <w:tblHeader w:val="0"/>
-          <w:ins w:id="9062" w:author="Claude" w:date="2026-10-24T22:45:00Z"/>
+          <w:ins w:id="9067" w:author="Claude" w:date="2026-10-24T22:45:00Z"/>
         </w:trPr>
         <w:tc>
           <w:tcPr>
@@ -25327,13 +25427,13 @@
               <w:keepNext/>
               <w:ind w:left="0" w:right="0" w:firstLine="0"/>
               <w:rPr>
-                <w:ins w:id="9063" w:author="Claude" w:date="2026-10-24T22:45:00Z"/>
-                <w:rFonts w:ascii="Times New Roman" w:cs="Times New Roman" w:eastAsia="Times New Roman" w:hAnsi="Times New Roman"/>
-                <w:sz w:val="17"/>
-                <w:szCs w:val="17"/>
-              </w:rPr>
-            </w:pPr>
-            <w:ins w:id="9064" w:author="Claude" w:date="2026-10-24T22:45:00Z">
+                <w:ins w:id="9068" w:author="Claude" w:date="2026-10-24T22:45:00Z"/>
+                <w:rFonts w:ascii="Times New Roman" w:cs="Times New Roman" w:eastAsia="Times New Roman" w:hAnsi="Times New Roman"/>
+                <w:sz w:val="17"/>
+                <w:szCs w:val="17"/>
+              </w:rPr>
+            </w:pPr>
+            <w:ins w:id="9069" w:author="Claude" w:date="2026-10-24T22:45:00Z">
               <w:r>
                 <w:rPr>
                   <w:rFonts w:ascii="Times New Roman" w:cs="Times New Roman" w:eastAsia="Times New Roman" w:hAnsi="Times New Roman"/>
@@ -25366,10 +25466,10 @@
             <w:pPr>
               <w:ind w:left="0" w:right="0" w:firstLine="0"/>
               <w:rPr>
-                <w:ins w:id="9065" w:author="Claude" w:date="2026-10-24T22:45:00Z"/>
-              </w:rPr>
-            </w:pPr>
-            <w:ins w:id="9066" w:author="Claude" w:date="2026-10-24T22:45:00Z">
+                <w:ins w:id="9070" w:author="Claude" w:date="2026-10-24T22:45:00Z"/>
+              </w:rPr>
+            </w:pPr>
+            <w:ins w:id="9071" w:author="Claude" w:date="2026-10-24T22:45:00Z">
               <w:r>
                 <w:rPr>
                   <w:rFonts w:ascii="Times New Roman" w:hAnsi="Times New Roman"/>
@@ -25385,7 +25485,7 @@
         <w:trPr>
           <w:cantSplit w:val="0"/>
           <w:tblHeader w:val="0"/>
-          <w:ins w:id="9067" w:author="Claude" w:date="2026-10-24T22:45:00Z"/>
+          <w:ins w:id="9072" w:author="Claude" w:date="2026-10-24T22:45:00Z"/>
         </w:trPr>
         <w:tc>
           <w:tcPr>
@@ -25408,13 +25508,13 @@
               <w:keepNext/>
               <w:ind w:left="0" w:right="0" w:firstLine="0"/>
               <w:rPr>
-                <w:ins w:id="9068" w:author="Claude" w:date="2026-10-24T22:45:00Z"/>
-                <w:rFonts w:ascii="Times New Roman" w:cs="Times New Roman" w:eastAsia="Times New Roman" w:hAnsi="Times New Roman"/>
-                <w:sz w:val="17"/>
-                <w:szCs w:val="17"/>
-              </w:rPr>
-            </w:pPr>
-            <w:ins w:id="9069" w:author="Claude" w:date="2026-10-24T22:45:00Z">
+                <w:ins w:id="9073" w:author="Claude" w:date="2026-10-24T22:45:00Z"/>
+                <w:rFonts w:ascii="Times New Roman" w:cs="Times New Roman" w:eastAsia="Times New Roman" w:hAnsi="Times New Roman"/>
+                <w:sz w:val="17"/>
+                <w:szCs w:val="17"/>
+              </w:rPr>
+            </w:pPr>
+            <w:ins w:id="9074" w:author="Claude" w:date="2026-10-24T22:45:00Z">
               <w:r>
                 <w:rPr>
                   <w:rFonts w:ascii="Times New Roman" w:cs="Times New Roman" w:eastAsia="Times New Roman" w:hAnsi="Times New Roman"/>
@@ -25447,16 +25547,16 @@
             <w:pPr>
               <w:ind w:left="0" w:right="0" w:firstLine="0"/>
               <w:rPr>
-                <w:ins w:id="9070" w:author="Claude" w:date="2026-10-24T22:45:00Z"/>
-              </w:rPr>
-            </w:pPr>
-            <w:ins w:id="9071" w:author="Claude" w:date="2026-10-24T22:45:00Z">
+                <w:ins w:id="9075" w:author="Claude" w:date="2026-10-24T22:45:00Z"/>
+              </w:rPr>
+            </w:pPr>
+            <w:ins w:id="9076" w:author="Claude" w:date="2026-10-24T22:45:00Z">
               <w:r>
                 <w:rPr>
                   <w:rFonts w:ascii="Times New Roman" w:hAnsi="Times New Roman"/>
                   <w:sz w:val="20"/>
                 </w:rPr>
-                <w:t xml:space="preserve">1. Member gửi Support Request từ trang Trợ giúp; với danh mục PAYMENT chọn hóa đơn, nhập số tài khoản, tên ngân hàng, tên chủ tài khoản và đính kèm 1 đến 3 ảnh minh chứng; request vào hàng đợi OPEN với slaDueAtUtc = thời điểm tạo + 48 giờ (BR-147, BR-150). 2. Receptionist tiếp nhận, chuyển hoặc ghi chú; Center Manager xử lý. 3. Center Manager chuyển khoản ngoài hệ thống, chọn "Record payout", nhập số tiền và đính kèm 1 đến 3 ảnh chứng từ; hệ thống ghi một lần, đóng request (DONE), ghi Audit Log SUPPORT_PAYOUT_RECORDED, gửi thông báo và email cho Member và đưa số tiền vào báo cáo doanh thu, dashboard ở dòng "đã hoàn chuyển khoản" (BR-151). 4. Member xem ảnh chứng từ và bấm "I received it" hoặc "Not received"; không bấm gì sau 3 ngày thì hệ thống tự coi là đã nhận (BR-152).</w:t>
+                <w:t xml:space="preserve">1. Member gửi Support Request từ trang Trợ giúp; với danh mục PAYMENT chọn hóa đơn và đính kèm 1 đến 3 ảnh minh chứng (không nhập số tài khoản); request vào hàng đợi OPEN với slaDueAtUtc = thời điểm tạo + 48 giờ (BR-147, BR-150). 2. Request PAYMENT không do Receptionist giải quyết (Receptionist chỉ xem và hỗ trợ Member gửi lại); Center Manager xử lý, gọi điện trực tiếp cho Member khi cần thông tin nhận tiền và ghi chú lại nội dung trao đổi trong request (BR-150, BR-151). 3. Center Manager chuyển khoản ngoài hệ thống, chọn "Record payout", nhập số tiền và đính kèm 1 đến 3 ảnh chứng từ; hệ thống ghi một lần, đóng request (DONE), ghi Audit Log SUPPORT_PAYOUT_RECORDED, gửi thông báo và email cho Member và đưa số tiền vào báo cáo doanh thu, dashboard ở dòng "đã hoàn chuyển khoản" (BR-151). 4. Member xem ảnh chứng từ và bấm "I received it" hoặc "Not received"; không bấm gì sau 3 ngày thì hệ thống tự coi là đã nhận (BR-152).</w:t>
               </w:r>
             </w:ins>
           </w:p>
@@ -25466,7 +25566,7 @@
         <w:trPr>
           <w:cantSplit w:val="0"/>
           <w:tblHeader w:val="0"/>
-          <w:ins w:id="9072" w:author="Claude" w:date="2026-10-24T22:45:00Z"/>
+          <w:ins w:id="9077" w:author="Claude" w:date="2026-10-24T22:45:00Z"/>
         </w:trPr>
         <w:tc>
           <w:tcPr>
@@ -25489,13 +25589,13 @@
               <w:keepNext/>
               <w:ind w:left="0" w:right="0" w:firstLine="0"/>
               <w:rPr>
-                <w:ins w:id="9073" w:author="Claude" w:date="2026-10-24T22:45:00Z"/>
-                <w:rFonts w:ascii="Times New Roman" w:cs="Times New Roman" w:eastAsia="Times New Roman" w:hAnsi="Times New Roman"/>
-                <w:sz w:val="17"/>
-                <w:szCs w:val="17"/>
-              </w:rPr>
-            </w:pPr>
-            <w:ins w:id="9074" w:author="Claude" w:date="2026-10-24T22:45:00Z">
+                <w:ins w:id="9078" w:author="Claude" w:date="2026-10-24T22:45:00Z"/>
+                <w:rFonts w:ascii="Times New Roman" w:cs="Times New Roman" w:eastAsia="Times New Roman" w:hAnsi="Times New Roman"/>
+                <w:sz w:val="17"/>
+                <w:szCs w:val="17"/>
+              </w:rPr>
+            </w:pPr>
+            <w:ins w:id="9079" w:author="Claude" w:date="2026-10-24T22:45:00Z">
               <w:r>
                 <w:rPr>
                   <w:rFonts w:ascii="Times New Roman" w:cs="Times New Roman" w:eastAsia="Times New Roman" w:hAnsi="Times New Roman"/>
@@ -25528,16 +25628,16 @@
             <w:pPr>
               <w:ind w:left="0" w:right="0" w:firstLine="0"/>
               <w:rPr>
-                <w:ins w:id="9075" w:author="Claude" w:date="2026-10-24T22:45:00Z"/>
-              </w:rPr>
-            </w:pPr>
-            <w:ins w:id="9076" w:author="Claude" w:date="2026-10-24T22:45:00Z">
+                <w:ins w:id="9080" w:author="Claude" w:date="2026-10-24T22:45:00Z"/>
+              </w:rPr>
+            </w:pPr>
+            <w:ins w:id="9081" w:author="Claude" w:date="2026-10-24T22:45:00Z">
               <w:r>
                 <w:rPr>
                   <w:rFonts w:ascii="Times New Roman" w:hAnsi="Times New Roman"/>
                   <w:sz w:val="20"/>
                 </w:rPr>
-                <w:t xml:space="preserve">Chọn PAYMENT mà thiếu hóa đơn, thông tin tài khoản hoặc ảnh (không đủ 1 đến 3) bị từ chối 400 (payment_request_invoice_required, payment_request_bank_required, payment_request_proof_required); hóa đơn đã có request PAYMENT đang mở (409 payment_request_already_open). Receptionist ghi nhận chuyển khoản bị từ chối (403). Số tiền vượt phần đã thu (409 payout_amount_exceeds_paid), ghi lần hai (409 payout_already_recorded) hoặc thiếu ảnh chứng từ (400 payout_proof_required) bị từ chối. Center Manager có thể Reject kèm lý do. Member bấm "Not received" thì request về OPEN và thông báo Center Manager. Request quá 48 giờ chưa xử lý: Member được gửi lại ("Remind us", cách nhau tối thiểu 48 giờ) và hệ thống nhắc nhân viên (BR-148, BR-149). Số tài khoản được mã hóa, không ghi log và xóa sau 90 ngày kể từ khi đóng request, giữ toàn bộ ảnh (BR-153).</w:t>
+                <w:t xml:space="preserve">Chọn PAYMENT mà thiếu hóa đơn hoặc ảnh (không đủ 1 đến 3) bị từ chối 400 (payment_request_invoice_required, payment_request_proof_required); hóa đơn đã có request PAYMENT đang mở (409 payment_request_already_open). Receptionist xử lý hoặc ghi nhận chuyển khoản cho request PAYMENT bị từ chối (403). Số tiền vượt phần đã thu (409 payout_amount_exceeds_paid), ghi lần hai (409 payout_already_recorded) hoặc thiếu ảnh chứng từ (400 payout_proof_required) bị từ chối. Center Manager có thể Reject kèm lý do. Member bấm "Not received" thì request về OPEN và thông báo Center Manager. Request quá 48 giờ chưa xử lý: Member được gửi lại ("Remind us", cách nhau tối thiểu 48 giờ) và hệ thống nhắc nhân viên (BR-148, BR-149). Hệ thống không lưu số tài khoản; giữ toàn bộ ảnh (BR-153).</w:t>
               </w:r>
             </w:ins>
           </w:p>
@@ -25547,7 +25647,7 @@
         <w:trPr>
           <w:cantSplit w:val="0"/>
           <w:tblHeader w:val="0"/>
-          <w:ins w:id="9077" w:author="Claude" w:date="2026-10-24T22:45:00Z"/>
+          <w:ins w:id="9082" w:author="Claude" w:date="2026-10-24T22:45:00Z"/>
         </w:trPr>
         <w:tc>
           <w:tcPr>
@@ -25570,13 +25670,13 @@
               <w:keepNext w:val="0"/>
               <w:ind w:left="0" w:right="0" w:firstLine="0"/>
               <w:rPr>
-                <w:ins w:id="9078" w:author="Claude" w:date="2026-10-24T22:45:00Z"/>
-                <w:rFonts w:ascii="Times New Roman" w:cs="Times New Roman" w:eastAsia="Times New Roman" w:hAnsi="Times New Roman"/>
-                <w:sz w:val="17"/>
-                <w:szCs w:val="17"/>
-              </w:rPr>
-            </w:pPr>
-            <w:ins w:id="9079" w:author="Claude" w:date="2026-10-24T22:45:00Z">
+                <w:ins w:id="9083" w:author="Claude" w:date="2026-10-24T22:45:00Z"/>
+                <w:rFonts w:ascii="Times New Roman" w:cs="Times New Roman" w:eastAsia="Times New Roman" w:hAnsi="Times New Roman"/>
+                <w:sz w:val="17"/>
+                <w:szCs w:val="17"/>
+              </w:rPr>
+            </w:pPr>
+            <w:ins w:id="9084" w:author="Claude" w:date="2026-10-24T22:45:00Z">
               <w:r>
                 <w:rPr>
                   <w:rFonts w:ascii="Times New Roman" w:cs="Times New Roman" w:eastAsia="Times New Roman" w:hAnsi="Times New Roman"/>
@@ -25609,10 +25709,10 @@
             <w:pPr>
               <w:ind w:left="0" w:right="0" w:firstLine="0"/>
               <w:rPr>
-                <w:ins w:id="9080" w:author="Claude" w:date="2026-10-24T22:45:00Z"/>
-              </w:rPr>
-            </w:pPr>
-            <w:ins w:id="9081" w:author="Claude" w:date="2026-10-24T22:45:00Z">
+                <w:ins w:id="9085" w:author="Claude" w:date="2026-10-24T22:45:00Z"/>
+              </w:rPr>
+            </w:pPr>
+            <w:ins w:id="9086" w:author="Claude" w:date="2026-10-24T22:45:00Z">
               <w:r>
                 <w:rPr>
                   <w:rFonts w:ascii="Times New Roman" w:hAnsi="Times New Roman"/>
@@ -25781,9 +25881,9 @@
       <w:r>
         <w:t xml:space="preserve">Checkout tạo Invoice/InvoiceItem snapshot → chọn điểm (tùy chọn) → PaymentAttempt VNPay-QR cho phần tiền còn lại → IPN/QueryDR → transactional fulfillment → email receipt. Refund request theo InvoiceItem → Manager approve/reject → backend cộng điểm vào ví trong cùng transaction (không gọi VNPay Refund API). Doanh thu cash basis theo ngày thu tiền (vnp_PayDate).</w:t>
       </w:r>
-      <w:ins w:id="9082" w:author="Claude" w:date="2026-10-24T22:45:00Z">
+      <w:ins w:id="9087" w:author="Claude" w:date="2026-10-24T22:45:00Z">
         <w:r>
-          <w:t xml:space="preserve"> Vé Gym ngày bán 06:00–22:00 và hết hạn 22:00 cùng ngày. Thanh toán đến muộn: còn chỗ thì tự cấp quyền lợi, không thì Member nhận điểm ngay hoặc gửi Support Request. Support Request PAYMENT: Member gửi kèm thông tin nhận tiền và ảnh minh chứng → Center Manager chuyển khoản ngoài hệ thống và Record payout → thông báo, email Member → Member xác nhận (hoặc tự xác nhận sau 3 ngày).</w:t>
+          <w:t xml:space="preserve"> Vé Gym ngày bán 06:00–22:00 và hết hạn 22:00 cùng ngày. Thanh toán đến muộn: còn chỗ thì tự cấp quyền lợi, không thì Member nhận điểm ngay hoặc gửi Support Request. Support Request PAYMENT: Member gửi kèm hóa đơn và ảnh minh chứng (không nhập số tài khoản) → Center Manager gọi điện trao đổi và ghi chú → Center Manager chuyển khoản ngoài hệ thống và Record payout → thông báo, email Member → Member xác nhận (hoặc tự xác nhận sau 3 ngày).</w:t>
         </w:r>
       </w:ins>
     </w:p>
@@ -26045,7 +26145,7 @@
       <w:r>
         <w:t>Invoice: Issued, Paid, Void, PaidAfterReconciliation. Checkout/attempt quản lý expiry. Chỉ backend xác minh IPN/QueryDR hoặc hoàn tất bằng toàn điểm mới cấp quyền lợi; Return không xác nhận payment. Snapshot đã trả không sửa theo catalog.</w:t>
       </w:r>
-      <w:ins w:id="9083" w:author="Claude" w:date="2026-10-24T22:45:00Z">
+      <w:ins w:id="9088" w:author="Claude" w:date="2026-10-24T22:45:00Z">
         <w:r>
           <w:t xml:space="preserve"> Khi tiền về muộn, fulfillmentOutcome là FULFILLED (tự cấp quyền lợi) hoặc RECONCILIATION_REQUIRED; Invoice chuyển COMPENSATED khi Member chọn nhận điểm ngay (BR-88).</w:t>
         </w:r>
@@ -26080,12 +26180,12 @@
       <w:r>
         <w:t xml:space="preserve">Refund dùng PaymentAdjustment theo InvoiceItem: Requested → Rejected hoặc được duyệt/Completed cùng ledger credit và hủy quyền lợi trong transaction. </w:t>
       </w:r>
-      <w:del w:id="9084" w:author="Claude" w:date="2026-10-24T22:45:00Z">
+      <w:del w:id="9089" w:author="Claude" w:date="2026-10-24T22:45:00Z">
         <w:r>
           <w:delText xml:space="preserve">Chỉ hoàn bằng điểm, không dùng VNPay Refund API.</w:delText>
         </w:r>
       </w:del>
-      <w:ins w:id="9085" w:author="Claude" w:date="2026-10-24T22:45:00Z">
+      <w:ins w:id="9090" w:author="Claude" w:date="2026-10-24T22:45:00Z">
         <w:r>
           <w:t xml:space="preserve">Hoàn tự động chỉ bằng điểm, không dùng VNPay Refund API; hoàn chuyển khoản đi qua Support Request (OPEN → ASSIGNED → IN_PROGRESS → CLOSED, kết quả DONE hoặc REJECTED) và được ghi nhận một lần ở member_support_payouts; Member báo chưa nhận thì request về OPEN, không phản hồi sau 3 ngày thì tự xác nhận đã nhận.</w:t>
         </w:r>
@@ -26166,9 +26266,9 @@
       <w:r>
         <w:t>Mô hình dữ liệu và field xem docs/Center-Management-System-Design-v3.md. Lớp nhóm dùng Class/Enrollment/ClassSession/ClassTeachingRecord; điểm danh theo Enrollment và Session. Hoàn điểm dùng PaymentAdjustment và PointLedgerEntry. Không có gói PT 1:1 trong phạm vi hiện hành.</w:t>
       </w:r>
-      <w:ins w:id="9086" w:author="Claude" w:date="2026-10-24T22:45:00Z">
+      <w:ins w:id="9091" w:author="Claude" w:date="2026-10-24T22:45:00Z">
         <w:r>
-          <w:t xml:space="preserve"> Support Request hoàn chuyển khoản dùng member_support_requests (thêm sla_due_at_utc, invoice_id, remind_count), member_support_payout_details (số tài khoản mã hóa), member_support_payouts và member_support_attachments (Payment-Support-Workflow.md mục 7; đề xuất, chưa triển khai).</w:t>
+          <w:t xml:space="preserve"> Support Request hoàn chuyển khoản dùng member_support_requests (thêm sla_due_at_utc, invoice_id, remind_count), member_support_payouts và member_support_attachments (Payment-Support-Workflow.md mục 7; đề xuất, chưa triển khai).</w:t>
         </w:r>
       </w:ins>
     </w:p>
@@ -26182,9 +26282,9 @@
       <w:r>
         <w:t>Mô hình dữ liệu và field xem docs/Center-Management-System-Design-v3.md. Lớp nhóm dùng Class/Enrollment/ClassSession/ClassTeachingRecord; điểm danh theo Enrollment và Session. Hoàn điểm dùng PaymentAdjustment và PointLedgerEntry. Không có gói PT 1:1 trong phạm vi hiện hành.</w:t>
       </w:r>
-      <w:ins w:id="9087" w:author="Claude" w:date="2026-10-24T22:45:00Z">
+      <w:ins w:id="9092" w:author="Claude" w:date="2026-10-24T22:45:00Z">
         <w:r>
-          <w:t xml:space="preserve"> Support Request hoàn chuyển khoản dùng member_support_requests (thêm sla_due_at_utc, invoice_id, remind_count), member_support_payout_details (số tài khoản mã hóa), member_support_payouts và member_support_attachments (Payment-Support-Workflow.md mục 7; đề xuất, chưa triển khai).</w:t>
+          <w:t xml:space="preserve"> Support Request hoàn chuyển khoản dùng member_support_requests (thêm sla_due_at_utc, invoice_id, remind_count), member_support_payouts và member_support_attachments (Payment-Support-Workflow.md mục 7; đề xuất, chưa triển khai).</w:t>
         </w:r>
       </w:ins>
     </w:p>

</xml_diff>